<commit_message>
Improve image selection and Excel metadata
Add support for Excel `stt` column and NFC normalization, require an overview a.png, and enhance BMP handling/sorting. Refactor image helpers (find_overview_png, list_bmp_in_folder, _require_overview_png_and_bmps), tighten BMP regex, and make auto-pick routines use a.png as imga and numeric ordering for PS-SD*.BMP. Update mba/device rendering to use a shared _inline helper and add page breaks between merged docs. Make INPS optional (use placeholders when missing) and simplify numeric formatting with _tri. Improve metadata lookup (NFC/NFD and suffix/_n variants), implement stt-aware sorting when building reports, and expose new helper functions for mapping Excel rows to device folders. Update templates and UI text to document the new stt column and remove client-side warning header handling. Add a second MBA template file (mba2.docx) and modify merge flow to validate section kinds.
</commit_message>
<xml_diff>
--- a/static/word-template/mba.docx
+++ b/static/word-template/mba.docx
@@ -292,2964 +292,6 @@
       <w:r>
         <w:t xml:space="preserve"> }}</w:t>
       </w:r>
-    </w:p>
-    <w:p>
-      <w:pPr>
-        <w:pStyle w:val="onvnnhnxt"/>
-      </w:pPr>
-      <w:r>
-        <w:br w:type="page"/>
-      </w:r>
-    </w:p>
-    <w:p>
-      <w:pPr>
-        <w:pStyle w:val="KDmBang"/>
-        <w:rPr>
-          <w:szCs w:val="24"/>
-          <w:lang w:val="en-US"/>
-        </w:rPr>
-      </w:pPr>
-      <w:r>
-        <w:rPr>
-          <w:szCs w:val="24"/>
-        </w:rPr>
-        <w:lastRenderedPageBreak/>
-        <w:t>Bảng 5.</w:t>
-      </w:r>
-      <w:r>
-        <w:rPr>
-          <w:szCs w:val="24"/>
-        </w:rPr>
-        <w:fldChar w:fldCharType="begin"/>
-      </w:r>
-      <w:r>
-        <w:rPr>
-          <w:szCs w:val="24"/>
-        </w:rPr>
-        <w:instrText xml:space="preserve"> SEQ Bảng_5. \* ARABIC </w:instrText>
-      </w:r>
-      <w:r>
-        <w:rPr>
-          <w:szCs w:val="24"/>
-        </w:rPr>
-        <w:fldChar w:fldCharType="separate"/>
-      </w:r>
-      <w:r>
-        <w:rPr>
-          <w:noProof/>
-          <w:szCs w:val="24"/>
-        </w:rPr>
-        <w:t>1</w:t>
-      </w:r>
-      <w:r>
-        <w:rPr>
-          <w:noProof/>
-          <w:szCs w:val="24"/>
-        </w:rPr>
-        <w:fldChar w:fldCharType="end"/>
-      </w:r>
-      <w:r>
-        <w:rPr>
-          <w:szCs w:val="24"/>
-        </w:rPr>
-        <w:t xml:space="preserve"> - </w:t>
-      </w:r>
-      <w:r>
-        <w:rPr>
-          <w:szCs w:val="24"/>
-        </w:rPr>
-        <w:t xml:space="preserve">{{ </w:t>
-      </w:r>
-      <w:r>
-        <w:rPr>
-          <w:szCs w:val="24"/>
-          <w:lang w:val="en-US"/>
-        </w:rPr>
-        <w:t>cap_tab</w:t>
-      </w:r>
-      <w:r>
-        <w:rPr>
-          <w:szCs w:val="24"/>
-          <w:lang w:val="en-US"/>
-        </w:rPr>
-        <w:t>_mba</w:t>
-      </w:r>
-      <w:r>
-        <w:rPr>
-          <w:szCs w:val="24"/>
-          <w:lang w:val="en-US"/>
-        </w:rPr>
-        <w:t xml:space="preserve"> </w:t>
-      </w:r>
-      <w:r>
-        <w:rPr>
-          <w:szCs w:val="24"/>
-        </w:rPr>
-        <w:t>}}</w:t>
-      </w:r>
-    </w:p>
-    <w:tbl>
-      <w:tblPr>
-        <w:tblW w:w="9645" w:type="dxa"/>
-        <w:jc w:val="center"/>
-        <w:tblBorders>
-          <w:top w:val="single" w:sz="4" w:space="0" w:color="auto"/>
-          <w:left w:val="single" w:sz="4" w:space="0" w:color="auto"/>
-          <w:bottom w:val="single" w:sz="4" w:space="0" w:color="auto"/>
-          <w:right w:val="single" w:sz="4" w:space="0" w:color="auto"/>
-          <w:insideH w:val="single" w:sz="4" w:space="0" w:color="auto"/>
-          <w:insideV w:val="single" w:sz="4" w:space="0" w:color="auto"/>
-        </w:tblBorders>
-        <w:tblLayout w:type="fixed"/>
-        <w:tblLook w:val="04A0" w:firstRow="1" w:lastRow="0" w:firstColumn="1" w:lastColumn="0" w:noHBand="0" w:noVBand="1"/>
-      </w:tblPr>
-      <w:tblGrid>
-        <w:gridCol w:w="538"/>
-        <w:gridCol w:w="1574"/>
-        <w:gridCol w:w="1279"/>
-        <w:gridCol w:w="941"/>
-        <w:gridCol w:w="988"/>
-        <w:gridCol w:w="1057"/>
-        <w:gridCol w:w="2145"/>
-        <w:gridCol w:w="1123"/>
-      </w:tblGrid>
-      <w:tr>
-        <w:trPr>
-          <w:trHeight w:val="340"/>
-          <w:tblHeader/>
-          <w:jc w:val="center"/>
-        </w:trPr>
-        <w:tc>
-          <w:tcPr>
-            <w:tcW w:w="538" w:type="dxa"/>
-            <w:tcBorders>
-              <w:top w:val="double" w:sz="4" w:space="0" w:color="auto"/>
-              <w:left w:val="double" w:sz="4" w:space="0" w:color="auto"/>
-            </w:tcBorders>
-            <w:shd w:val="clear" w:color="auto" w:fill="D9D9D9"/>
-            <w:vAlign w:val="center"/>
-          </w:tcPr>
-          <w:p>
-            <w:pPr>
-              <w:pStyle w:val="Chutrongbang"/>
-              <w:rPr>
-                <w:b/>
-              </w:rPr>
-            </w:pPr>
-            <w:r>
-              <w:rPr>
-                <w:b/>
-              </w:rPr>
-              <w:t>TT</w:t>
-            </w:r>
-          </w:p>
-        </w:tc>
-        <w:tc>
-          <w:tcPr>
-            <w:tcW w:w="2853" w:type="dxa"/>
-            <w:gridSpan w:val="2"/>
-            <w:tcBorders>
-              <w:top w:val="double" w:sz="4" w:space="0" w:color="auto"/>
-            </w:tcBorders>
-            <w:shd w:val="clear" w:color="auto" w:fill="D9D9D9"/>
-            <w:vAlign w:val="center"/>
-          </w:tcPr>
-          <w:p>
-            <w:pPr>
-              <w:pStyle w:val="Chutrongbang"/>
-              <w:rPr>
-                <w:b/>
-              </w:rPr>
-            </w:pPr>
-            <w:r>
-              <w:rPr>
-                <w:b/>
-              </w:rPr>
-              <w:t>Thông số</w:t>
-            </w:r>
-          </w:p>
-        </w:tc>
-        <w:tc>
-          <w:tcPr>
-            <w:tcW w:w="941" w:type="dxa"/>
-            <w:tcBorders>
-              <w:top w:val="double" w:sz="4" w:space="0" w:color="auto"/>
-              <w:bottom w:val="single" w:sz="4" w:space="0" w:color="auto"/>
-            </w:tcBorders>
-            <w:shd w:val="clear" w:color="auto" w:fill="D9D9D9"/>
-            <w:vAlign w:val="center"/>
-          </w:tcPr>
-          <w:p>
-            <w:pPr>
-              <w:pStyle w:val="Chutrongbang"/>
-              <w:rPr>
-                <w:b/>
-              </w:rPr>
-            </w:pPr>
-            <w:r>
-              <w:rPr>
-                <w:b/>
-              </w:rPr>
-              <w:t>Cao nhất</w:t>
-            </w:r>
-          </w:p>
-        </w:tc>
-        <w:tc>
-          <w:tcPr>
-            <w:tcW w:w="988" w:type="dxa"/>
-            <w:tcBorders>
-              <w:top w:val="double" w:sz="4" w:space="0" w:color="auto"/>
-              <w:bottom w:val="single" w:sz="4" w:space="0" w:color="auto"/>
-            </w:tcBorders>
-            <w:shd w:val="clear" w:color="auto" w:fill="D9D9D9"/>
-            <w:vAlign w:val="center"/>
-          </w:tcPr>
-          <w:p>
-            <w:pPr>
-              <w:pStyle w:val="Chutrongbang"/>
-              <w:rPr>
-                <w:b/>
-              </w:rPr>
-            </w:pPr>
-            <w:r>
-              <w:rPr>
-                <w:b/>
-              </w:rPr>
-              <w:t>Thấp nhất</w:t>
-            </w:r>
-          </w:p>
-        </w:tc>
-        <w:tc>
-          <w:tcPr>
-            <w:tcW w:w="1057" w:type="dxa"/>
-            <w:tcBorders>
-              <w:top w:val="double" w:sz="4" w:space="0" w:color="auto"/>
-              <w:bottom w:val="single" w:sz="4" w:space="0" w:color="auto"/>
-            </w:tcBorders>
-            <w:shd w:val="clear" w:color="auto" w:fill="D9D9D9"/>
-            <w:vAlign w:val="center"/>
-          </w:tcPr>
-          <w:p>
-            <w:pPr>
-              <w:pStyle w:val="Chutrongbang"/>
-              <w:rPr>
-                <w:b/>
-              </w:rPr>
-            </w:pPr>
-            <w:r>
-              <w:rPr>
-                <w:b/>
-              </w:rPr>
-              <w:t>Trung bình</w:t>
-            </w:r>
-          </w:p>
-        </w:tc>
-        <w:tc>
-          <w:tcPr>
-            <w:tcW w:w="2145" w:type="dxa"/>
-            <w:tcBorders>
-              <w:top w:val="double" w:sz="4" w:space="0" w:color="auto"/>
-            </w:tcBorders>
-            <w:shd w:val="clear" w:color="auto" w:fill="D9D9D9"/>
-            <w:vAlign w:val="center"/>
-          </w:tcPr>
-          <w:p>
-            <w:pPr>
-              <w:pStyle w:val="Chutrongbang"/>
-              <w:rPr>
-                <w:b/>
-              </w:rPr>
-            </w:pPr>
-            <w:r>
-              <w:rPr>
-                <w:b/>
-              </w:rPr>
-              <w:t>Giới hạn</w:t>
-            </w:r>
-          </w:p>
-        </w:tc>
-        <w:tc>
-          <w:tcPr>
-            <w:tcW w:w="1123" w:type="dxa"/>
-            <w:tcBorders>
-              <w:top w:val="double" w:sz="4" w:space="0" w:color="auto"/>
-              <w:right w:val="double" w:sz="4" w:space="0" w:color="auto"/>
-            </w:tcBorders>
-            <w:shd w:val="clear" w:color="auto" w:fill="D9D9D9"/>
-            <w:vAlign w:val="center"/>
-          </w:tcPr>
-          <w:p>
-            <w:pPr>
-              <w:pStyle w:val="Chutrongbang"/>
-              <w:rPr>
-                <w:b/>
-              </w:rPr>
-            </w:pPr>
-            <w:r>
-              <w:rPr>
-                <w:b/>
-              </w:rPr>
-              <w:t>Đánh giá</w:t>
-            </w:r>
-          </w:p>
-        </w:tc>
-      </w:tr>
-      <w:tr>
-        <w:trPr>
-          <w:trHeight w:val="340"/>
-          <w:jc w:val="center"/>
-        </w:trPr>
-        <w:tc>
-          <w:tcPr>
-            <w:tcW w:w="538" w:type="dxa"/>
-            <w:vMerge w:val="restart"/>
-            <w:tcBorders>
-              <w:left w:val="double" w:sz="4" w:space="0" w:color="auto"/>
-            </w:tcBorders>
-            <w:vAlign w:val="center"/>
-          </w:tcPr>
-          <w:p>
-            <w:pPr>
-              <w:pStyle w:val="Chutrongbang"/>
-            </w:pPr>
-            <w:r>
-              <w:t>1</w:t>
-            </w:r>
-          </w:p>
-        </w:tc>
-        <w:tc>
-          <w:tcPr>
-            <w:tcW w:w="1574" w:type="dxa"/>
-            <w:vMerge w:val="restart"/>
-            <w:vAlign w:val="center"/>
-          </w:tcPr>
-          <w:p>
-            <w:pPr>
-              <w:pStyle w:val="Chutrongbang"/>
-            </w:pPr>
-            <w:r>
-              <w:t>Điện áp</w:t>
-            </w:r>
-          </w:p>
-        </w:tc>
-        <w:tc>
-          <w:tcPr>
-            <w:tcW w:w="1279" w:type="dxa"/>
-            <w:tcBorders>
-              <w:bottom w:val="dotted" w:sz="4" w:space="0" w:color="auto"/>
-            </w:tcBorders>
-            <w:vAlign w:val="center"/>
-          </w:tcPr>
-          <w:p>
-            <w:pPr>
-              <w:pStyle w:val="Chutrongbang"/>
-            </w:pPr>
-            <w:r>
-              <w:t>U</w:t>
-            </w:r>
-            <w:r>
-              <w:rPr>
-                <w:vertAlign w:val="subscript"/>
-              </w:rPr>
-              <w:t xml:space="preserve">12 </w:t>
-            </w:r>
-            <w:r>
-              <w:t>(V)</w:t>
-            </w:r>
-          </w:p>
-        </w:tc>
-        <w:tc>
-          <w:tcPr>
-            <w:tcW w:w="941" w:type="dxa"/>
-            <w:tcBorders>
-              <w:top w:val="single" w:sz="4" w:space="0" w:color="auto"/>
-              <w:left w:val="single" w:sz="4" w:space="0" w:color="auto"/>
-              <w:bottom w:val="dotted" w:sz="4" w:space="0" w:color="auto"/>
-              <w:right w:val="single" w:sz="4" w:space="0" w:color="auto"/>
-            </w:tcBorders>
-          </w:tcPr>
-          <w:p>
-            <w:pPr>
-              <w:pStyle w:val="Chutrongbang"/>
-            </w:pPr>
-            <w:r>
-              <w:t>{{ u12max }}</w:t>
-            </w:r>
-          </w:p>
-        </w:tc>
-        <w:tc>
-          <w:tcPr>
-            <w:tcW w:w="988" w:type="dxa"/>
-            <w:tcBorders>
-              <w:top w:val="single" w:sz="4" w:space="0" w:color="auto"/>
-              <w:left w:val="nil"/>
-              <w:bottom w:val="dotted" w:sz="4" w:space="0" w:color="auto"/>
-              <w:right w:val="single" w:sz="4" w:space="0" w:color="auto"/>
-            </w:tcBorders>
-          </w:tcPr>
-          <w:p>
-            <w:pPr>
-              <w:pStyle w:val="Chutrongbang"/>
-            </w:pPr>
-            <w:r>
-              <w:t>{{ u12min }}</w:t>
-            </w:r>
-          </w:p>
-        </w:tc>
-        <w:tc>
-          <w:tcPr>
-            <w:tcW w:w="1057" w:type="dxa"/>
-            <w:tcBorders>
-              <w:top w:val="single" w:sz="4" w:space="0" w:color="auto"/>
-              <w:left w:val="nil"/>
-              <w:bottom w:val="dotted" w:sz="4" w:space="0" w:color="auto"/>
-              <w:right w:val="single" w:sz="4" w:space="0" w:color="auto"/>
-            </w:tcBorders>
-          </w:tcPr>
-          <w:p>
-            <w:pPr>
-              <w:pStyle w:val="Chutrongbang"/>
-            </w:pPr>
-            <w:r>
-              <w:t>{{ u12avg }}</w:t>
-            </w:r>
-          </w:p>
-        </w:tc>
-        <w:tc>
-          <w:tcPr>
-            <w:tcW w:w="2145" w:type="dxa"/>
-            <w:vMerge w:val="restart"/>
-            <w:vAlign w:val="center"/>
-          </w:tcPr>
-          <w:p>
-            <w:pPr>
-              <w:pStyle w:val="Chutrongbang"/>
-            </w:pPr>
-            <w:r>
-              <w:t>-5% ≤ δ ≤ 5% tại điện áp danh định 400V</w:t>
-            </w:r>
-          </w:p>
-        </w:tc>
-        <w:tc>
-          <w:tcPr>
-            <w:tcW w:w="1123" w:type="dxa"/>
-            <w:vMerge w:val="restart"/>
-            <w:tcBorders>
-              <w:right w:val="double" w:sz="4" w:space="0" w:color="auto"/>
-            </w:tcBorders>
-            <w:vAlign w:val="center"/>
-          </w:tcPr>
-          <w:p>
-            <w:pPr>
-              <w:pStyle w:val="Chutrongbang"/>
-            </w:pPr>
-            <w:r>
-              <w:t>{{ u12eval }}</w:t>
-            </w:r>
-          </w:p>
-        </w:tc>
-      </w:tr>
-      <w:tr>
-        <w:trPr>
-          <w:trHeight w:val="340"/>
-          <w:jc w:val="center"/>
-        </w:trPr>
-        <w:tc>
-          <w:tcPr>
-            <w:tcW w:w="538" w:type="dxa"/>
-            <w:vMerge/>
-            <w:tcBorders>
-              <w:left w:val="double" w:sz="4" w:space="0" w:color="auto"/>
-            </w:tcBorders>
-            <w:vAlign w:val="center"/>
-          </w:tcPr>
-          <w:p>
-            <w:pPr>
-              <w:pStyle w:val="Chutrongbang"/>
-            </w:pPr>
-          </w:p>
-        </w:tc>
-        <w:tc>
-          <w:tcPr>
-            <w:tcW w:w="1574" w:type="dxa"/>
-            <w:vMerge/>
-            <w:vAlign w:val="center"/>
-          </w:tcPr>
-          <w:p>
-            <w:pPr>
-              <w:pStyle w:val="Chutrongbang"/>
-            </w:pPr>
-          </w:p>
-        </w:tc>
-        <w:tc>
-          <w:tcPr>
-            <w:tcW w:w="1279" w:type="dxa"/>
-            <w:tcBorders>
-              <w:top w:val="dotted" w:sz="4" w:space="0" w:color="auto"/>
-              <w:bottom w:val="dotted" w:sz="4" w:space="0" w:color="auto"/>
-            </w:tcBorders>
-            <w:vAlign w:val="center"/>
-          </w:tcPr>
-          <w:p>
-            <w:pPr>
-              <w:pStyle w:val="Chutrongbang"/>
-            </w:pPr>
-            <w:r>
-              <w:t>U</w:t>
-            </w:r>
-            <w:r>
-              <w:rPr>
-                <w:vertAlign w:val="subscript"/>
-              </w:rPr>
-              <w:t>23</w:t>
-            </w:r>
-            <w:r>
-              <w:t xml:space="preserve"> (V)</w:t>
-            </w:r>
-          </w:p>
-        </w:tc>
-        <w:tc>
-          <w:tcPr>
-            <w:tcW w:w="941" w:type="dxa"/>
-            <w:tcBorders>
-              <w:top w:val="dotted" w:sz="4" w:space="0" w:color="auto"/>
-              <w:left w:val="single" w:sz="4" w:space="0" w:color="auto"/>
-              <w:bottom w:val="dotted" w:sz="4" w:space="0" w:color="auto"/>
-              <w:right w:val="single" w:sz="4" w:space="0" w:color="auto"/>
-            </w:tcBorders>
-          </w:tcPr>
-          <w:p>
-            <w:pPr>
-              <w:pStyle w:val="Chutrongbang"/>
-            </w:pPr>
-            <w:r>
-              <w:t>{{ u23max }}</w:t>
-            </w:r>
-          </w:p>
-        </w:tc>
-        <w:tc>
-          <w:tcPr>
-            <w:tcW w:w="988" w:type="dxa"/>
-            <w:tcBorders>
-              <w:top w:val="dotted" w:sz="4" w:space="0" w:color="auto"/>
-              <w:left w:val="nil"/>
-              <w:bottom w:val="dotted" w:sz="4" w:space="0" w:color="auto"/>
-              <w:right w:val="single" w:sz="4" w:space="0" w:color="auto"/>
-            </w:tcBorders>
-          </w:tcPr>
-          <w:p>
-            <w:pPr>
-              <w:pStyle w:val="Chutrongbang"/>
-            </w:pPr>
-            <w:r>
-              <w:t>{{ u23min }}</w:t>
-            </w:r>
-          </w:p>
-        </w:tc>
-        <w:tc>
-          <w:tcPr>
-            <w:tcW w:w="1057" w:type="dxa"/>
-            <w:tcBorders>
-              <w:top w:val="dotted" w:sz="4" w:space="0" w:color="auto"/>
-              <w:left w:val="nil"/>
-              <w:bottom w:val="dotted" w:sz="4" w:space="0" w:color="auto"/>
-              <w:right w:val="single" w:sz="4" w:space="0" w:color="auto"/>
-            </w:tcBorders>
-          </w:tcPr>
-          <w:p>
-            <w:pPr>
-              <w:pStyle w:val="Chutrongbang"/>
-            </w:pPr>
-            <w:r>
-              <w:t>{{ u23avg }}</w:t>
-            </w:r>
-          </w:p>
-        </w:tc>
-        <w:tc>
-          <w:tcPr>
-            <w:tcW w:w="2145" w:type="dxa"/>
-            <w:vMerge/>
-            <w:vAlign w:val="center"/>
-          </w:tcPr>
-          <w:p>
-            <w:pPr>
-              <w:pStyle w:val="Chutrongbang"/>
-            </w:pPr>
-          </w:p>
-        </w:tc>
-        <w:tc>
-          <w:tcPr>
-            <w:tcW w:w="1123" w:type="dxa"/>
-            <w:vMerge/>
-            <w:tcBorders>
-              <w:right w:val="double" w:sz="4" w:space="0" w:color="auto"/>
-            </w:tcBorders>
-            <w:vAlign w:val="center"/>
-          </w:tcPr>
-          <w:p>
-            <w:pPr>
-              <w:pStyle w:val="Chutrongbang"/>
-            </w:pPr>
-          </w:p>
-        </w:tc>
-      </w:tr>
-      <w:tr>
-        <w:trPr>
-          <w:trHeight w:val="340"/>
-          <w:jc w:val="center"/>
-        </w:trPr>
-        <w:tc>
-          <w:tcPr>
-            <w:tcW w:w="538" w:type="dxa"/>
-            <w:vMerge/>
-            <w:tcBorders>
-              <w:left w:val="double" w:sz="4" w:space="0" w:color="auto"/>
-            </w:tcBorders>
-            <w:vAlign w:val="center"/>
-          </w:tcPr>
-          <w:p>
-            <w:pPr>
-              <w:pStyle w:val="Chutrongbang"/>
-            </w:pPr>
-          </w:p>
-        </w:tc>
-        <w:tc>
-          <w:tcPr>
-            <w:tcW w:w="1574" w:type="dxa"/>
-            <w:vMerge/>
-            <w:vAlign w:val="center"/>
-          </w:tcPr>
-          <w:p>
-            <w:pPr>
-              <w:pStyle w:val="Chutrongbang"/>
-            </w:pPr>
-          </w:p>
-        </w:tc>
-        <w:tc>
-          <w:tcPr>
-            <w:tcW w:w="1279" w:type="dxa"/>
-            <w:tcBorders>
-              <w:top w:val="dotted" w:sz="4" w:space="0" w:color="auto"/>
-              <w:bottom w:val="single" w:sz="4" w:space="0" w:color="auto"/>
-            </w:tcBorders>
-            <w:vAlign w:val="center"/>
-          </w:tcPr>
-          <w:p>
-            <w:pPr>
-              <w:pStyle w:val="Chutrongbang"/>
-            </w:pPr>
-            <w:r>
-              <w:t>U</w:t>
-            </w:r>
-            <w:r>
-              <w:rPr>
-                <w:vertAlign w:val="subscript"/>
-              </w:rPr>
-              <w:t>31</w:t>
-            </w:r>
-            <w:r>
-              <w:t xml:space="preserve"> (V)</w:t>
-            </w:r>
-          </w:p>
-        </w:tc>
-        <w:tc>
-          <w:tcPr>
-            <w:tcW w:w="941" w:type="dxa"/>
-            <w:tcBorders>
-              <w:top w:val="dotted" w:sz="4" w:space="0" w:color="auto"/>
-              <w:left w:val="single" w:sz="4" w:space="0" w:color="auto"/>
-              <w:bottom w:val="single" w:sz="4" w:space="0" w:color="auto"/>
-              <w:right w:val="single" w:sz="4" w:space="0" w:color="auto"/>
-            </w:tcBorders>
-          </w:tcPr>
-          <w:p>
-            <w:pPr>
-              <w:pStyle w:val="Chutrongbang"/>
-            </w:pPr>
-            <w:r>
-              <w:t>{{ u31max }}</w:t>
-            </w:r>
-          </w:p>
-        </w:tc>
-        <w:tc>
-          <w:tcPr>
-            <w:tcW w:w="988" w:type="dxa"/>
-            <w:tcBorders>
-              <w:top w:val="dotted" w:sz="4" w:space="0" w:color="auto"/>
-              <w:left w:val="nil"/>
-              <w:bottom w:val="single" w:sz="4" w:space="0" w:color="auto"/>
-              <w:right w:val="single" w:sz="4" w:space="0" w:color="auto"/>
-            </w:tcBorders>
-          </w:tcPr>
-          <w:p>
-            <w:pPr>
-              <w:pStyle w:val="Chutrongbang"/>
-            </w:pPr>
-            <w:r>
-              <w:t>{{ u31min }}</w:t>
-            </w:r>
-          </w:p>
-        </w:tc>
-        <w:tc>
-          <w:tcPr>
-            <w:tcW w:w="1057" w:type="dxa"/>
-            <w:tcBorders>
-              <w:top w:val="dotted" w:sz="4" w:space="0" w:color="auto"/>
-              <w:left w:val="nil"/>
-              <w:bottom w:val="single" w:sz="4" w:space="0" w:color="auto"/>
-              <w:right w:val="single" w:sz="4" w:space="0" w:color="auto"/>
-            </w:tcBorders>
-          </w:tcPr>
-          <w:p>
-            <w:pPr>
-              <w:pStyle w:val="Chutrongbang"/>
-            </w:pPr>
-            <w:r>
-              <w:t>{{ u31avg }}</w:t>
-            </w:r>
-          </w:p>
-        </w:tc>
-        <w:tc>
-          <w:tcPr>
-            <w:tcW w:w="2145" w:type="dxa"/>
-            <w:vMerge/>
-            <w:vAlign w:val="center"/>
-          </w:tcPr>
-          <w:p>
-            <w:pPr>
-              <w:pStyle w:val="Chutrongbang"/>
-            </w:pPr>
-          </w:p>
-        </w:tc>
-        <w:tc>
-          <w:tcPr>
-            <w:tcW w:w="1123" w:type="dxa"/>
-            <w:vMerge/>
-            <w:tcBorders>
-              <w:right w:val="double" w:sz="4" w:space="0" w:color="auto"/>
-            </w:tcBorders>
-            <w:vAlign w:val="center"/>
-          </w:tcPr>
-          <w:p>
-            <w:pPr>
-              <w:pStyle w:val="Chutrongbang"/>
-            </w:pPr>
-          </w:p>
-        </w:tc>
-      </w:tr>
-      <w:tr>
-        <w:trPr>
-          <w:trHeight w:val="340"/>
-          <w:jc w:val="center"/>
-        </w:trPr>
-        <w:tc>
-          <w:tcPr>
-            <w:tcW w:w="538" w:type="dxa"/>
-            <w:vMerge w:val="restart"/>
-            <w:tcBorders>
-              <w:left w:val="double" w:sz="4" w:space="0" w:color="auto"/>
-            </w:tcBorders>
-            <w:vAlign w:val="center"/>
-          </w:tcPr>
-          <w:p>
-            <w:pPr>
-              <w:pStyle w:val="Chutrongbang"/>
-            </w:pPr>
-            <w:r>
-              <w:t>2</w:t>
-            </w:r>
-          </w:p>
-        </w:tc>
-        <w:tc>
-          <w:tcPr>
-            <w:tcW w:w="1574" w:type="dxa"/>
-            <w:vMerge w:val="restart"/>
-            <w:vAlign w:val="center"/>
-          </w:tcPr>
-          <w:p>
-            <w:pPr>
-              <w:pStyle w:val="Chutrongbang"/>
-            </w:pPr>
-            <w:r>
-              <w:t>Dòng điện</w:t>
-            </w:r>
-          </w:p>
-        </w:tc>
-        <w:tc>
-          <w:tcPr>
-            <w:tcW w:w="1279" w:type="dxa"/>
-            <w:tcBorders>
-              <w:bottom w:val="dotted" w:sz="4" w:space="0" w:color="auto"/>
-            </w:tcBorders>
-            <w:vAlign w:val="center"/>
-          </w:tcPr>
-          <w:p>
-            <w:pPr>
-              <w:pStyle w:val="Chutrongbang"/>
-            </w:pPr>
-            <w:r>
-              <w:t>I</w:t>
-            </w:r>
-            <w:r>
-              <w:rPr>
-                <w:vertAlign w:val="subscript"/>
-              </w:rPr>
-              <w:t>1</w:t>
-            </w:r>
-            <w:r>
-              <w:t xml:space="preserve"> (A)</w:t>
-            </w:r>
-          </w:p>
-        </w:tc>
-        <w:tc>
-          <w:tcPr>
-            <w:tcW w:w="941" w:type="dxa"/>
-            <w:tcBorders>
-              <w:top w:val="single" w:sz="4" w:space="0" w:color="auto"/>
-              <w:left w:val="single" w:sz="4" w:space="0" w:color="auto"/>
-              <w:bottom w:val="dotted" w:sz="4" w:space="0" w:color="auto"/>
-              <w:right w:val="single" w:sz="4" w:space="0" w:color="auto"/>
-            </w:tcBorders>
-          </w:tcPr>
-          <w:p>
-            <w:pPr>
-              <w:pStyle w:val="Chutrongbang"/>
-            </w:pPr>
-            <w:r>
-              <w:t>{{ i1max }}</w:t>
-            </w:r>
-          </w:p>
-        </w:tc>
-        <w:tc>
-          <w:tcPr>
-            <w:tcW w:w="988" w:type="dxa"/>
-            <w:tcBorders>
-              <w:top w:val="single" w:sz="4" w:space="0" w:color="auto"/>
-              <w:left w:val="nil"/>
-              <w:bottom w:val="dotted" w:sz="4" w:space="0" w:color="auto"/>
-              <w:right w:val="single" w:sz="4" w:space="0" w:color="auto"/>
-            </w:tcBorders>
-          </w:tcPr>
-          <w:p>
-            <w:pPr>
-              <w:pStyle w:val="Chutrongbang"/>
-            </w:pPr>
-            <w:r>
-              <w:t>{{ i1min }}</w:t>
-            </w:r>
-          </w:p>
-        </w:tc>
-        <w:tc>
-          <w:tcPr>
-            <w:tcW w:w="1057" w:type="dxa"/>
-            <w:tcBorders>
-              <w:top w:val="single" w:sz="4" w:space="0" w:color="auto"/>
-              <w:left w:val="nil"/>
-              <w:bottom w:val="dotted" w:sz="4" w:space="0" w:color="auto"/>
-              <w:right w:val="single" w:sz="4" w:space="0" w:color="auto"/>
-            </w:tcBorders>
-          </w:tcPr>
-          <w:p>
-            <w:pPr>
-              <w:pStyle w:val="Chutrongbang"/>
-            </w:pPr>
-            <w:r>
-              <w:t>{{ i1avg }}</w:t>
-            </w:r>
-          </w:p>
-        </w:tc>
-        <w:tc>
-          <w:tcPr>
-            <w:tcW w:w="2145" w:type="dxa"/>
-            <w:vMerge w:val="restart"/>
-            <w:vAlign w:val="center"/>
-          </w:tcPr>
-          <w:p>
-            <w:pPr>
-              <w:pStyle w:val="Chutrongbang"/>
-            </w:pPr>
-          </w:p>
-        </w:tc>
-        <w:tc>
-          <w:tcPr>
-            <w:tcW w:w="1123" w:type="dxa"/>
-            <w:vMerge w:val="restart"/>
-            <w:tcBorders>
-              <w:right w:val="double" w:sz="4" w:space="0" w:color="auto"/>
-            </w:tcBorders>
-            <w:vAlign w:val="center"/>
-          </w:tcPr>
-          <w:p>
-            <w:pPr>
-              <w:pStyle w:val="Chutrongbang"/>
-            </w:pPr>
-          </w:p>
-        </w:tc>
-      </w:tr>
-      <w:tr>
-        <w:trPr>
-          <w:trHeight w:val="340"/>
-          <w:jc w:val="center"/>
-        </w:trPr>
-        <w:tc>
-          <w:tcPr>
-            <w:tcW w:w="538" w:type="dxa"/>
-            <w:vMerge/>
-            <w:tcBorders>
-              <w:left w:val="double" w:sz="4" w:space="0" w:color="auto"/>
-            </w:tcBorders>
-            <w:vAlign w:val="center"/>
-          </w:tcPr>
-          <w:p>
-            <w:pPr>
-              <w:pStyle w:val="Chutrongbang"/>
-            </w:pPr>
-          </w:p>
-        </w:tc>
-        <w:tc>
-          <w:tcPr>
-            <w:tcW w:w="1574" w:type="dxa"/>
-            <w:vMerge/>
-            <w:vAlign w:val="center"/>
-          </w:tcPr>
-          <w:p>
-            <w:pPr>
-              <w:pStyle w:val="Chutrongbang"/>
-            </w:pPr>
-          </w:p>
-        </w:tc>
-        <w:tc>
-          <w:tcPr>
-            <w:tcW w:w="1279" w:type="dxa"/>
-            <w:tcBorders>
-              <w:top w:val="dotted" w:sz="4" w:space="0" w:color="auto"/>
-              <w:bottom w:val="dotted" w:sz="4" w:space="0" w:color="auto"/>
-            </w:tcBorders>
-            <w:vAlign w:val="center"/>
-          </w:tcPr>
-          <w:p>
-            <w:pPr>
-              <w:pStyle w:val="Chutrongbang"/>
-            </w:pPr>
-            <w:r>
-              <w:t>I</w:t>
-            </w:r>
-            <w:r>
-              <w:rPr>
-                <w:vertAlign w:val="subscript"/>
-              </w:rPr>
-              <w:t xml:space="preserve">2 </w:t>
-            </w:r>
-            <w:r>
-              <w:t>(A)</w:t>
-            </w:r>
-          </w:p>
-        </w:tc>
-        <w:tc>
-          <w:tcPr>
-            <w:tcW w:w="941" w:type="dxa"/>
-            <w:tcBorders>
-              <w:top w:val="dotted" w:sz="4" w:space="0" w:color="auto"/>
-              <w:left w:val="single" w:sz="4" w:space="0" w:color="auto"/>
-              <w:bottom w:val="dotted" w:sz="4" w:space="0" w:color="auto"/>
-              <w:right w:val="single" w:sz="4" w:space="0" w:color="auto"/>
-            </w:tcBorders>
-          </w:tcPr>
-          <w:p>
-            <w:pPr>
-              <w:pStyle w:val="Chutrongbang"/>
-            </w:pPr>
-            <w:r>
-              <w:t>{{ i2max }}</w:t>
-            </w:r>
-          </w:p>
-        </w:tc>
-        <w:tc>
-          <w:tcPr>
-            <w:tcW w:w="988" w:type="dxa"/>
-            <w:tcBorders>
-              <w:top w:val="dotted" w:sz="4" w:space="0" w:color="auto"/>
-              <w:left w:val="nil"/>
-              <w:bottom w:val="dotted" w:sz="4" w:space="0" w:color="auto"/>
-              <w:right w:val="single" w:sz="4" w:space="0" w:color="auto"/>
-            </w:tcBorders>
-          </w:tcPr>
-          <w:p>
-            <w:pPr>
-              <w:pStyle w:val="Chutrongbang"/>
-            </w:pPr>
-            <w:r>
-              <w:t>{{ i2min }}</w:t>
-            </w:r>
-          </w:p>
-        </w:tc>
-        <w:tc>
-          <w:tcPr>
-            <w:tcW w:w="1057" w:type="dxa"/>
-            <w:tcBorders>
-              <w:top w:val="dotted" w:sz="4" w:space="0" w:color="auto"/>
-              <w:left w:val="nil"/>
-              <w:bottom w:val="dotted" w:sz="4" w:space="0" w:color="auto"/>
-              <w:right w:val="single" w:sz="4" w:space="0" w:color="auto"/>
-            </w:tcBorders>
-          </w:tcPr>
-          <w:p>
-            <w:pPr>
-              <w:pStyle w:val="Chutrongbang"/>
-            </w:pPr>
-            <w:r>
-              <w:t>{{ i2avg }}</w:t>
-            </w:r>
-          </w:p>
-        </w:tc>
-        <w:tc>
-          <w:tcPr>
-            <w:tcW w:w="2145" w:type="dxa"/>
-            <w:vMerge/>
-            <w:vAlign w:val="center"/>
-          </w:tcPr>
-          <w:p>
-            <w:pPr>
-              <w:pStyle w:val="Chutrongbang"/>
-            </w:pPr>
-          </w:p>
-        </w:tc>
-        <w:tc>
-          <w:tcPr>
-            <w:tcW w:w="1123" w:type="dxa"/>
-            <w:vMerge/>
-            <w:tcBorders>
-              <w:right w:val="double" w:sz="4" w:space="0" w:color="auto"/>
-            </w:tcBorders>
-            <w:vAlign w:val="center"/>
-          </w:tcPr>
-          <w:p>
-            <w:pPr>
-              <w:pStyle w:val="Chutrongbang"/>
-            </w:pPr>
-          </w:p>
-        </w:tc>
-      </w:tr>
-      <w:tr>
-        <w:trPr>
-          <w:trHeight w:val="340"/>
-          <w:jc w:val="center"/>
-        </w:trPr>
-        <w:tc>
-          <w:tcPr>
-            <w:tcW w:w="538" w:type="dxa"/>
-            <w:vMerge/>
-            <w:tcBorders>
-              <w:left w:val="double" w:sz="4" w:space="0" w:color="auto"/>
-            </w:tcBorders>
-            <w:vAlign w:val="center"/>
-          </w:tcPr>
-          <w:p>
-            <w:pPr>
-              <w:pStyle w:val="Chutrongbang"/>
-            </w:pPr>
-          </w:p>
-        </w:tc>
-        <w:tc>
-          <w:tcPr>
-            <w:tcW w:w="1574" w:type="dxa"/>
-            <w:vMerge/>
-            <w:vAlign w:val="center"/>
-          </w:tcPr>
-          <w:p>
-            <w:pPr>
-              <w:pStyle w:val="Chutrongbang"/>
-            </w:pPr>
-          </w:p>
-        </w:tc>
-        <w:tc>
-          <w:tcPr>
-            <w:tcW w:w="1279" w:type="dxa"/>
-            <w:tcBorders>
-              <w:top w:val="dotted" w:sz="4" w:space="0" w:color="auto"/>
-              <w:bottom w:val="single" w:sz="4" w:space="0" w:color="auto"/>
-            </w:tcBorders>
-            <w:vAlign w:val="center"/>
-          </w:tcPr>
-          <w:p>
-            <w:pPr>
-              <w:pStyle w:val="Chutrongbang"/>
-            </w:pPr>
-            <w:r>
-              <w:t>I</w:t>
-            </w:r>
-            <w:r>
-              <w:rPr>
-                <w:vertAlign w:val="subscript"/>
-              </w:rPr>
-              <w:t>3</w:t>
-            </w:r>
-            <w:r>
-              <w:t xml:space="preserve"> (A)</w:t>
-            </w:r>
-          </w:p>
-        </w:tc>
-        <w:tc>
-          <w:tcPr>
-            <w:tcW w:w="941" w:type="dxa"/>
-            <w:tcBorders>
-              <w:top w:val="dotted" w:sz="4" w:space="0" w:color="auto"/>
-              <w:left w:val="single" w:sz="4" w:space="0" w:color="auto"/>
-              <w:bottom w:val="single" w:sz="4" w:space="0" w:color="auto"/>
-              <w:right w:val="single" w:sz="4" w:space="0" w:color="auto"/>
-            </w:tcBorders>
-          </w:tcPr>
-          <w:p>
-            <w:pPr>
-              <w:pStyle w:val="Chutrongbang"/>
-            </w:pPr>
-            <w:r>
-              <w:t>{{ i3max }}</w:t>
-            </w:r>
-          </w:p>
-        </w:tc>
-        <w:tc>
-          <w:tcPr>
-            <w:tcW w:w="988" w:type="dxa"/>
-            <w:tcBorders>
-              <w:top w:val="dotted" w:sz="4" w:space="0" w:color="auto"/>
-              <w:left w:val="nil"/>
-              <w:bottom w:val="single" w:sz="4" w:space="0" w:color="auto"/>
-              <w:right w:val="single" w:sz="4" w:space="0" w:color="auto"/>
-            </w:tcBorders>
-          </w:tcPr>
-          <w:p>
-            <w:pPr>
-              <w:pStyle w:val="Chutrongbang"/>
-            </w:pPr>
-            <w:r>
-              <w:t>{{ i3min }}</w:t>
-            </w:r>
-          </w:p>
-        </w:tc>
-        <w:tc>
-          <w:tcPr>
-            <w:tcW w:w="1057" w:type="dxa"/>
-            <w:tcBorders>
-              <w:top w:val="dotted" w:sz="4" w:space="0" w:color="auto"/>
-              <w:left w:val="nil"/>
-              <w:bottom w:val="single" w:sz="4" w:space="0" w:color="auto"/>
-              <w:right w:val="single" w:sz="4" w:space="0" w:color="auto"/>
-            </w:tcBorders>
-          </w:tcPr>
-          <w:p>
-            <w:pPr>
-              <w:pStyle w:val="Chutrongbang"/>
-            </w:pPr>
-            <w:r>
-              <w:t>{{ i3avg }}</w:t>
-            </w:r>
-          </w:p>
-        </w:tc>
-        <w:tc>
-          <w:tcPr>
-            <w:tcW w:w="2145" w:type="dxa"/>
-            <w:vMerge/>
-            <w:vAlign w:val="center"/>
-          </w:tcPr>
-          <w:p>
-            <w:pPr>
-              <w:pStyle w:val="Chutrongbang"/>
-            </w:pPr>
-          </w:p>
-        </w:tc>
-        <w:tc>
-          <w:tcPr>
-            <w:tcW w:w="1123" w:type="dxa"/>
-            <w:vMerge/>
-            <w:tcBorders>
-              <w:right w:val="double" w:sz="4" w:space="0" w:color="auto"/>
-            </w:tcBorders>
-            <w:vAlign w:val="center"/>
-          </w:tcPr>
-          <w:p>
-            <w:pPr>
-              <w:pStyle w:val="Chutrongbang"/>
-            </w:pPr>
-          </w:p>
-        </w:tc>
-      </w:tr>
-      <w:tr>
-        <w:trPr>
-          <w:trHeight w:val="340"/>
-          <w:jc w:val="center"/>
-        </w:trPr>
-        <w:tc>
-          <w:tcPr>
-            <w:tcW w:w="538" w:type="dxa"/>
-            <w:vMerge w:val="restart"/>
-            <w:tcBorders>
-              <w:left w:val="double" w:sz="4" w:space="0" w:color="auto"/>
-            </w:tcBorders>
-            <w:vAlign w:val="center"/>
-          </w:tcPr>
-          <w:p>
-            <w:pPr>
-              <w:pStyle w:val="Chutrongbang"/>
-            </w:pPr>
-            <w:r>
-              <w:t>3</w:t>
-            </w:r>
-          </w:p>
-        </w:tc>
-        <w:tc>
-          <w:tcPr>
-            <w:tcW w:w="1574" w:type="dxa"/>
-            <w:vMerge w:val="restart"/>
-            <w:vAlign w:val="center"/>
-          </w:tcPr>
-          <w:p>
-            <w:pPr>
-              <w:pStyle w:val="Chutrongbang"/>
-            </w:pPr>
-            <w:r>
-              <w:t>Độ lệch pha</w:t>
-            </w:r>
-          </w:p>
-        </w:tc>
-        <w:tc>
-          <w:tcPr>
-            <w:tcW w:w="1279" w:type="dxa"/>
-            <w:tcBorders>
-              <w:bottom w:val="dotted" w:sz="4" w:space="0" w:color="auto"/>
-            </w:tcBorders>
-            <w:vAlign w:val="center"/>
-          </w:tcPr>
-          <w:p>
-            <w:pPr>
-              <w:pStyle w:val="Chutrongbang"/>
-            </w:pPr>
-            <w:r>
-              <w:t>ΔU (%)</w:t>
-            </w:r>
-          </w:p>
-        </w:tc>
-        <w:tc>
-          <w:tcPr>
-            <w:tcW w:w="941" w:type="dxa"/>
-            <w:tcBorders>
-              <w:top w:val="single" w:sz="4" w:space="0" w:color="auto"/>
-              <w:left w:val="single" w:sz="4" w:space="0" w:color="auto"/>
-              <w:bottom w:val="dotted" w:sz="4" w:space="0" w:color="auto"/>
-              <w:right w:val="single" w:sz="4" w:space="0" w:color="auto"/>
-            </w:tcBorders>
-          </w:tcPr>
-          <w:p>
-            <w:pPr>
-              <w:pStyle w:val="Chutrongbang"/>
-            </w:pPr>
-            <w:r>
-              <w:t>{{ dumax }}</w:t>
-            </w:r>
-          </w:p>
-        </w:tc>
-        <w:tc>
-          <w:tcPr>
-            <w:tcW w:w="988" w:type="dxa"/>
-            <w:tcBorders>
-              <w:top w:val="single" w:sz="4" w:space="0" w:color="auto"/>
-              <w:left w:val="nil"/>
-              <w:bottom w:val="dotted" w:sz="4" w:space="0" w:color="auto"/>
-              <w:right w:val="single" w:sz="4" w:space="0" w:color="auto"/>
-            </w:tcBorders>
-          </w:tcPr>
-          <w:p>
-            <w:pPr>
-              <w:pStyle w:val="Chutrongbang"/>
-            </w:pPr>
-            <w:r>
-              <w:t>{{ dumin }}</w:t>
-            </w:r>
-          </w:p>
-        </w:tc>
-        <w:tc>
-          <w:tcPr>
-            <w:tcW w:w="1057" w:type="dxa"/>
-            <w:tcBorders>
-              <w:top w:val="single" w:sz="4" w:space="0" w:color="auto"/>
-              <w:left w:val="nil"/>
-              <w:bottom w:val="dotted" w:sz="4" w:space="0" w:color="auto"/>
-              <w:right w:val="single" w:sz="4" w:space="0" w:color="auto"/>
-            </w:tcBorders>
-          </w:tcPr>
-          <w:p>
-            <w:pPr>
-              <w:pStyle w:val="Chutrongbang"/>
-            </w:pPr>
-            <w:r>
-              <w:t>{{ duavg }}</w:t>
-            </w:r>
-          </w:p>
-        </w:tc>
-        <w:tc>
-          <w:tcPr>
-            <w:tcW w:w="2145" w:type="dxa"/>
-            <w:tcBorders>
-              <w:bottom w:val="dotted" w:sz="4" w:space="0" w:color="auto"/>
-            </w:tcBorders>
-            <w:vAlign w:val="center"/>
-          </w:tcPr>
-          <w:p>
-            <w:pPr>
-              <w:pStyle w:val="Chutrongbang"/>
-            </w:pPr>
-            <w:r>
-              <w:t>&lt;5%</w:t>
-            </w:r>
-          </w:p>
-        </w:tc>
-        <w:tc>
-          <w:tcPr>
-            <w:tcW w:w="1123" w:type="dxa"/>
-            <w:tcBorders>
-              <w:bottom w:val="dotted" w:sz="4" w:space="0" w:color="auto"/>
-              <w:right w:val="double" w:sz="4" w:space="0" w:color="auto"/>
-            </w:tcBorders>
-            <w:vAlign w:val="center"/>
-          </w:tcPr>
-          <w:p>
-            <w:pPr>
-              <w:pStyle w:val="Chutrongbang"/>
-            </w:pPr>
-            <w:r>
-              <w:t>{{ dueval }}</w:t>
-            </w:r>
-          </w:p>
-        </w:tc>
-      </w:tr>
-      <w:tr>
-        <w:trPr>
-          <w:trHeight w:val="340"/>
-          <w:jc w:val="center"/>
-        </w:trPr>
-        <w:tc>
-          <w:tcPr>
-            <w:tcW w:w="538" w:type="dxa"/>
-            <w:vMerge/>
-            <w:tcBorders>
-              <w:left w:val="double" w:sz="4" w:space="0" w:color="auto"/>
-            </w:tcBorders>
-            <w:vAlign w:val="center"/>
-          </w:tcPr>
-          <w:p>
-            <w:pPr>
-              <w:pStyle w:val="Chutrongbang"/>
-            </w:pPr>
-          </w:p>
-        </w:tc>
-        <w:tc>
-          <w:tcPr>
-            <w:tcW w:w="1574" w:type="dxa"/>
-            <w:vMerge/>
-            <w:vAlign w:val="center"/>
-          </w:tcPr>
-          <w:p>
-            <w:pPr>
-              <w:pStyle w:val="Chutrongbang"/>
-            </w:pPr>
-          </w:p>
-        </w:tc>
-        <w:tc>
-          <w:tcPr>
-            <w:tcW w:w="1279" w:type="dxa"/>
-            <w:tcBorders>
-              <w:top w:val="dotted" w:sz="4" w:space="0" w:color="auto"/>
-            </w:tcBorders>
-            <w:vAlign w:val="center"/>
-          </w:tcPr>
-          <w:p>
-            <w:pPr>
-              <w:pStyle w:val="Chutrongbang"/>
-            </w:pPr>
-            <w:r>
-              <w:t>ΔI (%)</w:t>
-            </w:r>
-          </w:p>
-        </w:tc>
-        <w:tc>
-          <w:tcPr>
-            <w:tcW w:w="941" w:type="dxa"/>
-            <w:tcBorders>
-              <w:top w:val="dotted" w:sz="4" w:space="0" w:color="auto"/>
-              <w:left w:val="single" w:sz="4" w:space="0" w:color="auto"/>
-              <w:bottom w:val="single" w:sz="4" w:space="0" w:color="auto"/>
-              <w:right w:val="single" w:sz="4" w:space="0" w:color="auto"/>
-            </w:tcBorders>
-          </w:tcPr>
-          <w:p>
-            <w:pPr>
-              <w:pStyle w:val="Chutrongbang"/>
-            </w:pPr>
-            <w:r>
-              <w:t>{{ dimax }}</w:t>
-            </w:r>
-          </w:p>
-        </w:tc>
-        <w:tc>
-          <w:tcPr>
-            <w:tcW w:w="988" w:type="dxa"/>
-            <w:tcBorders>
-              <w:top w:val="dotted" w:sz="4" w:space="0" w:color="auto"/>
-              <w:left w:val="nil"/>
-              <w:bottom w:val="single" w:sz="4" w:space="0" w:color="auto"/>
-              <w:right w:val="single" w:sz="4" w:space="0" w:color="auto"/>
-            </w:tcBorders>
-          </w:tcPr>
-          <w:p>
-            <w:pPr>
-              <w:pStyle w:val="Chutrongbang"/>
-            </w:pPr>
-            <w:r>
-              <w:t>{{ dimin }}</w:t>
-            </w:r>
-          </w:p>
-        </w:tc>
-        <w:tc>
-          <w:tcPr>
-            <w:tcW w:w="1057" w:type="dxa"/>
-            <w:tcBorders>
-              <w:top w:val="dotted" w:sz="4" w:space="0" w:color="auto"/>
-              <w:left w:val="nil"/>
-              <w:bottom w:val="single" w:sz="4" w:space="0" w:color="auto"/>
-              <w:right w:val="single" w:sz="4" w:space="0" w:color="auto"/>
-            </w:tcBorders>
-          </w:tcPr>
-          <w:p>
-            <w:pPr>
-              <w:pStyle w:val="Chutrongbang"/>
-            </w:pPr>
-            <w:r>
-              <w:t>{{ diavg }}</w:t>
-            </w:r>
-          </w:p>
-        </w:tc>
-        <w:tc>
-          <w:tcPr>
-            <w:tcW w:w="2145" w:type="dxa"/>
-            <w:tcBorders>
-              <w:top w:val="dotted" w:sz="4" w:space="0" w:color="auto"/>
-            </w:tcBorders>
-            <w:vAlign w:val="center"/>
-          </w:tcPr>
-          <w:p>
-            <w:pPr>
-              <w:pStyle w:val="Chutrongbang"/>
-            </w:pPr>
-            <w:r>
-              <w:t>không quy định, khuyến cáo nên dưới 10%</w:t>
-            </w:r>
-          </w:p>
-        </w:tc>
-        <w:tc>
-          <w:tcPr>
-            <w:tcW w:w="1123" w:type="dxa"/>
-            <w:tcBorders>
-              <w:top w:val="dotted" w:sz="4" w:space="0" w:color="auto"/>
-              <w:right w:val="double" w:sz="4" w:space="0" w:color="auto"/>
-            </w:tcBorders>
-            <w:vAlign w:val="center"/>
-          </w:tcPr>
-          <w:p>
-            <w:pPr>
-              <w:pStyle w:val="Chutrongbang"/>
-            </w:pPr>
-          </w:p>
-        </w:tc>
-      </w:tr>
-      <w:tr>
-        <w:trPr>
-          <w:trHeight w:val="340"/>
-          <w:jc w:val="center"/>
-        </w:trPr>
-        <w:tc>
-          <w:tcPr>
-            <w:tcW w:w="538" w:type="dxa"/>
-            <w:tcBorders>
-              <w:left w:val="double" w:sz="4" w:space="0" w:color="auto"/>
-            </w:tcBorders>
-            <w:vAlign w:val="center"/>
-          </w:tcPr>
-          <w:p>
-            <w:pPr>
-              <w:pStyle w:val="Chutrongbang"/>
-            </w:pPr>
-            <w:r>
-              <w:t>4</w:t>
-            </w:r>
-          </w:p>
-        </w:tc>
-        <w:tc>
-          <w:tcPr>
-            <w:tcW w:w="1574" w:type="dxa"/>
-            <w:vAlign w:val="center"/>
-          </w:tcPr>
-          <w:p>
-            <w:pPr>
-              <w:pStyle w:val="Chutrongbang"/>
-            </w:pPr>
-            <w:r>
-              <w:t>Hệ số công suất</w:t>
-            </w:r>
-          </w:p>
-        </w:tc>
-        <w:tc>
-          <w:tcPr>
-            <w:tcW w:w="1279" w:type="dxa"/>
-            <w:tcBorders>
-              <w:bottom w:val="single" w:sz="4" w:space="0" w:color="auto"/>
-            </w:tcBorders>
-            <w:vAlign w:val="center"/>
-          </w:tcPr>
-          <w:p>
-            <w:pPr>
-              <w:pStyle w:val="Chutrongbang"/>
-            </w:pPr>
-            <w:r>
-              <w:t>PF</w:t>
-            </w:r>
-          </w:p>
-        </w:tc>
-        <w:tc>
-          <w:tcPr>
-            <w:tcW w:w="941" w:type="dxa"/>
-            <w:tcBorders>
-              <w:top w:val="single" w:sz="4" w:space="0" w:color="auto"/>
-              <w:left w:val="single" w:sz="4" w:space="0" w:color="auto"/>
-              <w:bottom w:val="single" w:sz="4" w:space="0" w:color="auto"/>
-              <w:right w:val="single" w:sz="4" w:space="0" w:color="auto"/>
-            </w:tcBorders>
-          </w:tcPr>
-          <w:p>
-            <w:pPr>
-              <w:pStyle w:val="Chutrongbang"/>
-            </w:pPr>
-            <w:r>
-              <w:t>{{ pfmax }}</w:t>
-            </w:r>
-          </w:p>
-        </w:tc>
-        <w:tc>
-          <w:tcPr>
-            <w:tcW w:w="988" w:type="dxa"/>
-            <w:tcBorders>
-              <w:top w:val="single" w:sz="4" w:space="0" w:color="auto"/>
-              <w:left w:val="nil"/>
-              <w:bottom w:val="single" w:sz="4" w:space="0" w:color="auto"/>
-              <w:right w:val="single" w:sz="4" w:space="0" w:color="auto"/>
-            </w:tcBorders>
-          </w:tcPr>
-          <w:p>
-            <w:pPr>
-              <w:pStyle w:val="Chutrongbang"/>
-            </w:pPr>
-            <w:r>
-              <w:t>{{ pfmin }}</w:t>
-            </w:r>
-          </w:p>
-        </w:tc>
-        <w:tc>
-          <w:tcPr>
-            <w:tcW w:w="1057" w:type="dxa"/>
-            <w:tcBorders>
-              <w:top w:val="single" w:sz="4" w:space="0" w:color="auto"/>
-              <w:left w:val="nil"/>
-              <w:bottom w:val="single" w:sz="4" w:space="0" w:color="auto"/>
-              <w:right w:val="single" w:sz="4" w:space="0" w:color="auto"/>
-            </w:tcBorders>
-          </w:tcPr>
-          <w:p>
-            <w:pPr>
-              <w:pStyle w:val="Chutrongbang"/>
-            </w:pPr>
-            <w:r>
-              <w:t>{{ pfavg }}</w:t>
-            </w:r>
-          </w:p>
-        </w:tc>
-        <w:tc>
-          <w:tcPr>
-            <w:tcW w:w="2145" w:type="dxa"/>
-            <w:vAlign w:val="center"/>
-          </w:tcPr>
-          <w:p>
-            <w:pPr>
-              <w:pStyle w:val="Chutrongbang"/>
-            </w:pPr>
-            <w:r>
-              <w:t>&gt; 0,9</w:t>
-            </w:r>
-          </w:p>
-        </w:tc>
-        <w:tc>
-          <w:tcPr>
-            <w:tcW w:w="1123" w:type="dxa"/>
-            <w:tcBorders>
-              <w:right w:val="double" w:sz="4" w:space="0" w:color="auto"/>
-            </w:tcBorders>
-            <w:vAlign w:val="center"/>
-          </w:tcPr>
-          <w:p>
-            <w:pPr>
-              <w:pStyle w:val="Chutrongbang"/>
-              <w:rPr>
-                <w:lang w:val="en-US"/>
-              </w:rPr>
-            </w:pPr>
-            <w:r>
-              <w:rPr>
-                <w:lang w:val="en-US"/>
-              </w:rPr>
-              <w:t xml:space="preserve">{{ </w:t>
-            </w:r>
-            <w:proofErr w:type="spellStart"/>
-            <w:r>
-              <w:rPr>
-                <w:lang w:val="en-US"/>
-              </w:rPr>
-              <w:t>pfeval</w:t>
-            </w:r>
-            <w:proofErr w:type="spellEnd"/>
-            <w:r>
-              <w:rPr>
-                <w:lang w:val="en-US"/>
-              </w:rPr>
-              <w:t xml:space="preserve"> }}</w:t>
-            </w:r>
-          </w:p>
-        </w:tc>
-      </w:tr>
-      <w:tr>
-        <w:trPr>
-          <w:trHeight w:val="340"/>
-          <w:jc w:val="center"/>
-        </w:trPr>
-        <w:tc>
-          <w:tcPr>
-            <w:tcW w:w="538" w:type="dxa"/>
-            <w:vMerge w:val="restart"/>
-            <w:tcBorders>
-              <w:left w:val="double" w:sz="4" w:space="0" w:color="auto"/>
-            </w:tcBorders>
-            <w:vAlign w:val="center"/>
-          </w:tcPr>
-          <w:p>
-            <w:pPr>
-              <w:pStyle w:val="Chutrongbang"/>
-            </w:pPr>
-            <w:r>
-              <w:t>5</w:t>
-            </w:r>
-          </w:p>
-        </w:tc>
-        <w:tc>
-          <w:tcPr>
-            <w:tcW w:w="1574" w:type="dxa"/>
-            <w:vMerge w:val="restart"/>
-            <w:vAlign w:val="center"/>
-          </w:tcPr>
-          <w:p>
-            <w:pPr>
-              <w:pStyle w:val="Chutrongbang"/>
-            </w:pPr>
-            <w:r>
-              <w:t>Công suất</w:t>
-            </w:r>
-          </w:p>
-        </w:tc>
-        <w:tc>
-          <w:tcPr>
-            <w:tcW w:w="1279" w:type="dxa"/>
-            <w:tcBorders>
-              <w:bottom w:val="dotted" w:sz="4" w:space="0" w:color="auto"/>
-            </w:tcBorders>
-            <w:vAlign w:val="center"/>
-          </w:tcPr>
-          <w:p>
-            <w:pPr>
-              <w:pStyle w:val="Chutrongbang"/>
-            </w:pPr>
-            <w:r>
-              <w:t>P (kW)</w:t>
-            </w:r>
-          </w:p>
-        </w:tc>
-        <w:tc>
-          <w:tcPr>
-            <w:tcW w:w="941" w:type="dxa"/>
-            <w:tcBorders>
-              <w:top w:val="single" w:sz="4" w:space="0" w:color="auto"/>
-              <w:left w:val="single" w:sz="4" w:space="0" w:color="auto"/>
-              <w:bottom w:val="dotted" w:sz="4" w:space="0" w:color="auto"/>
-              <w:right w:val="single" w:sz="4" w:space="0" w:color="auto"/>
-            </w:tcBorders>
-          </w:tcPr>
-          <w:p>
-            <w:pPr>
-              <w:pStyle w:val="Chutrongbang"/>
-            </w:pPr>
-            <w:r>
-              <w:t>{{ pmax }}</w:t>
-            </w:r>
-          </w:p>
-        </w:tc>
-        <w:tc>
-          <w:tcPr>
-            <w:tcW w:w="988" w:type="dxa"/>
-            <w:tcBorders>
-              <w:top w:val="single" w:sz="4" w:space="0" w:color="auto"/>
-              <w:left w:val="nil"/>
-              <w:bottom w:val="dotted" w:sz="4" w:space="0" w:color="auto"/>
-              <w:right w:val="single" w:sz="4" w:space="0" w:color="auto"/>
-            </w:tcBorders>
-          </w:tcPr>
-          <w:p>
-            <w:pPr>
-              <w:pStyle w:val="Chutrongbang"/>
-            </w:pPr>
-            <w:r>
-              <w:t>{{ pmin }}</w:t>
-            </w:r>
-          </w:p>
-        </w:tc>
-        <w:tc>
-          <w:tcPr>
-            <w:tcW w:w="1057" w:type="dxa"/>
-            <w:tcBorders>
-              <w:top w:val="single" w:sz="4" w:space="0" w:color="auto"/>
-              <w:left w:val="nil"/>
-              <w:bottom w:val="dotted" w:sz="4" w:space="0" w:color="auto"/>
-              <w:right w:val="single" w:sz="4" w:space="0" w:color="auto"/>
-            </w:tcBorders>
-          </w:tcPr>
-          <w:p>
-            <w:pPr>
-              <w:pStyle w:val="Chutrongbang"/>
-            </w:pPr>
-            <w:r>
-              <w:t>{{ pavg }}</w:t>
-            </w:r>
-          </w:p>
-        </w:tc>
-        <w:tc>
-          <w:tcPr>
-            <w:tcW w:w="2145" w:type="dxa"/>
-            <w:vMerge w:val="restart"/>
-            <w:vAlign w:val="center"/>
-          </w:tcPr>
-          <w:p>
-            <w:pPr>
-              <w:pStyle w:val="Chutrongbang"/>
-            </w:pPr>
-          </w:p>
-        </w:tc>
-        <w:tc>
-          <w:tcPr>
-            <w:tcW w:w="1123" w:type="dxa"/>
-            <w:vMerge w:val="restart"/>
-            <w:tcBorders>
-              <w:right w:val="double" w:sz="4" w:space="0" w:color="auto"/>
-            </w:tcBorders>
-            <w:vAlign w:val="center"/>
-          </w:tcPr>
-          <w:p>
-            <w:pPr>
-              <w:pStyle w:val="Chutrongbang"/>
-            </w:pPr>
-          </w:p>
-        </w:tc>
-      </w:tr>
-      <w:tr>
-        <w:trPr>
-          <w:trHeight w:val="340"/>
-          <w:jc w:val="center"/>
-        </w:trPr>
-        <w:tc>
-          <w:tcPr>
-            <w:tcW w:w="538" w:type="dxa"/>
-            <w:vMerge/>
-            <w:tcBorders>
-              <w:left w:val="double" w:sz="4" w:space="0" w:color="auto"/>
-            </w:tcBorders>
-            <w:vAlign w:val="center"/>
-          </w:tcPr>
-          <w:p>
-            <w:pPr>
-              <w:pStyle w:val="Chutrongbang"/>
-            </w:pPr>
-          </w:p>
-        </w:tc>
-        <w:tc>
-          <w:tcPr>
-            <w:tcW w:w="1574" w:type="dxa"/>
-            <w:vMerge/>
-            <w:vAlign w:val="center"/>
-          </w:tcPr>
-          <w:p>
-            <w:pPr>
-              <w:pStyle w:val="Chutrongbang"/>
-            </w:pPr>
-          </w:p>
-        </w:tc>
-        <w:tc>
-          <w:tcPr>
-            <w:tcW w:w="1279" w:type="dxa"/>
-            <w:tcBorders>
-              <w:top w:val="dotted" w:sz="4" w:space="0" w:color="auto"/>
-              <w:bottom w:val="dotted" w:sz="4" w:space="0" w:color="auto"/>
-            </w:tcBorders>
-            <w:vAlign w:val="center"/>
-          </w:tcPr>
-          <w:p>
-            <w:pPr>
-              <w:pStyle w:val="Chutrongbang"/>
-            </w:pPr>
-            <w:r>
-              <w:t>Q (kVAR)</w:t>
-            </w:r>
-          </w:p>
-        </w:tc>
-        <w:tc>
-          <w:tcPr>
-            <w:tcW w:w="941" w:type="dxa"/>
-            <w:tcBorders>
-              <w:top w:val="dotted" w:sz="4" w:space="0" w:color="auto"/>
-              <w:left w:val="single" w:sz="4" w:space="0" w:color="auto"/>
-              <w:bottom w:val="dotted" w:sz="4" w:space="0" w:color="auto"/>
-              <w:right w:val="single" w:sz="4" w:space="0" w:color="auto"/>
-            </w:tcBorders>
-          </w:tcPr>
-          <w:p>
-            <w:pPr>
-              <w:pStyle w:val="Chutrongbang"/>
-            </w:pPr>
-            <w:r>
-              <w:t>{{ qmax }}</w:t>
-            </w:r>
-          </w:p>
-        </w:tc>
-        <w:tc>
-          <w:tcPr>
-            <w:tcW w:w="988" w:type="dxa"/>
-            <w:tcBorders>
-              <w:top w:val="dotted" w:sz="4" w:space="0" w:color="auto"/>
-              <w:left w:val="nil"/>
-              <w:bottom w:val="dotted" w:sz="4" w:space="0" w:color="auto"/>
-              <w:right w:val="single" w:sz="4" w:space="0" w:color="auto"/>
-            </w:tcBorders>
-          </w:tcPr>
-          <w:p>
-            <w:pPr>
-              <w:pStyle w:val="Chutrongbang"/>
-            </w:pPr>
-            <w:r>
-              <w:t>{{ qmin }}</w:t>
-            </w:r>
-          </w:p>
-        </w:tc>
-        <w:tc>
-          <w:tcPr>
-            <w:tcW w:w="1057" w:type="dxa"/>
-            <w:tcBorders>
-              <w:top w:val="dotted" w:sz="4" w:space="0" w:color="auto"/>
-              <w:left w:val="nil"/>
-              <w:bottom w:val="dotted" w:sz="4" w:space="0" w:color="auto"/>
-              <w:right w:val="single" w:sz="4" w:space="0" w:color="auto"/>
-            </w:tcBorders>
-          </w:tcPr>
-          <w:p>
-            <w:pPr>
-              <w:pStyle w:val="Chutrongbang"/>
-            </w:pPr>
-            <w:r>
-              <w:t>{{ qavg }}</w:t>
-            </w:r>
-          </w:p>
-        </w:tc>
-        <w:tc>
-          <w:tcPr>
-            <w:tcW w:w="2145" w:type="dxa"/>
-            <w:vMerge/>
-            <w:vAlign w:val="center"/>
-          </w:tcPr>
-          <w:p>
-            <w:pPr>
-              <w:pStyle w:val="Chutrongbang"/>
-            </w:pPr>
-          </w:p>
-        </w:tc>
-        <w:tc>
-          <w:tcPr>
-            <w:tcW w:w="1123" w:type="dxa"/>
-            <w:vMerge/>
-            <w:tcBorders>
-              <w:right w:val="double" w:sz="4" w:space="0" w:color="auto"/>
-            </w:tcBorders>
-            <w:vAlign w:val="center"/>
-          </w:tcPr>
-          <w:p>
-            <w:pPr>
-              <w:pStyle w:val="Chutrongbang"/>
-            </w:pPr>
-          </w:p>
-        </w:tc>
-      </w:tr>
-      <w:tr>
-        <w:trPr>
-          <w:trHeight w:val="340"/>
-          <w:jc w:val="center"/>
-        </w:trPr>
-        <w:tc>
-          <w:tcPr>
-            <w:tcW w:w="538" w:type="dxa"/>
-            <w:vMerge/>
-            <w:tcBorders>
-              <w:left w:val="double" w:sz="4" w:space="0" w:color="auto"/>
-            </w:tcBorders>
-            <w:vAlign w:val="center"/>
-          </w:tcPr>
-          <w:p>
-            <w:pPr>
-              <w:pStyle w:val="Chutrongbang"/>
-            </w:pPr>
-          </w:p>
-        </w:tc>
-        <w:tc>
-          <w:tcPr>
-            <w:tcW w:w="1574" w:type="dxa"/>
-            <w:vMerge/>
-            <w:vAlign w:val="center"/>
-          </w:tcPr>
-          <w:p>
-            <w:pPr>
-              <w:pStyle w:val="Chutrongbang"/>
-            </w:pPr>
-          </w:p>
-        </w:tc>
-        <w:tc>
-          <w:tcPr>
-            <w:tcW w:w="1279" w:type="dxa"/>
-            <w:tcBorders>
-              <w:top w:val="dotted" w:sz="4" w:space="0" w:color="auto"/>
-              <w:bottom w:val="single" w:sz="4" w:space="0" w:color="auto"/>
-            </w:tcBorders>
-            <w:vAlign w:val="center"/>
-          </w:tcPr>
-          <w:p>
-            <w:pPr>
-              <w:pStyle w:val="Chutrongbang"/>
-            </w:pPr>
-            <w:r>
-              <w:t>S (kVA)</w:t>
-            </w:r>
-          </w:p>
-        </w:tc>
-        <w:tc>
-          <w:tcPr>
-            <w:tcW w:w="941" w:type="dxa"/>
-            <w:tcBorders>
-              <w:top w:val="dotted" w:sz="4" w:space="0" w:color="auto"/>
-              <w:left w:val="single" w:sz="4" w:space="0" w:color="auto"/>
-              <w:bottom w:val="single" w:sz="4" w:space="0" w:color="auto"/>
-              <w:right w:val="single" w:sz="4" w:space="0" w:color="auto"/>
-            </w:tcBorders>
-          </w:tcPr>
-          <w:p>
-            <w:pPr>
-              <w:pStyle w:val="Chutrongbang"/>
-            </w:pPr>
-            <w:r>
-              <w:t>{{ smax }}</w:t>
-            </w:r>
-          </w:p>
-        </w:tc>
-        <w:tc>
-          <w:tcPr>
-            <w:tcW w:w="988" w:type="dxa"/>
-            <w:tcBorders>
-              <w:top w:val="dotted" w:sz="4" w:space="0" w:color="auto"/>
-              <w:left w:val="nil"/>
-              <w:bottom w:val="single" w:sz="4" w:space="0" w:color="auto"/>
-              <w:right w:val="single" w:sz="4" w:space="0" w:color="auto"/>
-            </w:tcBorders>
-          </w:tcPr>
-          <w:p>
-            <w:pPr>
-              <w:pStyle w:val="Chutrongbang"/>
-            </w:pPr>
-            <w:r>
-              <w:t>{{ smin }}</w:t>
-            </w:r>
-          </w:p>
-        </w:tc>
-        <w:tc>
-          <w:tcPr>
-            <w:tcW w:w="1057" w:type="dxa"/>
-            <w:tcBorders>
-              <w:top w:val="dotted" w:sz="4" w:space="0" w:color="auto"/>
-              <w:left w:val="nil"/>
-              <w:bottom w:val="single" w:sz="4" w:space="0" w:color="auto"/>
-              <w:right w:val="single" w:sz="4" w:space="0" w:color="auto"/>
-            </w:tcBorders>
-          </w:tcPr>
-          <w:p>
-            <w:pPr>
-              <w:pStyle w:val="Chutrongbang"/>
-            </w:pPr>
-            <w:r>
-              <w:t>{{ savg }}</w:t>
-            </w:r>
-          </w:p>
-        </w:tc>
-        <w:tc>
-          <w:tcPr>
-            <w:tcW w:w="2145" w:type="dxa"/>
-            <w:vMerge/>
-            <w:vAlign w:val="center"/>
-          </w:tcPr>
-          <w:p>
-            <w:pPr>
-              <w:pStyle w:val="Chutrongbang"/>
-            </w:pPr>
-          </w:p>
-        </w:tc>
-        <w:tc>
-          <w:tcPr>
-            <w:tcW w:w="1123" w:type="dxa"/>
-            <w:vMerge/>
-            <w:tcBorders>
-              <w:right w:val="double" w:sz="4" w:space="0" w:color="auto"/>
-            </w:tcBorders>
-            <w:vAlign w:val="center"/>
-          </w:tcPr>
-          <w:p>
-            <w:pPr>
-              <w:pStyle w:val="Chutrongbang"/>
-            </w:pPr>
-          </w:p>
-        </w:tc>
-      </w:tr>
-      <w:tr>
-        <w:trPr>
-          <w:trHeight w:val="340"/>
-          <w:jc w:val="center"/>
-        </w:trPr>
-        <w:tc>
-          <w:tcPr>
-            <w:tcW w:w="538" w:type="dxa"/>
-            <w:vMerge w:val="restart"/>
-            <w:tcBorders>
-              <w:left w:val="double" w:sz="4" w:space="0" w:color="auto"/>
-            </w:tcBorders>
-            <w:vAlign w:val="center"/>
-          </w:tcPr>
-          <w:p>
-            <w:pPr>
-              <w:pStyle w:val="Chutrongbang"/>
-            </w:pPr>
-            <w:r>
-              <w:t>6</w:t>
-            </w:r>
-          </w:p>
-        </w:tc>
-        <w:tc>
-          <w:tcPr>
-            <w:tcW w:w="1574" w:type="dxa"/>
-            <w:vMerge w:val="restart"/>
-            <w:vAlign w:val="center"/>
-          </w:tcPr>
-          <w:p>
-            <w:pPr>
-              <w:pStyle w:val="Chutrongbang"/>
-            </w:pPr>
-            <w:r>
-              <w:t>Tổng biến dạng sóng hài điện áp</w:t>
-            </w:r>
-          </w:p>
-        </w:tc>
-        <w:tc>
-          <w:tcPr>
-            <w:tcW w:w="1279" w:type="dxa"/>
-            <w:tcBorders>
-              <w:bottom w:val="dotted" w:sz="4" w:space="0" w:color="auto"/>
-            </w:tcBorders>
-            <w:vAlign w:val="center"/>
-          </w:tcPr>
-          <w:p>
-            <w:pPr>
-              <w:pStyle w:val="Chutrongbang"/>
-            </w:pPr>
-            <w:r>
-              <w:t>THD</w:t>
-            </w:r>
-            <w:r>
-              <w:rPr>
-                <w:vertAlign w:val="subscript"/>
-              </w:rPr>
-              <w:t>1</w:t>
-            </w:r>
-            <w:r>
-              <w:t xml:space="preserve"> (%)</w:t>
-            </w:r>
-          </w:p>
-        </w:tc>
-        <w:tc>
-          <w:tcPr>
-            <w:tcW w:w="941" w:type="dxa"/>
-            <w:tcBorders>
-              <w:top w:val="single" w:sz="4" w:space="0" w:color="auto"/>
-              <w:left w:val="single" w:sz="4" w:space="0" w:color="auto"/>
-              <w:bottom w:val="dotted" w:sz="4" w:space="0" w:color="auto"/>
-              <w:right w:val="single" w:sz="4" w:space="0" w:color="auto"/>
-            </w:tcBorders>
-          </w:tcPr>
-          <w:p>
-            <w:pPr>
-              <w:pStyle w:val="Chutrongbang"/>
-            </w:pPr>
-            <w:r>
-              <w:t>{{ thd1max }}</w:t>
-            </w:r>
-          </w:p>
-        </w:tc>
-        <w:tc>
-          <w:tcPr>
-            <w:tcW w:w="988" w:type="dxa"/>
-            <w:tcBorders>
-              <w:top w:val="single" w:sz="4" w:space="0" w:color="auto"/>
-              <w:left w:val="nil"/>
-              <w:bottom w:val="dotted" w:sz="4" w:space="0" w:color="auto"/>
-              <w:right w:val="single" w:sz="4" w:space="0" w:color="auto"/>
-            </w:tcBorders>
-          </w:tcPr>
-          <w:p>
-            <w:pPr>
-              <w:pStyle w:val="Chutrongbang"/>
-            </w:pPr>
-            <w:r>
-              <w:t>{{ thd1min }}</w:t>
-            </w:r>
-          </w:p>
-        </w:tc>
-        <w:tc>
-          <w:tcPr>
-            <w:tcW w:w="1057" w:type="dxa"/>
-            <w:tcBorders>
-              <w:top w:val="single" w:sz="4" w:space="0" w:color="auto"/>
-              <w:left w:val="nil"/>
-              <w:bottom w:val="dotted" w:sz="4" w:space="0" w:color="auto"/>
-              <w:right w:val="single" w:sz="4" w:space="0" w:color="auto"/>
-            </w:tcBorders>
-          </w:tcPr>
-          <w:p>
-            <w:pPr>
-              <w:pStyle w:val="Chutrongbang"/>
-            </w:pPr>
-            <w:r>
-              <w:t>{{ thd1avg }}</w:t>
-            </w:r>
-          </w:p>
-        </w:tc>
-        <w:tc>
-          <w:tcPr>
-            <w:tcW w:w="2145" w:type="dxa"/>
-            <w:vMerge w:val="restart"/>
-            <w:vAlign w:val="center"/>
-          </w:tcPr>
-          <w:p>
-            <w:pPr>
-              <w:pStyle w:val="Chutrongbang"/>
-            </w:pPr>
-            <w:r>
-              <w:t>&lt; 8%</w:t>
-            </w:r>
-          </w:p>
-        </w:tc>
-        <w:tc>
-          <w:tcPr>
-            <w:tcW w:w="1123" w:type="dxa"/>
-            <w:vMerge w:val="restart"/>
-            <w:tcBorders>
-              <w:right w:val="double" w:sz="4" w:space="0" w:color="auto"/>
-            </w:tcBorders>
-            <w:vAlign w:val="center"/>
-          </w:tcPr>
-          <w:p>
-            <w:pPr>
-              <w:pStyle w:val="Chutrongbang"/>
-            </w:pPr>
-            <w:r>
-              <w:t>{{ thdeval }}</w:t>
-            </w:r>
-          </w:p>
-        </w:tc>
-      </w:tr>
-      <w:tr>
-        <w:trPr>
-          <w:trHeight w:val="340"/>
-          <w:jc w:val="center"/>
-        </w:trPr>
-        <w:tc>
-          <w:tcPr>
-            <w:tcW w:w="538" w:type="dxa"/>
-            <w:vMerge/>
-            <w:tcBorders>
-              <w:left w:val="double" w:sz="4" w:space="0" w:color="auto"/>
-            </w:tcBorders>
-            <w:vAlign w:val="center"/>
-          </w:tcPr>
-          <w:p>
-            <w:pPr>
-              <w:pStyle w:val="Chutrongbang"/>
-            </w:pPr>
-          </w:p>
-        </w:tc>
-        <w:tc>
-          <w:tcPr>
-            <w:tcW w:w="1574" w:type="dxa"/>
-            <w:vMerge/>
-            <w:vAlign w:val="center"/>
-          </w:tcPr>
-          <w:p>
-            <w:pPr>
-              <w:pStyle w:val="Chutrongbang"/>
-            </w:pPr>
-          </w:p>
-        </w:tc>
-        <w:tc>
-          <w:tcPr>
-            <w:tcW w:w="1279" w:type="dxa"/>
-            <w:tcBorders>
-              <w:top w:val="dotted" w:sz="4" w:space="0" w:color="auto"/>
-              <w:bottom w:val="dotted" w:sz="4" w:space="0" w:color="auto"/>
-            </w:tcBorders>
-            <w:vAlign w:val="center"/>
-          </w:tcPr>
-          <w:p>
-            <w:pPr>
-              <w:pStyle w:val="Chutrongbang"/>
-            </w:pPr>
-            <w:r>
-              <w:t>THD</w:t>
-            </w:r>
-            <w:r>
-              <w:rPr>
-                <w:vertAlign w:val="subscript"/>
-              </w:rPr>
-              <w:t>2</w:t>
-            </w:r>
-            <w:r>
-              <w:t xml:space="preserve"> (%)</w:t>
-            </w:r>
-          </w:p>
-        </w:tc>
-        <w:tc>
-          <w:tcPr>
-            <w:tcW w:w="941" w:type="dxa"/>
-            <w:tcBorders>
-              <w:top w:val="dotted" w:sz="4" w:space="0" w:color="auto"/>
-              <w:left w:val="single" w:sz="4" w:space="0" w:color="auto"/>
-              <w:bottom w:val="dotted" w:sz="4" w:space="0" w:color="auto"/>
-              <w:right w:val="single" w:sz="4" w:space="0" w:color="auto"/>
-            </w:tcBorders>
-          </w:tcPr>
-          <w:p>
-            <w:pPr>
-              <w:pStyle w:val="Chutrongbang"/>
-            </w:pPr>
-            <w:r>
-              <w:t>{{ thd2max }}</w:t>
-            </w:r>
-          </w:p>
-        </w:tc>
-        <w:tc>
-          <w:tcPr>
-            <w:tcW w:w="988" w:type="dxa"/>
-            <w:tcBorders>
-              <w:top w:val="dotted" w:sz="4" w:space="0" w:color="auto"/>
-              <w:left w:val="nil"/>
-              <w:bottom w:val="dotted" w:sz="4" w:space="0" w:color="auto"/>
-              <w:right w:val="single" w:sz="4" w:space="0" w:color="auto"/>
-            </w:tcBorders>
-          </w:tcPr>
-          <w:p>
-            <w:pPr>
-              <w:pStyle w:val="Chutrongbang"/>
-            </w:pPr>
-            <w:r>
-              <w:t>{{ thd2min }}</w:t>
-            </w:r>
-          </w:p>
-        </w:tc>
-        <w:tc>
-          <w:tcPr>
-            <w:tcW w:w="1057" w:type="dxa"/>
-            <w:tcBorders>
-              <w:top w:val="dotted" w:sz="4" w:space="0" w:color="auto"/>
-              <w:left w:val="nil"/>
-              <w:bottom w:val="dotted" w:sz="4" w:space="0" w:color="auto"/>
-              <w:right w:val="single" w:sz="4" w:space="0" w:color="auto"/>
-            </w:tcBorders>
-          </w:tcPr>
-          <w:p>
-            <w:pPr>
-              <w:pStyle w:val="Chutrongbang"/>
-            </w:pPr>
-            <w:r>
-              <w:t>{{ thd2avg }}</w:t>
-            </w:r>
-          </w:p>
-        </w:tc>
-        <w:tc>
-          <w:tcPr>
-            <w:tcW w:w="2145" w:type="dxa"/>
-            <w:vMerge/>
-            <w:vAlign w:val="center"/>
-          </w:tcPr>
-          <w:p>
-            <w:pPr>
-              <w:pStyle w:val="Chutrongbang"/>
-            </w:pPr>
-          </w:p>
-        </w:tc>
-        <w:tc>
-          <w:tcPr>
-            <w:tcW w:w="1123" w:type="dxa"/>
-            <w:vMerge/>
-            <w:tcBorders>
-              <w:right w:val="double" w:sz="4" w:space="0" w:color="auto"/>
-            </w:tcBorders>
-            <w:vAlign w:val="center"/>
-          </w:tcPr>
-          <w:p>
-            <w:pPr>
-              <w:pStyle w:val="Chutrongbang"/>
-            </w:pPr>
-          </w:p>
-        </w:tc>
-      </w:tr>
-      <w:tr>
-        <w:trPr>
-          <w:trHeight w:val="340"/>
-          <w:jc w:val="center"/>
-        </w:trPr>
-        <w:tc>
-          <w:tcPr>
-            <w:tcW w:w="538" w:type="dxa"/>
-            <w:vMerge/>
-            <w:tcBorders>
-              <w:left w:val="double" w:sz="4" w:space="0" w:color="auto"/>
-            </w:tcBorders>
-            <w:vAlign w:val="center"/>
-          </w:tcPr>
-          <w:p>
-            <w:pPr>
-              <w:pStyle w:val="Chutrongbang"/>
-            </w:pPr>
-          </w:p>
-        </w:tc>
-        <w:tc>
-          <w:tcPr>
-            <w:tcW w:w="1574" w:type="dxa"/>
-            <w:vMerge/>
-            <w:vAlign w:val="center"/>
-          </w:tcPr>
-          <w:p>
-            <w:pPr>
-              <w:pStyle w:val="Chutrongbang"/>
-            </w:pPr>
-          </w:p>
-        </w:tc>
-        <w:tc>
-          <w:tcPr>
-            <w:tcW w:w="1279" w:type="dxa"/>
-            <w:tcBorders>
-              <w:top w:val="dotted" w:sz="4" w:space="0" w:color="auto"/>
-              <w:bottom w:val="single" w:sz="4" w:space="0" w:color="auto"/>
-            </w:tcBorders>
-            <w:vAlign w:val="center"/>
-          </w:tcPr>
-          <w:p>
-            <w:pPr>
-              <w:pStyle w:val="Chutrongbang"/>
-            </w:pPr>
-            <w:r>
-              <w:t>THD</w:t>
-            </w:r>
-            <w:r>
-              <w:rPr>
-                <w:vertAlign w:val="subscript"/>
-              </w:rPr>
-              <w:t>3</w:t>
-            </w:r>
-            <w:r>
-              <w:t xml:space="preserve"> (%)</w:t>
-            </w:r>
-          </w:p>
-        </w:tc>
-        <w:tc>
-          <w:tcPr>
-            <w:tcW w:w="941" w:type="dxa"/>
-            <w:tcBorders>
-              <w:top w:val="dotted" w:sz="4" w:space="0" w:color="auto"/>
-              <w:left w:val="single" w:sz="4" w:space="0" w:color="auto"/>
-              <w:bottom w:val="single" w:sz="4" w:space="0" w:color="auto"/>
-              <w:right w:val="single" w:sz="4" w:space="0" w:color="auto"/>
-            </w:tcBorders>
-          </w:tcPr>
-          <w:p>
-            <w:pPr>
-              <w:pStyle w:val="Chutrongbang"/>
-            </w:pPr>
-            <w:r>
-              <w:t>{{ thd3max }}</w:t>
-            </w:r>
-          </w:p>
-        </w:tc>
-        <w:tc>
-          <w:tcPr>
-            <w:tcW w:w="988" w:type="dxa"/>
-            <w:tcBorders>
-              <w:top w:val="dotted" w:sz="4" w:space="0" w:color="auto"/>
-              <w:left w:val="nil"/>
-              <w:bottom w:val="single" w:sz="4" w:space="0" w:color="auto"/>
-              <w:right w:val="single" w:sz="4" w:space="0" w:color="auto"/>
-            </w:tcBorders>
-          </w:tcPr>
-          <w:p>
-            <w:pPr>
-              <w:pStyle w:val="Chutrongbang"/>
-            </w:pPr>
-            <w:r>
-              <w:t>{{ thd3min }}</w:t>
-            </w:r>
-          </w:p>
-        </w:tc>
-        <w:tc>
-          <w:tcPr>
-            <w:tcW w:w="1057" w:type="dxa"/>
-            <w:tcBorders>
-              <w:top w:val="dotted" w:sz="4" w:space="0" w:color="auto"/>
-              <w:left w:val="nil"/>
-              <w:bottom w:val="single" w:sz="4" w:space="0" w:color="auto"/>
-              <w:right w:val="single" w:sz="4" w:space="0" w:color="auto"/>
-            </w:tcBorders>
-          </w:tcPr>
-          <w:p>
-            <w:pPr>
-              <w:pStyle w:val="Chutrongbang"/>
-            </w:pPr>
-            <w:r>
-              <w:t>{{ thd3avg }}</w:t>
-            </w:r>
-          </w:p>
-        </w:tc>
-        <w:tc>
-          <w:tcPr>
-            <w:tcW w:w="2145" w:type="dxa"/>
-            <w:vMerge/>
-            <w:vAlign w:val="center"/>
-          </w:tcPr>
-          <w:p>
-            <w:pPr>
-              <w:pStyle w:val="Chutrongbang"/>
-            </w:pPr>
-          </w:p>
-        </w:tc>
-        <w:tc>
-          <w:tcPr>
-            <w:tcW w:w="1123" w:type="dxa"/>
-            <w:vMerge/>
-            <w:tcBorders>
-              <w:right w:val="double" w:sz="4" w:space="0" w:color="auto"/>
-            </w:tcBorders>
-            <w:vAlign w:val="center"/>
-          </w:tcPr>
-          <w:p>
-            <w:pPr>
-              <w:pStyle w:val="Chutrongbang"/>
-            </w:pPr>
-          </w:p>
-        </w:tc>
-      </w:tr>
-      <w:tr>
-        <w:trPr>
-          <w:trHeight w:val="340"/>
-          <w:jc w:val="center"/>
-        </w:trPr>
-        <w:tc>
-          <w:tcPr>
-            <w:tcW w:w="538" w:type="dxa"/>
-            <w:vMerge w:val="restart"/>
-            <w:tcBorders>
-              <w:left w:val="double" w:sz="4" w:space="0" w:color="auto"/>
-            </w:tcBorders>
-            <w:vAlign w:val="center"/>
-          </w:tcPr>
-          <w:p>
-            <w:pPr>
-              <w:pStyle w:val="Chutrongbang"/>
-            </w:pPr>
-            <w:r>
-              <w:lastRenderedPageBreak/>
-              <w:t>7</w:t>
-            </w:r>
-          </w:p>
-        </w:tc>
-        <w:tc>
-          <w:tcPr>
-            <w:tcW w:w="1574" w:type="dxa"/>
-            <w:vMerge w:val="restart"/>
-            <w:vAlign w:val="center"/>
-          </w:tcPr>
-          <w:p>
-            <w:pPr>
-              <w:pStyle w:val="Chutrongbang"/>
-            </w:pPr>
-            <w:r>
-              <w:t>Tổng biến dạng sóng hài dòng điện</w:t>
-            </w:r>
-          </w:p>
-        </w:tc>
-        <w:tc>
-          <w:tcPr>
-            <w:tcW w:w="1279" w:type="dxa"/>
-            <w:tcBorders>
-              <w:bottom w:val="dotted" w:sz="4" w:space="0" w:color="auto"/>
-            </w:tcBorders>
-            <w:vAlign w:val="center"/>
-          </w:tcPr>
-          <w:p>
-            <w:pPr>
-              <w:pStyle w:val="Chutrongbang"/>
-            </w:pPr>
-            <w:r>
-              <w:t>TDD</w:t>
-            </w:r>
-            <w:r>
-              <w:rPr>
-                <w:vertAlign w:val="subscript"/>
-              </w:rPr>
-              <w:t>1</w:t>
-            </w:r>
-            <w:r>
-              <w:t xml:space="preserve"> (%)</w:t>
-            </w:r>
-          </w:p>
-        </w:tc>
-        <w:tc>
-          <w:tcPr>
-            <w:tcW w:w="941" w:type="dxa"/>
-            <w:tcBorders>
-              <w:top w:val="single" w:sz="4" w:space="0" w:color="auto"/>
-              <w:left w:val="single" w:sz="4" w:space="0" w:color="auto"/>
-              <w:bottom w:val="dotted" w:sz="4" w:space="0" w:color="auto"/>
-              <w:right w:val="single" w:sz="4" w:space="0" w:color="auto"/>
-            </w:tcBorders>
-          </w:tcPr>
-          <w:p>
-            <w:pPr>
-              <w:pStyle w:val="Chutrongbang"/>
-            </w:pPr>
-            <w:r>
-              <w:t>{{ tdd1max }}</w:t>
-            </w:r>
-          </w:p>
-        </w:tc>
-        <w:tc>
-          <w:tcPr>
-            <w:tcW w:w="988" w:type="dxa"/>
-            <w:tcBorders>
-              <w:top w:val="single" w:sz="4" w:space="0" w:color="auto"/>
-              <w:left w:val="nil"/>
-              <w:bottom w:val="dotted" w:sz="4" w:space="0" w:color="auto"/>
-              <w:right w:val="single" w:sz="4" w:space="0" w:color="auto"/>
-            </w:tcBorders>
-          </w:tcPr>
-          <w:p>
-            <w:pPr>
-              <w:pStyle w:val="Chutrongbang"/>
-            </w:pPr>
-            <w:r>
-              <w:t>{{ tdd1min }}</w:t>
-            </w:r>
-          </w:p>
-        </w:tc>
-        <w:tc>
-          <w:tcPr>
-            <w:tcW w:w="1057" w:type="dxa"/>
-            <w:tcBorders>
-              <w:top w:val="single" w:sz="4" w:space="0" w:color="auto"/>
-              <w:left w:val="nil"/>
-              <w:bottom w:val="dotted" w:sz="4" w:space="0" w:color="auto"/>
-              <w:right w:val="single" w:sz="4" w:space="0" w:color="auto"/>
-            </w:tcBorders>
-          </w:tcPr>
-          <w:p>
-            <w:pPr>
-              <w:pStyle w:val="Chutrongbang"/>
-            </w:pPr>
-            <w:r>
-              <w:t>{{ tdd1avg }}</w:t>
-            </w:r>
-          </w:p>
-        </w:tc>
-        <w:tc>
-          <w:tcPr>
-            <w:tcW w:w="2145" w:type="dxa"/>
-            <w:vMerge w:val="restart"/>
-            <w:vAlign w:val="center"/>
-          </w:tcPr>
-          <w:p>
-            <w:pPr>
-              <w:pStyle w:val="Chutrongbang"/>
-            </w:pPr>
-            <w:r>
-              <w:t>&lt;12%</w:t>
-            </w:r>
-          </w:p>
-        </w:tc>
-        <w:tc>
-          <w:tcPr>
-            <w:tcW w:w="1123" w:type="dxa"/>
-            <w:vMerge w:val="restart"/>
-            <w:tcBorders>
-              <w:right w:val="double" w:sz="4" w:space="0" w:color="auto"/>
-            </w:tcBorders>
-            <w:vAlign w:val="center"/>
-          </w:tcPr>
-          <w:p>
-            <w:pPr>
-              <w:pStyle w:val="Chutrongbang"/>
-            </w:pPr>
-            <w:r>
-              <w:t>{{ t</w:t>
-            </w:r>
-            <w:r>
-              <w:rPr>
-                <w:lang w:val="en-US"/>
-              </w:rPr>
-              <w:t>d</w:t>
-            </w:r>
-            <w:r>
-              <w:t>deval }}</w:t>
-            </w:r>
-          </w:p>
-        </w:tc>
-      </w:tr>
-      <w:tr>
-        <w:trPr>
-          <w:trHeight w:val="340"/>
-          <w:jc w:val="center"/>
-        </w:trPr>
-        <w:tc>
-          <w:tcPr>
-            <w:tcW w:w="538" w:type="dxa"/>
-            <w:vMerge/>
-            <w:tcBorders>
-              <w:left w:val="double" w:sz="4" w:space="0" w:color="auto"/>
-            </w:tcBorders>
-            <w:vAlign w:val="center"/>
-          </w:tcPr>
-          <w:p>
-            <w:pPr>
-              <w:pStyle w:val="Chutrongbang"/>
-            </w:pPr>
-          </w:p>
-        </w:tc>
-        <w:tc>
-          <w:tcPr>
-            <w:tcW w:w="1574" w:type="dxa"/>
-            <w:vMerge/>
-            <w:vAlign w:val="center"/>
-          </w:tcPr>
-          <w:p>
-            <w:pPr>
-              <w:pStyle w:val="Chutrongbang"/>
-            </w:pPr>
-          </w:p>
-        </w:tc>
-        <w:tc>
-          <w:tcPr>
-            <w:tcW w:w="1279" w:type="dxa"/>
-            <w:tcBorders>
-              <w:top w:val="dotted" w:sz="4" w:space="0" w:color="auto"/>
-              <w:bottom w:val="dotted" w:sz="4" w:space="0" w:color="auto"/>
-            </w:tcBorders>
-            <w:vAlign w:val="center"/>
-          </w:tcPr>
-          <w:p>
-            <w:pPr>
-              <w:pStyle w:val="Chutrongbang"/>
-            </w:pPr>
-            <w:r>
-              <w:t>TDD</w:t>
-            </w:r>
-            <w:r>
-              <w:rPr>
-                <w:vertAlign w:val="subscript"/>
-              </w:rPr>
-              <w:t>2</w:t>
-            </w:r>
-            <w:r>
-              <w:t xml:space="preserve"> (%)</w:t>
-            </w:r>
-          </w:p>
-        </w:tc>
-        <w:tc>
-          <w:tcPr>
-            <w:tcW w:w="941" w:type="dxa"/>
-            <w:tcBorders>
-              <w:top w:val="dotted" w:sz="4" w:space="0" w:color="auto"/>
-              <w:left w:val="single" w:sz="4" w:space="0" w:color="auto"/>
-              <w:bottom w:val="dotted" w:sz="4" w:space="0" w:color="auto"/>
-              <w:right w:val="single" w:sz="4" w:space="0" w:color="auto"/>
-            </w:tcBorders>
-          </w:tcPr>
-          <w:p>
-            <w:pPr>
-              <w:pStyle w:val="Chutrongbang"/>
-            </w:pPr>
-            <w:r>
-              <w:t>{{ tdd2max }}</w:t>
-            </w:r>
-          </w:p>
-        </w:tc>
-        <w:tc>
-          <w:tcPr>
-            <w:tcW w:w="988" w:type="dxa"/>
-            <w:tcBorders>
-              <w:top w:val="dotted" w:sz="4" w:space="0" w:color="auto"/>
-              <w:left w:val="nil"/>
-              <w:bottom w:val="dotted" w:sz="4" w:space="0" w:color="auto"/>
-              <w:right w:val="single" w:sz="4" w:space="0" w:color="auto"/>
-            </w:tcBorders>
-          </w:tcPr>
-          <w:p>
-            <w:pPr>
-              <w:pStyle w:val="Chutrongbang"/>
-            </w:pPr>
-            <w:r>
-              <w:t>{{ tdd2min }}</w:t>
-            </w:r>
-          </w:p>
-        </w:tc>
-        <w:tc>
-          <w:tcPr>
-            <w:tcW w:w="1057" w:type="dxa"/>
-            <w:tcBorders>
-              <w:top w:val="dotted" w:sz="4" w:space="0" w:color="auto"/>
-              <w:left w:val="nil"/>
-              <w:bottom w:val="dotted" w:sz="4" w:space="0" w:color="auto"/>
-              <w:right w:val="single" w:sz="4" w:space="0" w:color="auto"/>
-            </w:tcBorders>
-          </w:tcPr>
-          <w:p>
-            <w:pPr>
-              <w:pStyle w:val="Chutrongbang"/>
-            </w:pPr>
-            <w:r>
-              <w:t>{{ tdd2avg }}</w:t>
-            </w:r>
-          </w:p>
-        </w:tc>
-        <w:tc>
-          <w:tcPr>
-            <w:tcW w:w="2145" w:type="dxa"/>
-            <w:vMerge/>
-            <w:vAlign w:val="center"/>
-          </w:tcPr>
-          <w:p>
-            <w:pPr>
-              <w:pStyle w:val="Chutrongbang"/>
-            </w:pPr>
-          </w:p>
-        </w:tc>
-        <w:tc>
-          <w:tcPr>
-            <w:tcW w:w="1123" w:type="dxa"/>
-            <w:vMerge/>
-            <w:tcBorders>
-              <w:right w:val="double" w:sz="4" w:space="0" w:color="auto"/>
-            </w:tcBorders>
-            <w:vAlign w:val="center"/>
-          </w:tcPr>
-          <w:p>
-            <w:pPr>
-              <w:pStyle w:val="Chutrongbang"/>
-            </w:pPr>
-          </w:p>
-        </w:tc>
-      </w:tr>
-      <w:tr>
-        <w:trPr>
-          <w:trHeight w:val="340"/>
-          <w:jc w:val="center"/>
-        </w:trPr>
-        <w:tc>
-          <w:tcPr>
-            <w:tcW w:w="538" w:type="dxa"/>
-            <w:vMerge/>
-            <w:tcBorders>
-              <w:left w:val="double" w:sz="4" w:space="0" w:color="auto"/>
-              <w:bottom w:val="double" w:sz="4" w:space="0" w:color="auto"/>
-            </w:tcBorders>
-            <w:vAlign w:val="center"/>
-          </w:tcPr>
-          <w:p>
-            <w:pPr>
-              <w:pStyle w:val="Chutrongbang"/>
-            </w:pPr>
-          </w:p>
-        </w:tc>
-        <w:tc>
-          <w:tcPr>
-            <w:tcW w:w="1574" w:type="dxa"/>
-            <w:vMerge/>
-            <w:tcBorders>
-              <w:bottom w:val="double" w:sz="4" w:space="0" w:color="auto"/>
-            </w:tcBorders>
-            <w:vAlign w:val="center"/>
-          </w:tcPr>
-          <w:p>
-            <w:pPr>
-              <w:pStyle w:val="Chutrongbang"/>
-            </w:pPr>
-          </w:p>
-        </w:tc>
-        <w:tc>
-          <w:tcPr>
-            <w:tcW w:w="1279" w:type="dxa"/>
-            <w:tcBorders>
-              <w:top w:val="dotted" w:sz="4" w:space="0" w:color="auto"/>
-              <w:bottom w:val="double" w:sz="4" w:space="0" w:color="auto"/>
-            </w:tcBorders>
-            <w:vAlign w:val="center"/>
-          </w:tcPr>
-          <w:p>
-            <w:pPr>
-              <w:pStyle w:val="Chutrongbang"/>
-            </w:pPr>
-            <w:r>
-              <w:t>TDD</w:t>
-            </w:r>
-            <w:r>
-              <w:rPr>
-                <w:vertAlign w:val="subscript"/>
-              </w:rPr>
-              <w:t>3</w:t>
-            </w:r>
-            <w:r>
-              <w:t xml:space="preserve"> (%)</w:t>
-            </w:r>
-          </w:p>
-        </w:tc>
-        <w:tc>
-          <w:tcPr>
-            <w:tcW w:w="941" w:type="dxa"/>
-            <w:tcBorders>
-              <w:top w:val="dotted" w:sz="4" w:space="0" w:color="auto"/>
-              <w:left w:val="single" w:sz="4" w:space="0" w:color="auto"/>
-              <w:bottom w:val="double" w:sz="4" w:space="0" w:color="auto"/>
-              <w:right w:val="single" w:sz="4" w:space="0" w:color="auto"/>
-            </w:tcBorders>
-          </w:tcPr>
-          <w:p>
-            <w:pPr>
-              <w:pStyle w:val="Chutrongbang"/>
-            </w:pPr>
-            <w:r>
-              <w:t>{{ tdd3max }}</w:t>
-            </w:r>
-          </w:p>
-        </w:tc>
-        <w:tc>
-          <w:tcPr>
-            <w:tcW w:w="988" w:type="dxa"/>
-            <w:tcBorders>
-              <w:top w:val="dotted" w:sz="4" w:space="0" w:color="auto"/>
-              <w:left w:val="nil"/>
-              <w:bottom w:val="double" w:sz="4" w:space="0" w:color="auto"/>
-              <w:right w:val="single" w:sz="4" w:space="0" w:color="auto"/>
-            </w:tcBorders>
-          </w:tcPr>
-          <w:p>
-            <w:pPr>
-              <w:pStyle w:val="Chutrongbang"/>
-            </w:pPr>
-            <w:r>
-              <w:t>{{ tdd3min }}</w:t>
-            </w:r>
-          </w:p>
-        </w:tc>
-        <w:tc>
-          <w:tcPr>
-            <w:tcW w:w="1057" w:type="dxa"/>
-            <w:tcBorders>
-              <w:top w:val="dotted" w:sz="4" w:space="0" w:color="auto"/>
-              <w:left w:val="nil"/>
-              <w:bottom w:val="double" w:sz="4" w:space="0" w:color="auto"/>
-              <w:right w:val="single" w:sz="4" w:space="0" w:color="auto"/>
-            </w:tcBorders>
-          </w:tcPr>
-          <w:p>
-            <w:pPr>
-              <w:pStyle w:val="Chutrongbang"/>
-            </w:pPr>
-            <w:r>
-              <w:t>{{ tdd3avg }}</w:t>
-            </w:r>
-          </w:p>
-        </w:tc>
-        <w:tc>
-          <w:tcPr>
-            <w:tcW w:w="2145" w:type="dxa"/>
-            <w:vMerge/>
-            <w:tcBorders>
-              <w:bottom w:val="double" w:sz="4" w:space="0" w:color="auto"/>
-            </w:tcBorders>
-            <w:vAlign w:val="center"/>
-          </w:tcPr>
-          <w:p>
-            <w:pPr>
-              <w:pStyle w:val="Chutrongbang"/>
-            </w:pPr>
-          </w:p>
-        </w:tc>
-        <w:tc>
-          <w:tcPr>
-            <w:tcW w:w="1123" w:type="dxa"/>
-            <w:vMerge/>
-            <w:tcBorders>
-              <w:bottom w:val="double" w:sz="4" w:space="0" w:color="auto"/>
-              <w:right w:val="double" w:sz="4" w:space="0" w:color="auto"/>
-            </w:tcBorders>
-            <w:vAlign w:val="center"/>
-          </w:tcPr>
-          <w:p>
-            <w:pPr>
-              <w:pStyle w:val="Chutrongbang"/>
-            </w:pPr>
-          </w:p>
-        </w:tc>
-      </w:tr>
-    </w:tbl>
-    <w:p>
-      <w:pPr>
-        <w:spacing w:after="160" w:line="259" w:lineRule="auto"/>
-      </w:pPr>
-    </w:p>
-    <w:p>
-      <w:pPr>
-        <w:spacing w:after="160" w:line="259" w:lineRule="auto"/>
-        <w:rPr>
-          <w:lang w:val="en-US"/>
-        </w:rPr>
-      </w:pPr>
     </w:p>
     <w:sectPr>
       <w:pgSz w:w="11906" w:h="16838" w:code="9"/>

</xml_diff>

<commit_message>
Remove KEW correction/interpolation modules
Remove legacy KEW correction and interpolation functionality and related frontend assets. Deleted modules/kew/correct_kew.py, modules/kew/interpolate_kew.py and static/js/kew_charts.js; removed utils/file_utils.py. Simplified modules/kew/kew_api.py by removing upload/fix/detect/correct endpoints and associated imports. Updated several templates (sidebar, tool_bundles, tool_switcher, dashboard) and removed settings modal; swapped/updated Word templates in static/word-template. This cleans out the old KEW patching/interpolation UI and backend handlers, leaving the core export functionality.
</commit_message>
<xml_diff>
--- a/static/word-template/mba.docx
+++ b/static/word-template/mba.docx
@@ -292,6 +292,2964 @@
       <w:r>
         <w:t xml:space="preserve"> }}</w:t>
       </w:r>
+    </w:p>
+    <w:p>
+      <w:pPr>
+        <w:pStyle w:val="onvnnhnxt"/>
+      </w:pPr>
+      <w:r>
+        <w:br w:type="page"/>
+      </w:r>
+    </w:p>
+    <w:p>
+      <w:pPr>
+        <w:pStyle w:val="KDmBang"/>
+        <w:rPr>
+          <w:szCs w:val="24"/>
+          <w:lang w:val="en-US"/>
+        </w:rPr>
+      </w:pPr>
+      <w:r>
+        <w:rPr>
+          <w:szCs w:val="24"/>
+        </w:rPr>
+        <w:lastRenderedPageBreak/>
+        <w:t>Bảng 5.</w:t>
+      </w:r>
+      <w:r>
+        <w:rPr>
+          <w:szCs w:val="24"/>
+        </w:rPr>
+        <w:fldChar w:fldCharType="begin"/>
+      </w:r>
+      <w:r>
+        <w:rPr>
+          <w:szCs w:val="24"/>
+        </w:rPr>
+        <w:instrText xml:space="preserve"> SEQ Bảng_5. \* ARABIC </w:instrText>
+      </w:r>
+      <w:r>
+        <w:rPr>
+          <w:szCs w:val="24"/>
+        </w:rPr>
+        <w:fldChar w:fldCharType="separate"/>
+      </w:r>
+      <w:r>
+        <w:rPr>
+          <w:noProof/>
+          <w:szCs w:val="24"/>
+        </w:rPr>
+        <w:t>1</w:t>
+      </w:r>
+      <w:r>
+        <w:rPr>
+          <w:noProof/>
+          <w:szCs w:val="24"/>
+        </w:rPr>
+        <w:fldChar w:fldCharType="end"/>
+      </w:r>
+      <w:r>
+        <w:rPr>
+          <w:szCs w:val="24"/>
+        </w:rPr>
+        <w:t xml:space="preserve"> - </w:t>
+      </w:r>
+      <w:r>
+        <w:rPr>
+          <w:szCs w:val="24"/>
+        </w:rPr>
+        <w:t xml:space="preserve">{{ </w:t>
+      </w:r>
+      <w:r>
+        <w:rPr>
+          <w:szCs w:val="24"/>
+          <w:lang w:val="en-US"/>
+        </w:rPr>
+        <w:t>cap_tab</w:t>
+      </w:r>
+      <w:r>
+        <w:rPr>
+          <w:szCs w:val="24"/>
+          <w:lang w:val="en-US"/>
+        </w:rPr>
+        <w:t>_mba</w:t>
+      </w:r>
+      <w:r>
+        <w:rPr>
+          <w:szCs w:val="24"/>
+          <w:lang w:val="en-US"/>
+        </w:rPr>
+        <w:t xml:space="preserve"> </w:t>
+      </w:r>
+      <w:r>
+        <w:rPr>
+          <w:szCs w:val="24"/>
+        </w:rPr>
+        <w:t>}}</w:t>
+      </w:r>
+    </w:p>
+    <w:tbl>
+      <w:tblPr>
+        <w:tblW w:w="9645" w:type="dxa"/>
+        <w:jc w:val="center"/>
+        <w:tblBorders>
+          <w:top w:val="single" w:sz="4" w:space="0" w:color="auto"/>
+          <w:left w:val="single" w:sz="4" w:space="0" w:color="auto"/>
+          <w:bottom w:val="single" w:sz="4" w:space="0" w:color="auto"/>
+          <w:right w:val="single" w:sz="4" w:space="0" w:color="auto"/>
+          <w:insideH w:val="single" w:sz="4" w:space="0" w:color="auto"/>
+          <w:insideV w:val="single" w:sz="4" w:space="0" w:color="auto"/>
+        </w:tblBorders>
+        <w:tblLayout w:type="fixed"/>
+        <w:tblLook w:val="04A0" w:firstRow="1" w:lastRow="0" w:firstColumn="1" w:lastColumn="0" w:noHBand="0" w:noVBand="1"/>
+      </w:tblPr>
+      <w:tblGrid>
+        <w:gridCol w:w="538"/>
+        <w:gridCol w:w="1574"/>
+        <w:gridCol w:w="1279"/>
+        <w:gridCol w:w="941"/>
+        <w:gridCol w:w="988"/>
+        <w:gridCol w:w="1057"/>
+        <w:gridCol w:w="2145"/>
+        <w:gridCol w:w="1123"/>
+      </w:tblGrid>
+      <w:tr>
+        <w:trPr>
+          <w:trHeight w:val="340"/>
+          <w:tblHeader/>
+          <w:jc w:val="center"/>
+        </w:trPr>
+        <w:tc>
+          <w:tcPr>
+            <w:tcW w:w="538" w:type="dxa"/>
+            <w:tcBorders>
+              <w:top w:val="double" w:sz="4" w:space="0" w:color="auto"/>
+              <w:left w:val="double" w:sz="4" w:space="0" w:color="auto"/>
+            </w:tcBorders>
+            <w:shd w:val="clear" w:color="auto" w:fill="D9D9D9"/>
+            <w:vAlign w:val="center"/>
+          </w:tcPr>
+          <w:p>
+            <w:pPr>
+              <w:pStyle w:val="Chutrongbang"/>
+              <w:rPr>
+                <w:b/>
+              </w:rPr>
+            </w:pPr>
+            <w:r>
+              <w:rPr>
+                <w:b/>
+              </w:rPr>
+              <w:t>TT</w:t>
+            </w:r>
+          </w:p>
+        </w:tc>
+        <w:tc>
+          <w:tcPr>
+            <w:tcW w:w="2853" w:type="dxa"/>
+            <w:gridSpan w:val="2"/>
+            <w:tcBorders>
+              <w:top w:val="double" w:sz="4" w:space="0" w:color="auto"/>
+            </w:tcBorders>
+            <w:shd w:val="clear" w:color="auto" w:fill="D9D9D9"/>
+            <w:vAlign w:val="center"/>
+          </w:tcPr>
+          <w:p>
+            <w:pPr>
+              <w:pStyle w:val="Chutrongbang"/>
+              <w:rPr>
+                <w:b/>
+              </w:rPr>
+            </w:pPr>
+            <w:r>
+              <w:rPr>
+                <w:b/>
+              </w:rPr>
+              <w:t>Thông số</w:t>
+            </w:r>
+          </w:p>
+        </w:tc>
+        <w:tc>
+          <w:tcPr>
+            <w:tcW w:w="941" w:type="dxa"/>
+            <w:tcBorders>
+              <w:top w:val="double" w:sz="4" w:space="0" w:color="auto"/>
+              <w:bottom w:val="single" w:sz="4" w:space="0" w:color="auto"/>
+            </w:tcBorders>
+            <w:shd w:val="clear" w:color="auto" w:fill="D9D9D9"/>
+            <w:vAlign w:val="center"/>
+          </w:tcPr>
+          <w:p>
+            <w:pPr>
+              <w:pStyle w:val="Chutrongbang"/>
+              <w:rPr>
+                <w:b/>
+              </w:rPr>
+            </w:pPr>
+            <w:r>
+              <w:rPr>
+                <w:b/>
+              </w:rPr>
+              <w:t>Cao nhất</w:t>
+            </w:r>
+          </w:p>
+        </w:tc>
+        <w:tc>
+          <w:tcPr>
+            <w:tcW w:w="988" w:type="dxa"/>
+            <w:tcBorders>
+              <w:top w:val="double" w:sz="4" w:space="0" w:color="auto"/>
+              <w:bottom w:val="single" w:sz="4" w:space="0" w:color="auto"/>
+            </w:tcBorders>
+            <w:shd w:val="clear" w:color="auto" w:fill="D9D9D9"/>
+            <w:vAlign w:val="center"/>
+          </w:tcPr>
+          <w:p>
+            <w:pPr>
+              <w:pStyle w:val="Chutrongbang"/>
+              <w:rPr>
+                <w:b/>
+              </w:rPr>
+            </w:pPr>
+            <w:r>
+              <w:rPr>
+                <w:b/>
+              </w:rPr>
+              <w:t>Thấp nhất</w:t>
+            </w:r>
+          </w:p>
+        </w:tc>
+        <w:tc>
+          <w:tcPr>
+            <w:tcW w:w="1057" w:type="dxa"/>
+            <w:tcBorders>
+              <w:top w:val="double" w:sz="4" w:space="0" w:color="auto"/>
+              <w:bottom w:val="single" w:sz="4" w:space="0" w:color="auto"/>
+            </w:tcBorders>
+            <w:shd w:val="clear" w:color="auto" w:fill="D9D9D9"/>
+            <w:vAlign w:val="center"/>
+          </w:tcPr>
+          <w:p>
+            <w:pPr>
+              <w:pStyle w:val="Chutrongbang"/>
+              <w:rPr>
+                <w:b/>
+              </w:rPr>
+            </w:pPr>
+            <w:r>
+              <w:rPr>
+                <w:b/>
+              </w:rPr>
+              <w:t>Trung bình</w:t>
+            </w:r>
+          </w:p>
+        </w:tc>
+        <w:tc>
+          <w:tcPr>
+            <w:tcW w:w="2145" w:type="dxa"/>
+            <w:tcBorders>
+              <w:top w:val="double" w:sz="4" w:space="0" w:color="auto"/>
+            </w:tcBorders>
+            <w:shd w:val="clear" w:color="auto" w:fill="D9D9D9"/>
+            <w:vAlign w:val="center"/>
+          </w:tcPr>
+          <w:p>
+            <w:pPr>
+              <w:pStyle w:val="Chutrongbang"/>
+              <w:rPr>
+                <w:b/>
+              </w:rPr>
+            </w:pPr>
+            <w:r>
+              <w:rPr>
+                <w:b/>
+              </w:rPr>
+              <w:t>Giới hạn</w:t>
+            </w:r>
+          </w:p>
+        </w:tc>
+        <w:tc>
+          <w:tcPr>
+            <w:tcW w:w="1123" w:type="dxa"/>
+            <w:tcBorders>
+              <w:top w:val="double" w:sz="4" w:space="0" w:color="auto"/>
+              <w:right w:val="double" w:sz="4" w:space="0" w:color="auto"/>
+            </w:tcBorders>
+            <w:shd w:val="clear" w:color="auto" w:fill="D9D9D9"/>
+            <w:vAlign w:val="center"/>
+          </w:tcPr>
+          <w:p>
+            <w:pPr>
+              <w:pStyle w:val="Chutrongbang"/>
+              <w:rPr>
+                <w:b/>
+              </w:rPr>
+            </w:pPr>
+            <w:r>
+              <w:rPr>
+                <w:b/>
+              </w:rPr>
+              <w:t>Đánh giá</w:t>
+            </w:r>
+          </w:p>
+        </w:tc>
+      </w:tr>
+      <w:tr>
+        <w:trPr>
+          <w:trHeight w:val="340"/>
+          <w:jc w:val="center"/>
+        </w:trPr>
+        <w:tc>
+          <w:tcPr>
+            <w:tcW w:w="538" w:type="dxa"/>
+            <w:vMerge w:val="restart"/>
+            <w:tcBorders>
+              <w:left w:val="double" w:sz="4" w:space="0" w:color="auto"/>
+            </w:tcBorders>
+            <w:vAlign w:val="center"/>
+          </w:tcPr>
+          <w:p>
+            <w:pPr>
+              <w:pStyle w:val="Chutrongbang"/>
+            </w:pPr>
+            <w:r>
+              <w:t>1</w:t>
+            </w:r>
+          </w:p>
+        </w:tc>
+        <w:tc>
+          <w:tcPr>
+            <w:tcW w:w="1574" w:type="dxa"/>
+            <w:vMerge w:val="restart"/>
+            <w:vAlign w:val="center"/>
+          </w:tcPr>
+          <w:p>
+            <w:pPr>
+              <w:pStyle w:val="Chutrongbang"/>
+            </w:pPr>
+            <w:r>
+              <w:t>Điện áp</w:t>
+            </w:r>
+          </w:p>
+        </w:tc>
+        <w:tc>
+          <w:tcPr>
+            <w:tcW w:w="1279" w:type="dxa"/>
+            <w:tcBorders>
+              <w:bottom w:val="dotted" w:sz="4" w:space="0" w:color="auto"/>
+            </w:tcBorders>
+            <w:vAlign w:val="center"/>
+          </w:tcPr>
+          <w:p>
+            <w:pPr>
+              <w:pStyle w:val="Chutrongbang"/>
+            </w:pPr>
+            <w:r>
+              <w:t>U</w:t>
+            </w:r>
+            <w:r>
+              <w:rPr>
+                <w:vertAlign w:val="subscript"/>
+              </w:rPr>
+              <w:t xml:space="preserve">12 </w:t>
+            </w:r>
+            <w:r>
+              <w:t>(V)</w:t>
+            </w:r>
+          </w:p>
+        </w:tc>
+        <w:tc>
+          <w:tcPr>
+            <w:tcW w:w="941" w:type="dxa"/>
+            <w:tcBorders>
+              <w:top w:val="single" w:sz="4" w:space="0" w:color="auto"/>
+              <w:left w:val="single" w:sz="4" w:space="0" w:color="auto"/>
+              <w:bottom w:val="dotted" w:sz="4" w:space="0" w:color="auto"/>
+              <w:right w:val="single" w:sz="4" w:space="0" w:color="auto"/>
+            </w:tcBorders>
+          </w:tcPr>
+          <w:p>
+            <w:pPr>
+              <w:pStyle w:val="Chutrongbang"/>
+            </w:pPr>
+            <w:r>
+              <w:t>{{ u12max }}</w:t>
+            </w:r>
+          </w:p>
+        </w:tc>
+        <w:tc>
+          <w:tcPr>
+            <w:tcW w:w="988" w:type="dxa"/>
+            <w:tcBorders>
+              <w:top w:val="single" w:sz="4" w:space="0" w:color="auto"/>
+              <w:left w:val="nil"/>
+              <w:bottom w:val="dotted" w:sz="4" w:space="0" w:color="auto"/>
+              <w:right w:val="single" w:sz="4" w:space="0" w:color="auto"/>
+            </w:tcBorders>
+          </w:tcPr>
+          <w:p>
+            <w:pPr>
+              <w:pStyle w:val="Chutrongbang"/>
+            </w:pPr>
+            <w:r>
+              <w:t>{{ u12min }}</w:t>
+            </w:r>
+          </w:p>
+        </w:tc>
+        <w:tc>
+          <w:tcPr>
+            <w:tcW w:w="1057" w:type="dxa"/>
+            <w:tcBorders>
+              <w:top w:val="single" w:sz="4" w:space="0" w:color="auto"/>
+              <w:left w:val="nil"/>
+              <w:bottom w:val="dotted" w:sz="4" w:space="0" w:color="auto"/>
+              <w:right w:val="single" w:sz="4" w:space="0" w:color="auto"/>
+            </w:tcBorders>
+          </w:tcPr>
+          <w:p>
+            <w:pPr>
+              <w:pStyle w:val="Chutrongbang"/>
+            </w:pPr>
+            <w:r>
+              <w:t>{{ u12avg }}</w:t>
+            </w:r>
+          </w:p>
+        </w:tc>
+        <w:tc>
+          <w:tcPr>
+            <w:tcW w:w="2145" w:type="dxa"/>
+            <w:vMerge w:val="restart"/>
+            <w:vAlign w:val="center"/>
+          </w:tcPr>
+          <w:p>
+            <w:pPr>
+              <w:pStyle w:val="Chutrongbang"/>
+            </w:pPr>
+            <w:r>
+              <w:t>-5% ≤ δ ≤ 5% tại điện áp danh định 400V</w:t>
+            </w:r>
+          </w:p>
+        </w:tc>
+        <w:tc>
+          <w:tcPr>
+            <w:tcW w:w="1123" w:type="dxa"/>
+            <w:vMerge w:val="restart"/>
+            <w:tcBorders>
+              <w:right w:val="double" w:sz="4" w:space="0" w:color="auto"/>
+            </w:tcBorders>
+            <w:vAlign w:val="center"/>
+          </w:tcPr>
+          <w:p>
+            <w:pPr>
+              <w:pStyle w:val="Chutrongbang"/>
+            </w:pPr>
+            <w:r>
+              <w:t>{{ u12eval }}</w:t>
+            </w:r>
+          </w:p>
+        </w:tc>
+      </w:tr>
+      <w:tr>
+        <w:trPr>
+          <w:trHeight w:val="340"/>
+          <w:jc w:val="center"/>
+        </w:trPr>
+        <w:tc>
+          <w:tcPr>
+            <w:tcW w:w="538" w:type="dxa"/>
+            <w:vMerge/>
+            <w:tcBorders>
+              <w:left w:val="double" w:sz="4" w:space="0" w:color="auto"/>
+            </w:tcBorders>
+            <w:vAlign w:val="center"/>
+          </w:tcPr>
+          <w:p>
+            <w:pPr>
+              <w:pStyle w:val="Chutrongbang"/>
+            </w:pPr>
+          </w:p>
+        </w:tc>
+        <w:tc>
+          <w:tcPr>
+            <w:tcW w:w="1574" w:type="dxa"/>
+            <w:vMerge/>
+            <w:vAlign w:val="center"/>
+          </w:tcPr>
+          <w:p>
+            <w:pPr>
+              <w:pStyle w:val="Chutrongbang"/>
+            </w:pPr>
+          </w:p>
+        </w:tc>
+        <w:tc>
+          <w:tcPr>
+            <w:tcW w:w="1279" w:type="dxa"/>
+            <w:tcBorders>
+              <w:top w:val="dotted" w:sz="4" w:space="0" w:color="auto"/>
+              <w:bottom w:val="dotted" w:sz="4" w:space="0" w:color="auto"/>
+            </w:tcBorders>
+            <w:vAlign w:val="center"/>
+          </w:tcPr>
+          <w:p>
+            <w:pPr>
+              <w:pStyle w:val="Chutrongbang"/>
+            </w:pPr>
+            <w:r>
+              <w:t>U</w:t>
+            </w:r>
+            <w:r>
+              <w:rPr>
+                <w:vertAlign w:val="subscript"/>
+              </w:rPr>
+              <w:t>23</w:t>
+            </w:r>
+            <w:r>
+              <w:t xml:space="preserve"> (V)</w:t>
+            </w:r>
+          </w:p>
+        </w:tc>
+        <w:tc>
+          <w:tcPr>
+            <w:tcW w:w="941" w:type="dxa"/>
+            <w:tcBorders>
+              <w:top w:val="dotted" w:sz="4" w:space="0" w:color="auto"/>
+              <w:left w:val="single" w:sz="4" w:space="0" w:color="auto"/>
+              <w:bottom w:val="dotted" w:sz="4" w:space="0" w:color="auto"/>
+              <w:right w:val="single" w:sz="4" w:space="0" w:color="auto"/>
+            </w:tcBorders>
+          </w:tcPr>
+          <w:p>
+            <w:pPr>
+              <w:pStyle w:val="Chutrongbang"/>
+            </w:pPr>
+            <w:r>
+              <w:t>{{ u23max }}</w:t>
+            </w:r>
+          </w:p>
+        </w:tc>
+        <w:tc>
+          <w:tcPr>
+            <w:tcW w:w="988" w:type="dxa"/>
+            <w:tcBorders>
+              <w:top w:val="dotted" w:sz="4" w:space="0" w:color="auto"/>
+              <w:left w:val="nil"/>
+              <w:bottom w:val="dotted" w:sz="4" w:space="0" w:color="auto"/>
+              <w:right w:val="single" w:sz="4" w:space="0" w:color="auto"/>
+            </w:tcBorders>
+          </w:tcPr>
+          <w:p>
+            <w:pPr>
+              <w:pStyle w:val="Chutrongbang"/>
+            </w:pPr>
+            <w:r>
+              <w:t>{{ u23min }}</w:t>
+            </w:r>
+          </w:p>
+        </w:tc>
+        <w:tc>
+          <w:tcPr>
+            <w:tcW w:w="1057" w:type="dxa"/>
+            <w:tcBorders>
+              <w:top w:val="dotted" w:sz="4" w:space="0" w:color="auto"/>
+              <w:left w:val="nil"/>
+              <w:bottom w:val="dotted" w:sz="4" w:space="0" w:color="auto"/>
+              <w:right w:val="single" w:sz="4" w:space="0" w:color="auto"/>
+            </w:tcBorders>
+          </w:tcPr>
+          <w:p>
+            <w:pPr>
+              <w:pStyle w:val="Chutrongbang"/>
+            </w:pPr>
+            <w:r>
+              <w:t>{{ u23avg }}</w:t>
+            </w:r>
+          </w:p>
+        </w:tc>
+        <w:tc>
+          <w:tcPr>
+            <w:tcW w:w="2145" w:type="dxa"/>
+            <w:vMerge/>
+            <w:vAlign w:val="center"/>
+          </w:tcPr>
+          <w:p>
+            <w:pPr>
+              <w:pStyle w:val="Chutrongbang"/>
+            </w:pPr>
+          </w:p>
+        </w:tc>
+        <w:tc>
+          <w:tcPr>
+            <w:tcW w:w="1123" w:type="dxa"/>
+            <w:vMerge/>
+            <w:tcBorders>
+              <w:right w:val="double" w:sz="4" w:space="0" w:color="auto"/>
+            </w:tcBorders>
+            <w:vAlign w:val="center"/>
+          </w:tcPr>
+          <w:p>
+            <w:pPr>
+              <w:pStyle w:val="Chutrongbang"/>
+            </w:pPr>
+          </w:p>
+        </w:tc>
+      </w:tr>
+      <w:tr>
+        <w:trPr>
+          <w:trHeight w:val="340"/>
+          <w:jc w:val="center"/>
+        </w:trPr>
+        <w:tc>
+          <w:tcPr>
+            <w:tcW w:w="538" w:type="dxa"/>
+            <w:vMerge/>
+            <w:tcBorders>
+              <w:left w:val="double" w:sz="4" w:space="0" w:color="auto"/>
+            </w:tcBorders>
+            <w:vAlign w:val="center"/>
+          </w:tcPr>
+          <w:p>
+            <w:pPr>
+              <w:pStyle w:val="Chutrongbang"/>
+            </w:pPr>
+          </w:p>
+        </w:tc>
+        <w:tc>
+          <w:tcPr>
+            <w:tcW w:w="1574" w:type="dxa"/>
+            <w:vMerge/>
+            <w:vAlign w:val="center"/>
+          </w:tcPr>
+          <w:p>
+            <w:pPr>
+              <w:pStyle w:val="Chutrongbang"/>
+            </w:pPr>
+          </w:p>
+        </w:tc>
+        <w:tc>
+          <w:tcPr>
+            <w:tcW w:w="1279" w:type="dxa"/>
+            <w:tcBorders>
+              <w:top w:val="dotted" w:sz="4" w:space="0" w:color="auto"/>
+              <w:bottom w:val="single" w:sz="4" w:space="0" w:color="auto"/>
+            </w:tcBorders>
+            <w:vAlign w:val="center"/>
+          </w:tcPr>
+          <w:p>
+            <w:pPr>
+              <w:pStyle w:val="Chutrongbang"/>
+            </w:pPr>
+            <w:r>
+              <w:t>U</w:t>
+            </w:r>
+            <w:r>
+              <w:rPr>
+                <w:vertAlign w:val="subscript"/>
+              </w:rPr>
+              <w:t>31</w:t>
+            </w:r>
+            <w:r>
+              <w:t xml:space="preserve"> (V)</w:t>
+            </w:r>
+          </w:p>
+        </w:tc>
+        <w:tc>
+          <w:tcPr>
+            <w:tcW w:w="941" w:type="dxa"/>
+            <w:tcBorders>
+              <w:top w:val="dotted" w:sz="4" w:space="0" w:color="auto"/>
+              <w:left w:val="single" w:sz="4" w:space="0" w:color="auto"/>
+              <w:bottom w:val="single" w:sz="4" w:space="0" w:color="auto"/>
+              <w:right w:val="single" w:sz="4" w:space="0" w:color="auto"/>
+            </w:tcBorders>
+          </w:tcPr>
+          <w:p>
+            <w:pPr>
+              <w:pStyle w:val="Chutrongbang"/>
+            </w:pPr>
+            <w:r>
+              <w:t>{{ u31max }}</w:t>
+            </w:r>
+          </w:p>
+        </w:tc>
+        <w:tc>
+          <w:tcPr>
+            <w:tcW w:w="988" w:type="dxa"/>
+            <w:tcBorders>
+              <w:top w:val="dotted" w:sz="4" w:space="0" w:color="auto"/>
+              <w:left w:val="nil"/>
+              <w:bottom w:val="single" w:sz="4" w:space="0" w:color="auto"/>
+              <w:right w:val="single" w:sz="4" w:space="0" w:color="auto"/>
+            </w:tcBorders>
+          </w:tcPr>
+          <w:p>
+            <w:pPr>
+              <w:pStyle w:val="Chutrongbang"/>
+            </w:pPr>
+            <w:r>
+              <w:t>{{ u31min }}</w:t>
+            </w:r>
+          </w:p>
+        </w:tc>
+        <w:tc>
+          <w:tcPr>
+            <w:tcW w:w="1057" w:type="dxa"/>
+            <w:tcBorders>
+              <w:top w:val="dotted" w:sz="4" w:space="0" w:color="auto"/>
+              <w:left w:val="nil"/>
+              <w:bottom w:val="single" w:sz="4" w:space="0" w:color="auto"/>
+              <w:right w:val="single" w:sz="4" w:space="0" w:color="auto"/>
+            </w:tcBorders>
+          </w:tcPr>
+          <w:p>
+            <w:pPr>
+              <w:pStyle w:val="Chutrongbang"/>
+            </w:pPr>
+            <w:r>
+              <w:t>{{ u31avg }}</w:t>
+            </w:r>
+          </w:p>
+        </w:tc>
+        <w:tc>
+          <w:tcPr>
+            <w:tcW w:w="2145" w:type="dxa"/>
+            <w:vMerge/>
+            <w:vAlign w:val="center"/>
+          </w:tcPr>
+          <w:p>
+            <w:pPr>
+              <w:pStyle w:val="Chutrongbang"/>
+            </w:pPr>
+          </w:p>
+        </w:tc>
+        <w:tc>
+          <w:tcPr>
+            <w:tcW w:w="1123" w:type="dxa"/>
+            <w:vMerge/>
+            <w:tcBorders>
+              <w:right w:val="double" w:sz="4" w:space="0" w:color="auto"/>
+            </w:tcBorders>
+            <w:vAlign w:val="center"/>
+          </w:tcPr>
+          <w:p>
+            <w:pPr>
+              <w:pStyle w:val="Chutrongbang"/>
+            </w:pPr>
+          </w:p>
+        </w:tc>
+      </w:tr>
+      <w:tr>
+        <w:trPr>
+          <w:trHeight w:val="340"/>
+          <w:jc w:val="center"/>
+        </w:trPr>
+        <w:tc>
+          <w:tcPr>
+            <w:tcW w:w="538" w:type="dxa"/>
+            <w:vMerge w:val="restart"/>
+            <w:tcBorders>
+              <w:left w:val="double" w:sz="4" w:space="0" w:color="auto"/>
+            </w:tcBorders>
+            <w:vAlign w:val="center"/>
+          </w:tcPr>
+          <w:p>
+            <w:pPr>
+              <w:pStyle w:val="Chutrongbang"/>
+            </w:pPr>
+            <w:r>
+              <w:t>2</w:t>
+            </w:r>
+          </w:p>
+        </w:tc>
+        <w:tc>
+          <w:tcPr>
+            <w:tcW w:w="1574" w:type="dxa"/>
+            <w:vMerge w:val="restart"/>
+            <w:vAlign w:val="center"/>
+          </w:tcPr>
+          <w:p>
+            <w:pPr>
+              <w:pStyle w:val="Chutrongbang"/>
+            </w:pPr>
+            <w:r>
+              <w:t>Dòng điện</w:t>
+            </w:r>
+          </w:p>
+        </w:tc>
+        <w:tc>
+          <w:tcPr>
+            <w:tcW w:w="1279" w:type="dxa"/>
+            <w:tcBorders>
+              <w:bottom w:val="dotted" w:sz="4" w:space="0" w:color="auto"/>
+            </w:tcBorders>
+            <w:vAlign w:val="center"/>
+          </w:tcPr>
+          <w:p>
+            <w:pPr>
+              <w:pStyle w:val="Chutrongbang"/>
+            </w:pPr>
+            <w:r>
+              <w:t>I</w:t>
+            </w:r>
+            <w:r>
+              <w:rPr>
+                <w:vertAlign w:val="subscript"/>
+              </w:rPr>
+              <w:t>1</w:t>
+            </w:r>
+            <w:r>
+              <w:t xml:space="preserve"> (A)</w:t>
+            </w:r>
+          </w:p>
+        </w:tc>
+        <w:tc>
+          <w:tcPr>
+            <w:tcW w:w="941" w:type="dxa"/>
+            <w:tcBorders>
+              <w:top w:val="single" w:sz="4" w:space="0" w:color="auto"/>
+              <w:left w:val="single" w:sz="4" w:space="0" w:color="auto"/>
+              <w:bottom w:val="dotted" w:sz="4" w:space="0" w:color="auto"/>
+              <w:right w:val="single" w:sz="4" w:space="0" w:color="auto"/>
+            </w:tcBorders>
+          </w:tcPr>
+          <w:p>
+            <w:pPr>
+              <w:pStyle w:val="Chutrongbang"/>
+            </w:pPr>
+            <w:r>
+              <w:t>{{ i1max }}</w:t>
+            </w:r>
+          </w:p>
+        </w:tc>
+        <w:tc>
+          <w:tcPr>
+            <w:tcW w:w="988" w:type="dxa"/>
+            <w:tcBorders>
+              <w:top w:val="single" w:sz="4" w:space="0" w:color="auto"/>
+              <w:left w:val="nil"/>
+              <w:bottom w:val="dotted" w:sz="4" w:space="0" w:color="auto"/>
+              <w:right w:val="single" w:sz="4" w:space="0" w:color="auto"/>
+            </w:tcBorders>
+          </w:tcPr>
+          <w:p>
+            <w:pPr>
+              <w:pStyle w:val="Chutrongbang"/>
+            </w:pPr>
+            <w:r>
+              <w:t>{{ i1min }}</w:t>
+            </w:r>
+          </w:p>
+        </w:tc>
+        <w:tc>
+          <w:tcPr>
+            <w:tcW w:w="1057" w:type="dxa"/>
+            <w:tcBorders>
+              <w:top w:val="single" w:sz="4" w:space="0" w:color="auto"/>
+              <w:left w:val="nil"/>
+              <w:bottom w:val="dotted" w:sz="4" w:space="0" w:color="auto"/>
+              <w:right w:val="single" w:sz="4" w:space="0" w:color="auto"/>
+            </w:tcBorders>
+          </w:tcPr>
+          <w:p>
+            <w:pPr>
+              <w:pStyle w:val="Chutrongbang"/>
+            </w:pPr>
+            <w:r>
+              <w:t>{{ i1avg }}</w:t>
+            </w:r>
+          </w:p>
+        </w:tc>
+        <w:tc>
+          <w:tcPr>
+            <w:tcW w:w="2145" w:type="dxa"/>
+            <w:vMerge w:val="restart"/>
+            <w:vAlign w:val="center"/>
+          </w:tcPr>
+          <w:p>
+            <w:pPr>
+              <w:pStyle w:val="Chutrongbang"/>
+            </w:pPr>
+          </w:p>
+        </w:tc>
+        <w:tc>
+          <w:tcPr>
+            <w:tcW w:w="1123" w:type="dxa"/>
+            <w:vMerge w:val="restart"/>
+            <w:tcBorders>
+              <w:right w:val="double" w:sz="4" w:space="0" w:color="auto"/>
+            </w:tcBorders>
+            <w:vAlign w:val="center"/>
+          </w:tcPr>
+          <w:p>
+            <w:pPr>
+              <w:pStyle w:val="Chutrongbang"/>
+            </w:pPr>
+          </w:p>
+        </w:tc>
+      </w:tr>
+      <w:tr>
+        <w:trPr>
+          <w:trHeight w:val="340"/>
+          <w:jc w:val="center"/>
+        </w:trPr>
+        <w:tc>
+          <w:tcPr>
+            <w:tcW w:w="538" w:type="dxa"/>
+            <w:vMerge/>
+            <w:tcBorders>
+              <w:left w:val="double" w:sz="4" w:space="0" w:color="auto"/>
+            </w:tcBorders>
+            <w:vAlign w:val="center"/>
+          </w:tcPr>
+          <w:p>
+            <w:pPr>
+              <w:pStyle w:val="Chutrongbang"/>
+            </w:pPr>
+          </w:p>
+        </w:tc>
+        <w:tc>
+          <w:tcPr>
+            <w:tcW w:w="1574" w:type="dxa"/>
+            <w:vMerge/>
+            <w:vAlign w:val="center"/>
+          </w:tcPr>
+          <w:p>
+            <w:pPr>
+              <w:pStyle w:val="Chutrongbang"/>
+            </w:pPr>
+          </w:p>
+        </w:tc>
+        <w:tc>
+          <w:tcPr>
+            <w:tcW w:w="1279" w:type="dxa"/>
+            <w:tcBorders>
+              <w:top w:val="dotted" w:sz="4" w:space="0" w:color="auto"/>
+              <w:bottom w:val="dotted" w:sz="4" w:space="0" w:color="auto"/>
+            </w:tcBorders>
+            <w:vAlign w:val="center"/>
+          </w:tcPr>
+          <w:p>
+            <w:pPr>
+              <w:pStyle w:val="Chutrongbang"/>
+            </w:pPr>
+            <w:r>
+              <w:t>I</w:t>
+            </w:r>
+            <w:r>
+              <w:rPr>
+                <w:vertAlign w:val="subscript"/>
+              </w:rPr>
+              <w:t xml:space="preserve">2 </w:t>
+            </w:r>
+            <w:r>
+              <w:t>(A)</w:t>
+            </w:r>
+          </w:p>
+        </w:tc>
+        <w:tc>
+          <w:tcPr>
+            <w:tcW w:w="941" w:type="dxa"/>
+            <w:tcBorders>
+              <w:top w:val="dotted" w:sz="4" w:space="0" w:color="auto"/>
+              <w:left w:val="single" w:sz="4" w:space="0" w:color="auto"/>
+              <w:bottom w:val="dotted" w:sz="4" w:space="0" w:color="auto"/>
+              <w:right w:val="single" w:sz="4" w:space="0" w:color="auto"/>
+            </w:tcBorders>
+          </w:tcPr>
+          <w:p>
+            <w:pPr>
+              <w:pStyle w:val="Chutrongbang"/>
+            </w:pPr>
+            <w:r>
+              <w:t>{{ i2max }}</w:t>
+            </w:r>
+          </w:p>
+        </w:tc>
+        <w:tc>
+          <w:tcPr>
+            <w:tcW w:w="988" w:type="dxa"/>
+            <w:tcBorders>
+              <w:top w:val="dotted" w:sz="4" w:space="0" w:color="auto"/>
+              <w:left w:val="nil"/>
+              <w:bottom w:val="dotted" w:sz="4" w:space="0" w:color="auto"/>
+              <w:right w:val="single" w:sz="4" w:space="0" w:color="auto"/>
+            </w:tcBorders>
+          </w:tcPr>
+          <w:p>
+            <w:pPr>
+              <w:pStyle w:val="Chutrongbang"/>
+            </w:pPr>
+            <w:r>
+              <w:t>{{ i2min }}</w:t>
+            </w:r>
+          </w:p>
+        </w:tc>
+        <w:tc>
+          <w:tcPr>
+            <w:tcW w:w="1057" w:type="dxa"/>
+            <w:tcBorders>
+              <w:top w:val="dotted" w:sz="4" w:space="0" w:color="auto"/>
+              <w:left w:val="nil"/>
+              <w:bottom w:val="dotted" w:sz="4" w:space="0" w:color="auto"/>
+              <w:right w:val="single" w:sz="4" w:space="0" w:color="auto"/>
+            </w:tcBorders>
+          </w:tcPr>
+          <w:p>
+            <w:pPr>
+              <w:pStyle w:val="Chutrongbang"/>
+            </w:pPr>
+            <w:r>
+              <w:t>{{ i2avg }}</w:t>
+            </w:r>
+          </w:p>
+        </w:tc>
+        <w:tc>
+          <w:tcPr>
+            <w:tcW w:w="2145" w:type="dxa"/>
+            <w:vMerge/>
+            <w:vAlign w:val="center"/>
+          </w:tcPr>
+          <w:p>
+            <w:pPr>
+              <w:pStyle w:val="Chutrongbang"/>
+            </w:pPr>
+          </w:p>
+        </w:tc>
+        <w:tc>
+          <w:tcPr>
+            <w:tcW w:w="1123" w:type="dxa"/>
+            <w:vMerge/>
+            <w:tcBorders>
+              <w:right w:val="double" w:sz="4" w:space="0" w:color="auto"/>
+            </w:tcBorders>
+            <w:vAlign w:val="center"/>
+          </w:tcPr>
+          <w:p>
+            <w:pPr>
+              <w:pStyle w:val="Chutrongbang"/>
+            </w:pPr>
+          </w:p>
+        </w:tc>
+      </w:tr>
+      <w:tr>
+        <w:trPr>
+          <w:trHeight w:val="340"/>
+          <w:jc w:val="center"/>
+        </w:trPr>
+        <w:tc>
+          <w:tcPr>
+            <w:tcW w:w="538" w:type="dxa"/>
+            <w:vMerge/>
+            <w:tcBorders>
+              <w:left w:val="double" w:sz="4" w:space="0" w:color="auto"/>
+            </w:tcBorders>
+            <w:vAlign w:val="center"/>
+          </w:tcPr>
+          <w:p>
+            <w:pPr>
+              <w:pStyle w:val="Chutrongbang"/>
+            </w:pPr>
+          </w:p>
+        </w:tc>
+        <w:tc>
+          <w:tcPr>
+            <w:tcW w:w="1574" w:type="dxa"/>
+            <w:vMerge/>
+            <w:vAlign w:val="center"/>
+          </w:tcPr>
+          <w:p>
+            <w:pPr>
+              <w:pStyle w:val="Chutrongbang"/>
+            </w:pPr>
+          </w:p>
+        </w:tc>
+        <w:tc>
+          <w:tcPr>
+            <w:tcW w:w="1279" w:type="dxa"/>
+            <w:tcBorders>
+              <w:top w:val="dotted" w:sz="4" w:space="0" w:color="auto"/>
+              <w:bottom w:val="single" w:sz="4" w:space="0" w:color="auto"/>
+            </w:tcBorders>
+            <w:vAlign w:val="center"/>
+          </w:tcPr>
+          <w:p>
+            <w:pPr>
+              <w:pStyle w:val="Chutrongbang"/>
+            </w:pPr>
+            <w:r>
+              <w:t>I</w:t>
+            </w:r>
+            <w:r>
+              <w:rPr>
+                <w:vertAlign w:val="subscript"/>
+              </w:rPr>
+              <w:t>3</w:t>
+            </w:r>
+            <w:r>
+              <w:t xml:space="preserve"> (A)</w:t>
+            </w:r>
+          </w:p>
+        </w:tc>
+        <w:tc>
+          <w:tcPr>
+            <w:tcW w:w="941" w:type="dxa"/>
+            <w:tcBorders>
+              <w:top w:val="dotted" w:sz="4" w:space="0" w:color="auto"/>
+              <w:left w:val="single" w:sz="4" w:space="0" w:color="auto"/>
+              <w:bottom w:val="single" w:sz="4" w:space="0" w:color="auto"/>
+              <w:right w:val="single" w:sz="4" w:space="0" w:color="auto"/>
+            </w:tcBorders>
+          </w:tcPr>
+          <w:p>
+            <w:pPr>
+              <w:pStyle w:val="Chutrongbang"/>
+            </w:pPr>
+            <w:r>
+              <w:t>{{ i3max }}</w:t>
+            </w:r>
+          </w:p>
+        </w:tc>
+        <w:tc>
+          <w:tcPr>
+            <w:tcW w:w="988" w:type="dxa"/>
+            <w:tcBorders>
+              <w:top w:val="dotted" w:sz="4" w:space="0" w:color="auto"/>
+              <w:left w:val="nil"/>
+              <w:bottom w:val="single" w:sz="4" w:space="0" w:color="auto"/>
+              <w:right w:val="single" w:sz="4" w:space="0" w:color="auto"/>
+            </w:tcBorders>
+          </w:tcPr>
+          <w:p>
+            <w:pPr>
+              <w:pStyle w:val="Chutrongbang"/>
+            </w:pPr>
+            <w:r>
+              <w:t>{{ i3min }}</w:t>
+            </w:r>
+          </w:p>
+        </w:tc>
+        <w:tc>
+          <w:tcPr>
+            <w:tcW w:w="1057" w:type="dxa"/>
+            <w:tcBorders>
+              <w:top w:val="dotted" w:sz="4" w:space="0" w:color="auto"/>
+              <w:left w:val="nil"/>
+              <w:bottom w:val="single" w:sz="4" w:space="0" w:color="auto"/>
+              <w:right w:val="single" w:sz="4" w:space="0" w:color="auto"/>
+            </w:tcBorders>
+          </w:tcPr>
+          <w:p>
+            <w:pPr>
+              <w:pStyle w:val="Chutrongbang"/>
+            </w:pPr>
+            <w:r>
+              <w:t>{{ i3avg }}</w:t>
+            </w:r>
+          </w:p>
+        </w:tc>
+        <w:tc>
+          <w:tcPr>
+            <w:tcW w:w="2145" w:type="dxa"/>
+            <w:vMerge/>
+            <w:vAlign w:val="center"/>
+          </w:tcPr>
+          <w:p>
+            <w:pPr>
+              <w:pStyle w:val="Chutrongbang"/>
+            </w:pPr>
+          </w:p>
+        </w:tc>
+        <w:tc>
+          <w:tcPr>
+            <w:tcW w:w="1123" w:type="dxa"/>
+            <w:vMerge/>
+            <w:tcBorders>
+              <w:right w:val="double" w:sz="4" w:space="0" w:color="auto"/>
+            </w:tcBorders>
+            <w:vAlign w:val="center"/>
+          </w:tcPr>
+          <w:p>
+            <w:pPr>
+              <w:pStyle w:val="Chutrongbang"/>
+            </w:pPr>
+          </w:p>
+        </w:tc>
+      </w:tr>
+      <w:tr>
+        <w:trPr>
+          <w:trHeight w:val="340"/>
+          <w:jc w:val="center"/>
+        </w:trPr>
+        <w:tc>
+          <w:tcPr>
+            <w:tcW w:w="538" w:type="dxa"/>
+            <w:vMerge w:val="restart"/>
+            <w:tcBorders>
+              <w:left w:val="double" w:sz="4" w:space="0" w:color="auto"/>
+            </w:tcBorders>
+            <w:vAlign w:val="center"/>
+          </w:tcPr>
+          <w:p>
+            <w:pPr>
+              <w:pStyle w:val="Chutrongbang"/>
+            </w:pPr>
+            <w:r>
+              <w:t>3</w:t>
+            </w:r>
+          </w:p>
+        </w:tc>
+        <w:tc>
+          <w:tcPr>
+            <w:tcW w:w="1574" w:type="dxa"/>
+            <w:vMerge w:val="restart"/>
+            <w:vAlign w:val="center"/>
+          </w:tcPr>
+          <w:p>
+            <w:pPr>
+              <w:pStyle w:val="Chutrongbang"/>
+            </w:pPr>
+            <w:r>
+              <w:t>Độ lệch pha</w:t>
+            </w:r>
+          </w:p>
+        </w:tc>
+        <w:tc>
+          <w:tcPr>
+            <w:tcW w:w="1279" w:type="dxa"/>
+            <w:tcBorders>
+              <w:bottom w:val="dotted" w:sz="4" w:space="0" w:color="auto"/>
+            </w:tcBorders>
+            <w:vAlign w:val="center"/>
+          </w:tcPr>
+          <w:p>
+            <w:pPr>
+              <w:pStyle w:val="Chutrongbang"/>
+            </w:pPr>
+            <w:r>
+              <w:t>ΔU (%)</w:t>
+            </w:r>
+          </w:p>
+        </w:tc>
+        <w:tc>
+          <w:tcPr>
+            <w:tcW w:w="941" w:type="dxa"/>
+            <w:tcBorders>
+              <w:top w:val="single" w:sz="4" w:space="0" w:color="auto"/>
+              <w:left w:val="single" w:sz="4" w:space="0" w:color="auto"/>
+              <w:bottom w:val="dotted" w:sz="4" w:space="0" w:color="auto"/>
+              <w:right w:val="single" w:sz="4" w:space="0" w:color="auto"/>
+            </w:tcBorders>
+          </w:tcPr>
+          <w:p>
+            <w:pPr>
+              <w:pStyle w:val="Chutrongbang"/>
+            </w:pPr>
+            <w:r>
+              <w:t>{{ dumax }}</w:t>
+            </w:r>
+          </w:p>
+        </w:tc>
+        <w:tc>
+          <w:tcPr>
+            <w:tcW w:w="988" w:type="dxa"/>
+            <w:tcBorders>
+              <w:top w:val="single" w:sz="4" w:space="0" w:color="auto"/>
+              <w:left w:val="nil"/>
+              <w:bottom w:val="dotted" w:sz="4" w:space="0" w:color="auto"/>
+              <w:right w:val="single" w:sz="4" w:space="0" w:color="auto"/>
+            </w:tcBorders>
+          </w:tcPr>
+          <w:p>
+            <w:pPr>
+              <w:pStyle w:val="Chutrongbang"/>
+            </w:pPr>
+            <w:r>
+              <w:t>{{ dumin }}</w:t>
+            </w:r>
+          </w:p>
+        </w:tc>
+        <w:tc>
+          <w:tcPr>
+            <w:tcW w:w="1057" w:type="dxa"/>
+            <w:tcBorders>
+              <w:top w:val="single" w:sz="4" w:space="0" w:color="auto"/>
+              <w:left w:val="nil"/>
+              <w:bottom w:val="dotted" w:sz="4" w:space="0" w:color="auto"/>
+              <w:right w:val="single" w:sz="4" w:space="0" w:color="auto"/>
+            </w:tcBorders>
+          </w:tcPr>
+          <w:p>
+            <w:pPr>
+              <w:pStyle w:val="Chutrongbang"/>
+            </w:pPr>
+            <w:r>
+              <w:t>{{ duavg }}</w:t>
+            </w:r>
+          </w:p>
+        </w:tc>
+        <w:tc>
+          <w:tcPr>
+            <w:tcW w:w="2145" w:type="dxa"/>
+            <w:tcBorders>
+              <w:bottom w:val="dotted" w:sz="4" w:space="0" w:color="auto"/>
+            </w:tcBorders>
+            <w:vAlign w:val="center"/>
+          </w:tcPr>
+          <w:p>
+            <w:pPr>
+              <w:pStyle w:val="Chutrongbang"/>
+            </w:pPr>
+            <w:r>
+              <w:t>&lt;5%</w:t>
+            </w:r>
+          </w:p>
+        </w:tc>
+        <w:tc>
+          <w:tcPr>
+            <w:tcW w:w="1123" w:type="dxa"/>
+            <w:tcBorders>
+              <w:bottom w:val="dotted" w:sz="4" w:space="0" w:color="auto"/>
+              <w:right w:val="double" w:sz="4" w:space="0" w:color="auto"/>
+            </w:tcBorders>
+            <w:vAlign w:val="center"/>
+          </w:tcPr>
+          <w:p>
+            <w:pPr>
+              <w:pStyle w:val="Chutrongbang"/>
+            </w:pPr>
+            <w:r>
+              <w:t>{{ dueval }}</w:t>
+            </w:r>
+          </w:p>
+        </w:tc>
+      </w:tr>
+      <w:tr>
+        <w:trPr>
+          <w:trHeight w:val="340"/>
+          <w:jc w:val="center"/>
+        </w:trPr>
+        <w:tc>
+          <w:tcPr>
+            <w:tcW w:w="538" w:type="dxa"/>
+            <w:vMerge/>
+            <w:tcBorders>
+              <w:left w:val="double" w:sz="4" w:space="0" w:color="auto"/>
+            </w:tcBorders>
+            <w:vAlign w:val="center"/>
+          </w:tcPr>
+          <w:p>
+            <w:pPr>
+              <w:pStyle w:val="Chutrongbang"/>
+            </w:pPr>
+          </w:p>
+        </w:tc>
+        <w:tc>
+          <w:tcPr>
+            <w:tcW w:w="1574" w:type="dxa"/>
+            <w:vMerge/>
+            <w:vAlign w:val="center"/>
+          </w:tcPr>
+          <w:p>
+            <w:pPr>
+              <w:pStyle w:val="Chutrongbang"/>
+            </w:pPr>
+          </w:p>
+        </w:tc>
+        <w:tc>
+          <w:tcPr>
+            <w:tcW w:w="1279" w:type="dxa"/>
+            <w:tcBorders>
+              <w:top w:val="dotted" w:sz="4" w:space="0" w:color="auto"/>
+            </w:tcBorders>
+            <w:vAlign w:val="center"/>
+          </w:tcPr>
+          <w:p>
+            <w:pPr>
+              <w:pStyle w:val="Chutrongbang"/>
+            </w:pPr>
+            <w:r>
+              <w:t>ΔI (%)</w:t>
+            </w:r>
+          </w:p>
+        </w:tc>
+        <w:tc>
+          <w:tcPr>
+            <w:tcW w:w="941" w:type="dxa"/>
+            <w:tcBorders>
+              <w:top w:val="dotted" w:sz="4" w:space="0" w:color="auto"/>
+              <w:left w:val="single" w:sz="4" w:space="0" w:color="auto"/>
+              <w:bottom w:val="single" w:sz="4" w:space="0" w:color="auto"/>
+              <w:right w:val="single" w:sz="4" w:space="0" w:color="auto"/>
+            </w:tcBorders>
+          </w:tcPr>
+          <w:p>
+            <w:pPr>
+              <w:pStyle w:val="Chutrongbang"/>
+            </w:pPr>
+            <w:r>
+              <w:t>{{ dimax }}</w:t>
+            </w:r>
+          </w:p>
+        </w:tc>
+        <w:tc>
+          <w:tcPr>
+            <w:tcW w:w="988" w:type="dxa"/>
+            <w:tcBorders>
+              <w:top w:val="dotted" w:sz="4" w:space="0" w:color="auto"/>
+              <w:left w:val="nil"/>
+              <w:bottom w:val="single" w:sz="4" w:space="0" w:color="auto"/>
+              <w:right w:val="single" w:sz="4" w:space="0" w:color="auto"/>
+            </w:tcBorders>
+          </w:tcPr>
+          <w:p>
+            <w:pPr>
+              <w:pStyle w:val="Chutrongbang"/>
+            </w:pPr>
+            <w:r>
+              <w:t>{{ dimin }}</w:t>
+            </w:r>
+          </w:p>
+        </w:tc>
+        <w:tc>
+          <w:tcPr>
+            <w:tcW w:w="1057" w:type="dxa"/>
+            <w:tcBorders>
+              <w:top w:val="dotted" w:sz="4" w:space="0" w:color="auto"/>
+              <w:left w:val="nil"/>
+              <w:bottom w:val="single" w:sz="4" w:space="0" w:color="auto"/>
+              <w:right w:val="single" w:sz="4" w:space="0" w:color="auto"/>
+            </w:tcBorders>
+          </w:tcPr>
+          <w:p>
+            <w:pPr>
+              <w:pStyle w:val="Chutrongbang"/>
+            </w:pPr>
+            <w:r>
+              <w:t>{{ diavg }}</w:t>
+            </w:r>
+          </w:p>
+        </w:tc>
+        <w:tc>
+          <w:tcPr>
+            <w:tcW w:w="2145" w:type="dxa"/>
+            <w:tcBorders>
+              <w:top w:val="dotted" w:sz="4" w:space="0" w:color="auto"/>
+            </w:tcBorders>
+            <w:vAlign w:val="center"/>
+          </w:tcPr>
+          <w:p>
+            <w:pPr>
+              <w:pStyle w:val="Chutrongbang"/>
+            </w:pPr>
+            <w:r>
+              <w:t>không quy định, khuyến cáo nên dưới 10%</w:t>
+            </w:r>
+          </w:p>
+        </w:tc>
+        <w:tc>
+          <w:tcPr>
+            <w:tcW w:w="1123" w:type="dxa"/>
+            <w:tcBorders>
+              <w:top w:val="dotted" w:sz="4" w:space="0" w:color="auto"/>
+              <w:right w:val="double" w:sz="4" w:space="0" w:color="auto"/>
+            </w:tcBorders>
+            <w:vAlign w:val="center"/>
+          </w:tcPr>
+          <w:p>
+            <w:pPr>
+              <w:pStyle w:val="Chutrongbang"/>
+            </w:pPr>
+          </w:p>
+        </w:tc>
+      </w:tr>
+      <w:tr>
+        <w:trPr>
+          <w:trHeight w:val="340"/>
+          <w:jc w:val="center"/>
+        </w:trPr>
+        <w:tc>
+          <w:tcPr>
+            <w:tcW w:w="538" w:type="dxa"/>
+            <w:tcBorders>
+              <w:left w:val="double" w:sz="4" w:space="0" w:color="auto"/>
+            </w:tcBorders>
+            <w:vAlign w:val="center"/>
+          </w:tcPr>
+          <w:p>
+            <w:pPr>
+              <w:pStyle w:val="Chutrongbang"/>
+            </w:pPr>
+            <w:r>
+              <w:t>4</w:t>
+            </w:r>
+          </w:p>
+        </w:tc>
+        <w:tc>
+          <w:tcPr>
+            <w:tcW w:w="1574" w:type="dxa"/>
+            <w:vAlign w:val="center"/>
+          </w:tcPr>
+          <w:p>
+            <w:pPr>
+              <w:pStyle w:val="Chutrongbang"/>
+            </w:pPr>
+            <w:r>
+              <w:t>Hệ số công suất</w:t>
+            </w:r>
+          </w:p>
+        </w:tc>
+        <w:tc>
+          <w:tcPr>
+            <w:tcW w:w="1279" w:type="dxa"/>
+            <w:tcBorders>
+              <w:bottom w:val="single" w:sz="4" w:space="0" w:color="auto"/>
+            </w:tcBorders>
+            <w:vAlign w:val="center"/>
+          </w:tcPr>
+          <w:p>
+            <w:pPr>
+              <w:pStyle w:val="Chutrongbang"/>
+            </w:pPr>
+            <w:r>
+              <w:t>PF</w:t>
+            </w:r>
+          </w:p>
+        </w:tc>
+        <w:tc>
+          <w:tcPr>
+            <w:tcW w:w="941" w:type="dxa"/>
+            <w:tcBorders>
+              <w:top w:val="single" w:sz="4" w:space="0" w:color="auto"/>
+              <w:left w:val="single" w:sz="4" w:space="0" w:color="auto"/>
+              <w:bottom w:val="single" w:sz="4" w:space="0" w:color="auto"/>
+              <w:right w:val="single" w:sz="4" w:space="0" w:color="auto"/>
+            </w:tcBorders>
+          </w:tcPr>
+          <w:p>
+            <w:pPr>
+              <w:pStyle w:val="Chutrongbang"/>
+            </w:pPr>
+            <w:r>
+              <w:t>{{ pfmax }}</w:t>
+            </w:r>
+          </w:p>
+        </w:tc>
+        <w:tc>
+          <w:tcPr>
+            <w:tcW w:w="988" w:type="dxa"/>
+            <w:tcBorders>
+              <w:top w:val="single" w:sz="4" w:space="0" w:color="auto"/>
+              <w:left w:val="nil"/>
+              <w:bottom w:val="single" w:sz="4" w:space="0" w:color="auto"/>
+              <w:right w:val="single" w:sz="4" w:space="0" w:color="auto"/>
+            </w:tcBorders>
+          </w:tcPr>
+          <w:p>
+            <w:pPr>
+              <w:pStyle w:val="Chutrongbang"/>
+            </w:pPr>
+            <w:r>
+              <w:t>{{ pfmin }}</w:t>
+            </w:r>
+          </w:p>
+        </w:tc>
+        <w:tc>
+          <w:tcPr>
+            <w:tcW w:w="1057" w:type="dxa"/>
+            <w:tcBorders>
+              <w:top w:val="single" w:sz="4" w:space="0" w:color="auto"/>
+              <w:left w:val="nil"/>
+              <w:bottom w:val="single" w:sz="4" w:space="0" w:color="auto"/>
+              <w:right w:val="single" w:sz="4" w:space="0" w:color="auto"/>
+            </w:tcBorders>
+          </w:tcPr>
+          <w:p>
+            <w:pPr>
+              <w:pStyle w:val="Chutrongbang"/>
+            </w:pPr>
+            <w:r>
+              <w:t>{{ pfavg }}</w:t>
+            </w:r>
+          </w:p>
+        </w:tc>
+        <w:tc>
+          <w:tcPr>
+            <w:tcW w:w="2145" w:type="dxa"/>
+            <w:vAlign w:val="center"/>
+          </w:tcPr>
+          <w:p>
+            <w:pPr>
+              <w:pStyle w:val="Chutrongbang"/>
+            </w:pPr>
+            <w:r>
+              <w:t>&gt; 0,9</w:t>
+            </w:r>
+          </w:p>
+        </w:tc>
+        <w:tc>
+          <w:tcPr>
+            <w:tcW w:w="1123" w:type="dxa"/>
+            <w:tcBorders>
+              <w:right w:val="double" w:sz="4" w:space="0" w:color="auto"/>
+            </w:tcBorders>
+            <w:vAlign w:val="center"/>
+          </w:tcPr>
+          <w:p>
+            <w:pPr>
+              <w:pStyle w:val="Chutrongbang"/>
+              <w:rPr>
+                <w:lang w:val="en-US"/>
+              </w:rPr>
+            </w:pPr>
+            <w:r>
+              <w:rPr>
+                <w:lang w:val="en-US"/>
+              </w:rPr>
+              <w:t xml:space="preserve">{{ </w:t>
+            </w:r>
+            <w:proofErr w:type="spellStart"/>
+            <w:r>
+              <w:rPr>
+                <w:lang w:val="en-US"/>
+              </w:rPr>
+              <w:t>pfeval</w:t>
+            </w:r>
+            <w:proofErr w:type="spellEnd"/>
+            <w:r>
+              <w:rPr>
+                <w:lang w:val="en-US"/>
+              </w:rPr>
+              <w:t xml:space="preserve"> }}</w:t>
+            </w:r>
+          </w:p>
+        </w:tc>
+      </w:tr>
+      <w:tr>
+        <w:trPr>
+          <w:trHeight w:val="340"/>
+          <w:jc w:val="center"/>
+        </w:trPr>
+        <w:tc>
+          <w:tcPr>
+            <w:tcW w:w="538" w:type="dxa"/>
+            <w:vMerge w:val="restart"/>
+            <w:tcBorders>
+              <w:left w:val="double" w:sz="4" w:space="0" w:color="auto"/>
+            </w:tcBorders>
+            <w:vAlign w:val="center"/>
+          </w:tcPr>
+          <w:p>
+            <w:pPr>
+              <w:pStyle w:val="Chutrongbang"/>
+            </w:pPr>
+            <w:r>
+              <w:t>5</w:t>
+            </w:r>
+          </w:p>
+        </w:tc>
+        <w:tc>
+          <w:tcPr>
+            <w:tcW w:w="1574" w:type="dxa"/>
+            <w:vMerge w:val="restart"/>
+            <w:vAlign w:val="center"/>
+          </w:tcPr>
+          <w:p>
+            <w:pPr>
+              <w:pStyle w:val="Chutrongbang"/>
+            </w:pPr>
+            <w:r>
+              <w:t>Công suất</w:t>
+            </w:r>
+          </w:p>
+        </w:tc>
+        <w:tc>
+          <w:tcPr>
+            <w:tcW w:w="1279" w:type="dxa"/>
+            <w:tcBorders>
+              <w:bottom w:val="dotted" w:sz="4" w:space="0" w:color="auto"/>
+            </w:tcBorders>
+            <w:vAlign w:val="center"/>
+          </w:tcPr>
+          <w:p>
+            <w:pPr>
+              <w:pStyle w:val="Chutrongbang"/>
+            </w:pPr>
+            <w:r>
+              <w:t>P (kW)</w:t>
+            </w:r>
+          </w:p>
+        </w:tc>
+        <w:tc>
+          <w:tcPr>
+            <w:tcW w:w="941" w:type="dxa"/>
+            <w:tcBorders>
+              <w:top w:val="single" w:sz="4" w:space="0" w:color="auto"/>
+              <w:left w:val="single" w:sz="4" w:space="0" w:color="auto"/>
+              <w:bottom w:val="dotted" w:sz="4" w:space="0" w:color="auto"/>
+              <w:right w:val="single" w:sz="4" w:space="0" w:color="auto"/>
+            </w:tcBorders>
+          </w:tcPr>
+          <w:p>
+            <w:pPr>
+              <w:pStyle w:val="Chutrongbang"/>
+            </w:pPr>
+            <w:r>
+              <w:t>{{ pmax }}</w:t>
+            </w:r>
+          </w:p>
+        </w:tc>
+        <w:tc>
+          <w:tcPr>
+            <w:tcW w:w="988" w:type="dxa"/>
+            <w:tcBorders>
+              <w:top w:val="single" w:sz="4" w:space="0" w:color="auto"/>
+              <w:left w:val="nil"/>
+              <w:bottom w:val="dotted" w:sz="4" w:space="0" w:color="auto"/>
+              <w:right w:val="single" w:sz="4" w:space="0" w:color="auto"/>
+            </w:tcBorders>
+          </w:tcPr>
+          <w:p>
+            <w:pPr>
+              <w:pStyle w:val="Chutrongbang"/>
+            </w:pPr>
+            <w:r>
+              <w:t>{{ pmin }}</w:t>
+            </w:r>
+          </w:p>
+        </w:tc>
+        <w:tc>
+          <w:tcPr>
+            <w:tcW w:w="1057" w:type="dxa"/>
+            <w:tcBorders>
+              <w:top w:val="single" w:sz="4" w:space="0" w:color="auto"/>
+              <w:left w:val="nil"/>
+              <w:bottom w:val="dotted" w:sz="4" w:space="0" w:color="auto"/>
+              <w:right w:val="single" w:sz="4" w:space="0" w:color="auto"/>
+            </w:tcBorders>
+          </w:tcPr>
+          <w:p>
+            <w:pPr>
+              <w:pStyle w:val="Chutrongbang"/>
+            </w:pPr>
+            <w:r>
+              <w:t>{{ pavg }}</w:t>
+            </w:r>
+          </w:p>
+        </w:tc>
+        <w:tc>
+          <w:tcPr>
+            <w:tcW w:w="2145" w:type="dxa"/>
+            <w:vMerge w:val="restart"/>
+            <w:vAlign w:val="center"/>
+          </w:tcPr>
+          <w:p>
+            <w:pPr>
+              <w:pStyle w:val="Chutrongbang"/>
+            </w:pPr>
+          </w:p>
+        </w:tc>
+        <w:tc>
+          <w:tcPr>
+            <w:tcW w:w="1123" w:type="dxa"/>
+            <w:vMerge w:val="restart"/>
+            <w:tcBorders>
+              <w:right w:val="double" w:sz="4" w:space="0" w:color="auto"/>
+            </w:tcBorders>
+            <w:vAlign w:val="center"/>
+          </w:tcPr>
+          <w:p>
+            <w:pPr>
+              <w:pStyle w:val="Chutrongbang"/>
+            </w:pPr>
+          </w:p>
+        </w:tc>
+      </w:tr>
+      <w:tr>
+        <w:trPr>
+          <w:trHeight w:val="340"/>
+          <w:jc w:val="center"/>
+        </w:trPr>
+        <w:tc>
+          <w:tcPr>
+            <w:tcW w:w="538" w:type="dxa"/>
+            <w:vMerge/>
+            <w:tcBorders>
+              <w:left w:val="double" w:sz="4" w:space="0" w:color="auto"/>
+            </w:tcBorders>
+            <w:vAlign w:val="center"/>
+          </w:tcPr>
+          <w:p>
+            <w:pPr>
+              <w:pStyle w:val="Chutrongbang"/>
+            </w:pPr>
+          </w:p>
+        </w:tc>
+        <w:tc>
+          <w:tcPr>
+            <w:tcW w:w="1574" w:type="dxa"/>
+            <w:vMerge/>
+            <w:vAlign w:val="center"/>
+          </w:tcPr>
+          <w:p>
+            <w:pPr>
+              <w:pStyle w:val="Chutrongbang"/>
+            </w:pPr>
+          </w:p>
+        </w:tc>
+        <w:tc>
+          <w:tcPr>
+            <w:tcW w:w="1279" w:type="dxa"/>
+            <w:tcBorders>
+              <w:top w:val="dotted" w:sz="4" w:space="0" w:color="auto"/>
+              <w:bottom w:val="dotted" w:sz="4" w:space="0" w:color="auto"/>
+            </w:tcBorders>
+            <w:vAlign w:val="center"/>
+          </w:tcPr>
+          <w:p>
+            <w:pPr>
+              <w:pStyle w:val="Chutrongbang"/>
+            </w:pPr>
+            <w:r>
+              <w:t>Q (kVAR)</w:t>
+            </w:r>
+          </w:p>
+        </w:tc>
+        <w:tc>
+          <w:tcPr>
+            <w:tcW w:w="941" w:type="dxa"/>
+            <w:tcBorders>
+              <w:top w:val="dotted" w:sz="4" w:space="0" w:color="auto"/>
+              <w:left w:val="single" w:sz="4" w:space="0" w:color="auto"/>
+              <w:bottom w:val="dotted" w:sz="4" w:space="0" w:color="auto"/>
+              <w:right w:val="single" w:sz="4" w:space="0" w:color="auto"/>
+            </w:tcBorders>
+          </w:tcPr>
+          <w:p>
+            <w:pPr>
+              <w:pStyle w:val="Chutrongbang"/>
+            </w:pPr>
+            <w:r>
+              <w:t>{{ qmax }}</w:t>
+            </w:r>
+          </w:p>
+        </w:tc>
+        <w:tc>
+          <w:tcPr>
+            <w:tcW w:w="988" w:type="dxa"/>
+            <w:tcBorders>
+              <w:top w:val="dotted" w:sz="4" w:space="0" w:color="auto"/>
+              <w:left w:val="nil"/>
+              <w:bottom w:val="dotted" w:sz="4" w:space="0" w:color="auto"/>
+              <w:right w:val="single" w:sz="4" w:space="0" w:color="auto"/>
+            </w:tcBorders>
+          </w:tcPr>
+          <w:p>
+            <w:pPr>
+              <w:pStyle w:val="Chutrongbang"/>
+            </w:pPr>
+            <w:r>
+              <w:t>{{ qmin }}</w:t>
+            </w:r>
+          </w:p>
+        </w:tc>
+        <w:tc>
+          <w:tcPr>
+            <w:tcW w:w="1057" w:type="dxa"/>
+            <w:tcBorders>
+              <w:top w:val="dotted" w:sz="4" w:space="0" w:color="auto"/>
+              <w:left w:val="nil"/>
+              <w:bottom w:val="dotted" w:sz="4" w:space="0" w:color="auto"/>
+              <w:right w:val="single" w:sz="4" w:space="0" w:color="auto"/>
+            </w:tcBorders>
+          </w:tcPr>
+          <w:p>
+            <w:pPr>
+              <w:pStyle w:val="Chutrongbang"/>
+            </w:pPr>
+            <w:r>
+              <w:t>{{ qavg }}</w:t>
+            </w:r>
+          </w:p>
+        </w:tc>
+        <w:tc>
+          <w:tcPr>
+            <w:tcW w:w="2145" w:type="dxa"/>
+            <w:vMerge/>
+            <w:vAlign w:val="center"/>
+          </w:tcPr>
+          <w:p>
+            <w:pPr>
+              <w:pStyle w:val="Chutrongbang"/>
+            </w:pPr>
+          </w:p>
+        </w:tc>
+        <w:tc>
+          <w:tcPr>
+            <w:tcW w:w="1123" w:type="dxa"/>
+            <w:vMerge/>
+            <w:tcBorders>
+              <w:right w:val="double" w:sz="4" w:space="0" w:color="auto"/>
+            </w:tcBorders>
+            <w:vAlign w:val="center"/>
+          </w:tcPr>
+          <w:p>
+            <w:pPr>
+              <w:pStyle w:val="Chutrongbang"/>
+            </w:pPr>
+          </w:p>
+        </w:tc>
+      </w:tr>
+      <w:tr>
+        <w:trPr>
+          <w:trHeight w:val="340"/>
+          <w:jc w:val="center"/>
+        </w:trPr>
+        <w:tc>
+          <w:tcPr>
+            <w:tcW w:w="538" w:type="dxa"/>
+            <w:vMerge/>
+            <w:tcBorders>
+              <w:left w:val="double" w:sz="4" w:space="0" w:color="auto"/>
+            </w:tcBorders>
+            <w:vAlign w:val="center"/>
+          </w:tcPr>
+          <w:p>
+            <w:pPr>
+              <w:pStyle w:val="Chutrongbang"/>
+            </w:pPr>
+          </w:p>
+        </w:tc>
+        <w:tc>
+          <w:tcPr>
+            <w:tcW w:w="1574" w:type="dxa"/>
+            <w:vMerge/>
+            <w:vAlign w:val="center"/>
+          </w:tcPr>
+          <w:p>
+            <w:pPr>
+              <w:pStyle w:val="Chutrongbang"/>
+            </w:pPr>
+          </w:p>
+        </w:tc>
+        <w:tc>
+          <w:tcPr>
+            <w:tcW w:w="1279" w:type="dxa"/>
+            <w:tcBorders>
+              <w:top w:val="dotted" w:sz="4" w:space="0" w:color="auto"/>
+              <w:bottom w:val="single" w:sz="4" w:space="0" w:color="auto"/>
+            </w:tcBorders>
+            <w:vAlign w:val="center"/>
+          </w:tcPr>
+          <w:p>
+            <w:pPr>
+              <w:pStyle w:val="Chutrongbang"/>
+            </w:pPr>
+            <w:r>
+              <w:t>S (kVA)</w:t>
+            </w:r>
+          </w:p>
+        </w:tc>
+        <w:tc>
+          <w:tcPr>
+            <w:tcW w:w="941" w:type="dxa"/>
+            <w:tcBorders>
+              <w:top w:val="dotted" w:sz="4" w:space="0" w:color="auto"/>
+              <w:left w:val="single" w:sz="4" w:space="0" w:color="auto"/>
+              <w:bottom w:val="single" w:sz="4" w:space="0" w:color="auto"/>
+              <w:right w:val="single" w:sz="4" w:space="0" w:color="auto"/>
+            </w:tcBorders>
+          </w:tcPr>
+          <w:p>
+            <w:pPr>
+              <w:pStyle w:val="Chutrongbang"/>
+            </w:pPr>
+            <w:r>
+              <w:t>{{ smax }}</w:t>
+            </w:r>
+          </w:p>
+        </w:tc>
+        <w:tc>
+          <w:tcPr>
+            <w:tcW w:w="988" w:type="dxa"/>
+            <w:tcBorders>
+              <w:top w:val="dotted" w:sz="4" w:space="0" w:color="auto"/>
+              <w:left w:val="nil"/>
+              <w:bottom w:val="single" w:sz="4" w:space="0" w:color="auto"/>
+              <w:right w:val="single" w:sz="4" w:space="0" w:color="auto"/>
+            </w:tcBorders>
+          </w:tcPr>
+          <w:p>
+            <w:pPr>
+              <w:pStyle w:val="Chutrongbang"/>
+            </w:pPr>
+            <w:r>
+              <w:t>{{ smin }}</w:t>
+            </w:r>
+          </w:p>
+        </w:tc>
+        <w:tc>
+          <w:tcPr>
+            <w:tcW w:w="1057" w:type="dxa"/>
+            <w:tcBorders>
+              <w:top w:val="dotted" w:sz="4" w:space="0" w:color="auto"/>
+              <w:left w:val="nil"/>
+              <w:bottom w:val="single" w:sz="4" w:space="0" w:color="auto"/>
+              <w:right w:val="single" w:sz="4" w:space="0" w:color="auto"/>
+            </w:tcBorders>
+          </w:tcPr>
+          <w:p>
+            <w:pPr>
+              <w:pStyle w:val="Chutrongbang"/>
+            </w:pPr>
+            <w:r>
+              <w:t>{{ savg }}</w:t>
+            </w:r>
+          </w:p>
+        </w:tc>
+        <w:tc>
+          <w:tcPr>
+            <w:tcW w:w="2145" w:type="dxa"/>
+            <w:vMerge/>
+            <w:vAlign w:val="center"/>
+          </w:tcPr>
+          <w:p>
+            <w:pPr>
+              <w:pStyle w:val="Chutrongbang"/>
+            </w:pPr>
+          </w:p>
+        </w:tc>
+        <w:tc>
+          <w:tcPr>
+            <w:tcW w:w="1123" w:type="dxa"/>
+            <w:vMerge/>
+            <w:tcBorders>
+              <w:right w:val="double" w:sz="4" w:space="0" w:color="auto"/>
+            </w:tcBorders>
+            <w:vAlign w:val="center"/>
+          </w:tcPr>
+          <w:p>
+            <w:pPr>
+              <w:pStyle w:val="Chutrongbang"/>
+            </w:pPr>
+          </w:p>
+        </w:tc>
+      </w:tr>
+      <w:tr>
+        <w:trPr>
+          <w:trHeight w:val="340"/>
+          <w:jc w:val="center"/>
+        </w:trPr>
+        <w:tc>
+          <w:tcPr>
+            <w:tcW w:w="538" w:type="dxa"/>
+            <w:vMerge w:val="restart"/>
+            <w:tcBorders>
+              <w:left w:val="double" w:sz="4" w:space="0" w:color="auto"/>
+            </w:tcBorders>
+            <w:vAlign w:val="center"/>
+          </w:tcPr>
+          <w:p>
+            <w:pPr>
+              <w:pStyle w:val="Chutrongbang"/>
+            </w:pPr>
+            <w:r>
+              <w:t>6</w:t>
+            </w:r>
+          </w:p>
+        </w:tc>
+        <w:tc>
+          <w:tcPr>
+            <w:tcW w:w="1574" w:type="dxa"/>
+            <w:vMerge w:val="restart"/>
+            <w:vAlign w:val="center"/>
+          </w:tcPr>
+          <w:p>
+            <w:pPr>
+              <w:pStyle w:val="Chutrongbang"/>
+            </w:pPr>
+            <w:r>
+              <w:t>Tổng biến dạng sóng hài điện áp</w:t>
+            </w:r>
+          </w:p>
+        </w:tc>
+        <w:tc>
+          <w:tcPr>
+            <w:tcW w:w="1279" w:type="dxa"/>
+            <w:tcBorders>
+              <w:bottom w:val="dotted" w:sz="4" w:space="0" w:color="auto"/>
+            </w:tcBorders>
+            <w:vAlign w:val="center"/>
+          </w:tcPr>
+          <w:p>
+            <w:pPr>
+              <w:pStyle w:val="Chutrongbang"/>
+            </w:pPr>
+            <w:r>
+              <w:t>THD</w:t>
+            </w:r>
+            <w:r>
+              <w:rPr>
+                <w:vertAlign w:val="subscript"/>
+              </w:rPr>
+              <w:t>1</w:t>
+            </w:r>
+            <w:r>
+              <w:t xml:space="preserve"> (%)</w:t>
+            </w:r>
+          </w:p>
+        </w:tc>
+        <w:tc>
+          <w:tcPr>
+            <w:tcW w:w="941" w:type="dxa"/>
+            <w:tcBorders>
+              <w:top w:val="single" w:sz="4" w:space="0" w:color="auto"/>
+              <w:left w:val="single" w:sz="4" w:space="0" w:color="auto"/>
+              <w:bottom w:val="dotted" w:sz="4" w:space="0" w:color="auto"/>
+              <w:right w:val="single" w:sz="4" w:space="0" w:color="auto"/>
+            </w:tcBorders>
+          </w:tcPr>
+          <w:p>
+            <w:pPr>
+              <w:pStyle w:val="Chutrongbang"/>
+            </w:pPr>
+            <w:r>
+              <w:t>{{ thd1max }}</w:t>
+            </w:r>
+          </w:p>
+        </w:tc>
+        <w:tc>
+          <w:tcPr>
+            <w:tcW w:w="988" w:type="dxa"/>
+            <w:tcBorders>
+              <w:top w:val="single" w:sz="4" w:space="0" w:color="auto"/>
+              <w:left w:val="nil"/>
+              <w:bottom w:val="dotted" w:sz="4" w:space="0" w:color="auto"/>
+              <w:right w:val="single" w:sz="4" w:space="0" w:color="auto"/>
+            </w:tcBorders>
+          </w:tcPr>
+          <w:p>
+            <w:pPr>
+              <w:pStyle w:val="Chutrongbang"/>
+            </w:pPr>
+            <w:r>
+              <w:t>{{ thd1min }}</w:t>
+            </w:r>
+          </w:p>
+        </w:tc>
+        <w:tc>
+          <w:tcPr>
+            <w:tcW w:w="1057" w:type="dxa"/>
+            <w:tcBorders>
+              <w:top w:val="single" w:sz="4" w:space="0" w:color="auto"/>
+              <w:left w:val="nil"/>
+              <w:bottom w:val="dotted" w:sz="4" w:space="0" w:color="auto"/>
+              <w:right w:val="single" w:sz="4" w:space="0" w:color="auto"/>
+            </w:tcBorders>
+          </w:tcPr>
+          <w:p>
+            <w:pPr>
+              <w:pStyle w:val="Chutrongbang"/>
+            </w:pPr>
+            <w:r>
+              <w:t>{{ thd1avg }}</w:t>
+            </w:r>
+          </w:p>
+        </w:tc>
+        <w:tc>
+          <w:tcPr>
+            <w:tcW w:w="2145" w:type="dxa"/>
+            <w:vMerge w:val="restart"/>
+            <w:vAlign w:val="center"/>
+          </w:tcPr>
+          <w:p>
+            <w:pPr>
+              <w:pStyle w:val="Chutrongbang"/>
+            </w:pPr>
+            <w:r>
+              <w:t>&lt; 8%</w:t>
+            </w:r>
+          </w:p>
+        </w:tc>
+        <w:tc>
+          <w:tcPr>
+            <w:tcW w:w="1123" w:type="dxa"/>
+            <w:vMerge w:val="restart"/>
+            <w:tcBorders>
+              <w:right w:val="double" w:sz="4" w:space="0" w:color="auto"/>
+            </w:tcBorders>
+            <w:vAlign w:val="center"/>
+          </w:tcPr>
+          <w:p>
+            <w:pPr>
+              <w:pStyle w:val="Chutrongbang"/>
+            </w:pPr>
+            <w:r>
+              <w:t>{{ thdeval }}</w:t>
+            </w:r>
+          </w:p>
+        </w:tc>
+      </w:tr>
+      <w:tr>
+        <w:trPr>
+          <w:trHeight w:val="340"/>
+          <w:jc w:val="center"/>
+        </w:trPr>
+        <w:tc>
+          <w:tcPr>
+            <w:tcW w:w="538" w:type="dxa"/>
+            <w:vMerge/>
+            <w:tcBorders>
+              <w:left w:val="double" w:sz="4" w:space="0" w:color="auto"/>
+            </w:tcBorders>
+            <w:vAlign w:val="center"/>
+          </w:tcPr>
+          <w:p>
+            <w:pPr>
+              <w:pStyle w:val="Chutrongbang"/>
+            </w:pPr>
+          </w:p>
+        </w:tc>
+        <w:tc>
+          <w:tcPr>
+            <w:tcW w:w="1574" w:type="dxa"/>
+            <w:vMerge/>
+            <w:vAlign w:val="center"/>
+          </w:tcPr>
+          <w:p>
+            <w:pPr>
+              <w:pStyle w:val="Chutrongbang"/>
+            </w:pPr>
+          </w:p>
+        </w:tc>
+        <w:tc>
+          <w:tcPr>
+            <w:tcW w:w="1279" w:type="dxa"/>
+            <w:tcBorders>
+              <w:top w:val="dotted" w:sz="4" w:space="0" w:color="auto"/>
+              <w:bottom w:val="dotted" w:sz="4" w:space="0" w:color="auto"/>
+            </w:tcBorders>
+            <w:vAlign w:val="center"/>
+          </w:tcPr>
+          <w:p>
+            <w:pPr>
+              <w:pStyle w:val="Chutrongbang"/>
+            </w:pPr>
+            <w:r>
+              <w:t>THD</w:t>
+            </w:r>
+            <w:r>
+              <w:rPr>
+                <w:vertAlign w:val="subscript"/>
+              </w:rPr>
+              <w:t>2</w:t>
+            </w:r>
+            <w:r>
+              <w:t xml:space="preserve"> (%)</w:t>
+            </w:r>
+          </w:p>
+        </w:tc>
+        <w:tc>
+          <w:tcPr>
+            <w:tcW w:w="941" w:type="dxa"/>
+            <w:tcBorders>
+              <w:top w:val="dotted" w:sz="4" w:space="0" w:color="auto"/>
+              <w:left w:val="single" w:sz="4" w:space="0" w:color="auto"/>
+              <w:bottom w:val="dotted" w:sz="4" w:space="0" w:color="auto"/>
+              <w:right w:val="single" w:sz="4" w:space="0" w:color="auto"/>
+            </w:tcBorders>
+          </w:tcPr>
+          <w:p>
+            <w:pPr>
+              <w:pStyle w:val="Chutrongbang"/>
+            </w:pPr>
+            <w:r>
+              <w:t>{{ thd2max }}</w:t>
+            </w:r>
+          </w:p>
+        </w:tc>
+        <w:tc>
+          <w:tcPr>
+            <w:tcW w:w="988" w:type="dxa"/>
+            <w:tcBorders>
+              <w:top w:val="dotted" w:sz="4" w:space="0" w:color="auto"/>
+              <w:left w:val="nil"/>
+              <w:bottom w:val="dotted" w:sz="4" w:space="0" w:color="auto"/>
+              <w:right w:val="single" w:sz="4" w:space="0" w:color="auto"/>
+            </w:tcBorders>
+          </w:tcPr>
+          <w:p>
+            <w:pPr>
+              <w:pStyle w:val="Chutrongbang"/>
+            </w:pPr>
+            <w:r>
+              <w:t>{{ thd2min }}</w:t>
+            </w:r>
+          </w:p>
+        </w:tc>
+        <w:tc>
+          <w:tcPr>
+            <w:tcW w:w="1057" w:type="dxa"/>
+            <w:tcBorders>
+              <w:top w:val="dotted" w:sz="4" w:space="0" w:color="auto"/>
+              <w:left w:val="nil"/>
+              <w:bottom w:val="dotted" w:sz="4" w:space="0" w:color="auto"/>
+              <w:right w:val="single" w:sz="4" w:space="0" w:color="auto"/>
+            </w:tcBorders>
+          </w:tcPr>
+          <w:p>
+            <w:pPr>
+              <w:pStyle w:val="Chutrongbang"/>
+            </w:pPr>
+            <w:r>
+              <w:t>{{ thd2avg }}</w:t>
+            </w:r>
+          </w:p>
+        </w:tc>
+        <w:tc>
+          <w:tcPr>
+            <w:tcW w:w="2145" w:type="dxa"/>
+            <w:vMerge/>
+            <w:vAlign w:val="center"/>
+          </w:tcPr>
+          <w:p>
+            <w:pPr>
+              <w:pStyle w:val="Chutrongbang"/>
+            </w:pPr>
+          </w:p>
+        </w:tc>
+        <w:tc>
+          <w:tcPr>
+            <w:tcW w:w="1123" w:type="dxa"/>
+            <w:vMerge/>
+            <w:tcBorders>
+              <w:right w:val="double" w:sz="4" w:space="0" w:color="auto"/>
+            </w:tcBorders>
+            <w:vAlign w:val="center"/>
+          </w:tcPr>
+          <w:p>
+            <w:pPr>
+              <w:pStyle w:val="Chutrongbang"/>
+            </w:pPr>
+          </w:p>
+        </w:tc>
+      </w:tr>
+      <w:tr>
+        <w:trPr>
+          <w:trHeight w:val="340"/>
+          <w:jc w:val="center"/>
+        </w:trPr>
+        <w:tc>
+          <w:tcPr>
+            <w:tcW w:w="538" w:type="dxa"/>
+            <w:vMerge/>
+            <w:tcBorders>
+              <w:left w:val="double" w:sz="4" w:space="0" w:color="auto"/>
+            </w:tcBorders>
+            <w:vAlign w:val="center"/>
+          </w:tcPr>
+          <w:p>
+            <w:pPr>
+              <w:pStyle w:val="Chutrongbang"/>
+            </w:pPr>
+          </w:p>
+        </w:tc>
+        <w:tc>
+          <w:tcPr>
+            <w:tcW w:w="1574" w:type="dxa"/>
+            <w:vMerge/>
+            <w:vAlign w:val="center"/>
+          </w:tcPr>
+          <w:p>
+            <w:pPr>
+              <w:pStyle w:val="Chutrongbang"/>
+            </w:pPr>
+          </w:p>
+        </w:tc>
+        <w:tc>
+          <w:tcPr>
+            <w:tcW w:w="1279" w:type="dxa"/>
+            <w:tcBorders>
+              <w:top w:val="dotted" w:sz="4" w:space="0" w:color="auto"/>
+              <w:bottom w:val="single" w:sz="4" w:space="0" w:color="auto"/>
+            </w:tcBorders>
+            <w:vAlign w:val="center"/>
+          </w:tcPr>
+          <w:p>
+            <w:pPr>
+              <w:pStyle w:val="Chutrongbang"/>
+            </w:pPr>
+            <w:r>
+              <w:t>THD</w:t>
+            </w:r>
+            <w:r>
+              <w:rPr>
+                <w:vertAlign w:val="subscript"/>
+              </w:rPr>
+              <w:t>3</w:t>
+            </w:r>
+            <w:r>
+              <w:t xml:space="preserve"> (%)</w:t>
+            </w:r>
+          </w:p>
+        </w:tc>
+        <w:tc>
+          <w:tcPr>
+            <w:tcW w:w="941" w:type="dxa"/>
+            <w:tcBorders>
+              <w:top w:val="dotted" w:sz="4" w:space="0" w:color="auto"/>
+              <w:left w:val="single" w:sz="4" w:space="0" w:color="auto"/>
+              <w:bottom w:val="single" w:sz="4" w:space="0" w:color="auto"/>
+              <w:right w:val="single" w:sz="4" w:space="0" w:color="auto"/>
+            </w:tcBorders>
+          </w:tcPr>
+          <w:p>
+            <w:pPr>
+              <w:pStyle w:val="Chutrongbang"/>
+            </w:pPr>
+            <w:r>
+              <w:t>{{ thd3max }}</w:t>
+            </w:r>
+          </w:p>
+        </w:tc>
+        <w:tc>
+          <w:tcPr>
+            <w:tcW w:w="988" w:type="dxa"/>
+            <w:tcBorders>
+              <w:top w:val="dotted" w:sz="4" w:space="0" w:color="auto"/>
+              <w:left w:val="nil"/>
+              <w:bottom w:val="single" w:sz="4" w:space="0" w:color="auto"/>
+              <w:right w:val="single" w:sz="4" w:space="0" w:color="auto"/>
+            </w:tcBorders>
+          </w:tcPr>
+          <w:p>
+            <w:pPr>
+              <w:pStyle w:val="Chutrongbang"/>
+            </w:pPr>
+            <w:r>
+              <w:t>{{ thd3min }}</w:t>
+            </w:r>
+          </w:p>
+        </w:tc>
+        <w:tc>
+          <w:tcPr>
+            <w:tcW w:w="1057" w:type="dxa"/>
+            <w:tcBorders>
+              <w:top w:val="dotted" w:sz="4" w:space="0" w:color="auto"/>
+              <w:left w:val="nil"/>
+              <w:bottom w:val="single" w:sz="4" w:space="0" w:color="auto"/>
+              <w:right w:val="single" w:sz="4" w:space="0" w:color="auto"/>
+            </w:tcBorders>
+          </w:tcPr>
+          <w:p>
+            <w:pPr>
+              <w:pStyle w:val="Chutrongbang"/>
+            </w:pPr>
+            <w:r>
+              <w:t>{{ thd3avg }}</w:t>
+            </w:r>
+          </w:p>
+        </w:tc>
+        <w:tc>
+          <w:tcPr>
+            <w:tcW w:w="2145" w:type="dxa"/>
+            <w:vMerge/>
+            <w:vAlign w:val="center"/>
+          </w:tcPr>
+          <w:p>
+            <w:pPr>
+              <w:pStyle w:val="Chutrongbang"/>
+            </w:pPr>
+          </w:p>
+        </w:tc>
+        <w:tc>
+          <w:tcPr>
+            <w:tcW w:w="1123" w:type="dxa"/>
+            <w:vMerge/>
+            <w:tcBorders>
+              <w:right w:val="double" w:sz="4" w:space="0" w:color="auto"/>
+            </w:tcBorders>
+            <w:vAlign w:val="center"/>
+          </w:tcPr>
+          <w:p>
+            <w:pPr>
+              <w:pStyle w:val="Chutrongbang"/>
+            </w:pPr>
+          </w:p>
+        </w:tc>
+      </w:tr>
+      <w:tr>
+        <w:trPr>
+          <w:trHeight w:val="340"/>
+          <w:jc w:val="center"/>
+        </w:trPr>
+        <w:tc>
+          <w:tcPr>
+            <w:tcW w:w="538" w:type="dxa"/>
+            <w:vMerge w:val="restart"/>
+            <w:tcBorders>
+              <w:left w:val="double" w:sz="4" w:space="0" w:color="auto"/>
+            </w:tcBorders>
+            <w:vAlign w:val="center"/>
+          </w:tcPr>
+          <w:p>
+            <w:pPr>
+              <w:pStyle w:val="Chutrongbang"/>
+            </w:pPr>
+            <w:r>
+              <w:lastRenderedPageBreak/>
+              <w:t>7</w:t>
+            </w:r>
+          </w:p>
+        </w:tc>
+        <w:tc>
+          <w:tcPr>
+            <w:tcW w:w="1574" w:type="dxa"/>
+            <w:vMerge w:val="restart"/>
+            <w:vAlign w:val="center"/>
+          </w:tcPr>
+          <w:p>
+            <w:pPr>
+              <w:pStyle w:val="Chutrongbang"/>
+            </w:pPr>
+            <w:r>
+              <w:t>Tổng biến dạng sóng hài dòng điện</w:t>
+            </w:r>
+          </w:p>
+        </w:tc>
+        <w:tc>
+          <w:tcPr>
+            <w:tcW w:w="1279" w:type="dxa"/>
+            <w:tcBorders>
+              <w:bottom w:val="dotted" w:sz="4" w:space="0" w:color="auto"/>
+            </w:tcBorders>
+            <w:vAlign w:val="center"/>
+          </w:tcPr>
+          <w:p>
+            <w:pPr>
+              <w:pStyle w:val="Chutrongbang"/>
+            </w:pPr>
+            <w:r>
+              <w:t>TDD</w:t>
+            </w:r>
+            <w:r>
+              <w:rPr>
+                <w:vertAlign w:val="subscript"/>
+              </w:rPr>
+              <w:t>1</w:t>
+            </w:r>
+            <w:r>
+              <w:t xml:space="preserve"> (%)</w:t>
+            </w:r>
+          </w:p>
+        </w:tc>
+        <w:tc>
+          <w:tcPr>
+            <w:tcW w:w="941" w:type="dxa"/>
+            <w:tcBorders>
+              <w:top w:val="single" w:sz="4" w:space="0" w:color="auto"/>
+              <w:left w:val="single" w:sz="4" w:space="0" w:color="auto"/>
+              <w:bottom w:val="dotted" w:sz="4" w:space="0" w:color="auto"/>
+              <w:right w:val="single" w:sz="4" w:space="0" w:color="auto"/>
+            </w:tcBorders>
+          </w:tcPr>
+          <w:p>
+            <w:pPr>
+              <w:pStyle w:val="Chutrongbang"/>
+            </w:pPr>
+            <w:r>
+              <w:t>{{ tdd1max }}</w:t>
+            </w:r>
+          </w:p>
+        </w:tc>
+        <w:tc>
+          <w:tcPr>
+            <w:tcW w:w="988" w:type="dxa"/>
+            <w:tcBorders>
+              <w:top w:val="single" w:sz="4" w:space="0" w:color="auto"/>
+              <w:left w:val="nil"/>
+              <w:bottom w:val="dotted" w:sz="4" w:space="0" w:color="auto"/>
+              <w:right w:val="single" w:sz="4" w:space="0" w:color="auto"/>
+            </w:tcBorders>
+          </w:tcPr>
+          <w:p>
+            <w:pPr>
+              <w:pStyle w:val="Chutrongbang"/>
+            </w:pPr>
+            <w:r>
+              <w:t>{{ tdd1min }}</w:t>
+            </w:r>
+          </w:p>
+        </w:tc>
+        <w:tc>
+          <w:tcPr>
+            <w:tcW w:w="1057" w:type="dxa"/>
+            <w:tcBorders>
+              <w:top w:val="single" w:sz="4" w:space="0" w:color="auto"/>
+              <w:left w:val="nil"/>
+              <w:bottom w:val="dotted" w:sz="4" w:space="0" w:color="auto"/>
+              <w:right w:val="single" w:sz="4" w:space="0" w:color="auto"/>
+            </w:tcBorders>
+          </w:tcPr>
+          <w:p>
+            <w:pPr>
+              <w:pStyle w:val="Chutrongbang"/>
+            </w:pPr>
+            <w:r>
+              <w:t>{{ tdd1avg }}</w:t>
+            </w:r>
+          </w:p>
+        </w:tc>
+        <w:tc>
+          <w:tcPr>
+            <w:tcW w:w="2145" w:type="dxa"/>
+            <w:vMerge w:val="restart"/>
+            <w:vAlign w:val="center"/>
+          </w:tcPr>
+          <w:p>
+            <w:pPr>
+              <w:pStyle w:val="Chutrongbang"/>
+            </w:pPr>
+            <w:r>
+              <w:t>&lt;12%</w:t>
+            </w:r>
+          </w:p>
+        </w:tc>
+        <w:tc>
+          <w:tcPr>
+            <w:tcW w:w="1123" w:type="dxa"/>
+            <w:vMerge w:val="restart"/>
+            <w:tcBorders>
+              <w:right w:val="double" w:sz="4" w:space="0" w:color="auto"/>
+            </w:tcBorders>
+            <w:vAlign w:val="center"/>
+          </w:tcPr>
+          <w:p>
+            <w:pPr>
+              <w:pStyle w:val="Chutrongbang"/>
+            </w:pPr>
+            <w:r>
+              <w:t>{{ t</w:t>
+            </w:r>
+            <w:r>
+              <w:rPr>
+                <w:lang w:val="en-US"/>
+              </w:rPr>
+              <w:t>d</w:t>
+            </w:r>
+            <w:r>
+              <w:t>deval }}</w:t>
+            </w:r>
+          </w:p>
+        </w:tc>
+      </w:tr>
+      <w:tr>
+        <w:trPr>
+          <w:trHeight w:val="340"/>
+          <w:jc w:val="center"/>
+        </w:trPr>
+        <w:tc>
+          <w:tcPr>
+            <w:tcW w:w="538" w:type="dxa"/>
+            <w:vMerge/>
+            <w:tcBorders>
+              <w:left w:val="double" w:sz="4" w:space="0" w:color="auto"/>
+            </w:tcBorders>
+            <w:vAlign w:val="center"/>
+          </w:tcPr>
+          <w:p>
+            <w:pPr>
+              <w:pStyle w:val="Chutrongbang"/>
+            </w:pPr>
+          </w:p>
+        </w:tc>
+        <w:tc>
+          <w:tcPr>
+            <w:tcW w:w="1574" w:type="dxa"/>
+            <w:vMerge/>
+            <w:vAlign w:val="center"/>
+          </w:tcPr>
+          <w:p>
+            <w:pPr>
+              <w:pStyle w:val="Chutrongbang"/>
+            </w:pPr>
+          </w:p>
+        </w:tc>
+        <w:tc>
+          <w:tcPr>
+            <w:tcW w:w="1279" w:type="dxa"/>
+            <w:tcBorders>
+              <w:top w:val="dotted" w:sz="4" w:space="0" w:color="auto"/>
+              <w:bottom w:val="dotted" w:sz="4" w:space="0" w:color="auto"/>
+            </w:tcBorders>
+            <w:vAlign w:val="center"/>
+          </w:tcPr>
+          <w:p>
+            <w:pPr>
+              <w:pStyle w:val="Chutrongbang"/>
+            </w:pPr>
+            <w:r>
+              <w:t>TDD</w:t>
+            </w:r>
+            <w:r>
+              <w:rPr>
+                <w:vertAlign w:val="subscript"/>
+              </w:rPr>
+              <w:t>2</w:t>
+            </w:r>
+            <w:r>
+              <w:t xml:space="preserve"> (%)</w:t>
+            </w:r>
+          </w:p>
+        </w:tc>
+        <w:tc>
+          <w:tcPr>
+            <w:tcW w:w="941" w:type="dxa"/>
+            <w:tcBorders>
+              <w:top w:val="dotted" w:sz="4" w:space="0" w:color="auto"/>
+              <w:left w:val="single" w:sz="4" w:space="0" w:color="auto"/>
+              <w:bottom w:val="dotted" w:sz="4" w:space="0" w:color="auto"/>
+              <w:right w:val="single" w:sz="4" w:space="0" w:color="auto"/>
+            </w:tcBorders>
+          </w:tcPr>
+          <w:p>
+            <w:pPr>
+              <w:pStyle w:val="Chutrongbang"/>
+            </w:pPr>
+            <w:r>
+              <w:t>{{ tdd2max }}</w:t>
+            </w:r>
+          </w:p>
+        </w:tc>
+        <w:tc>
+          <w:tcPr>
+            <w:tcW w:w="988" w:type="dxa"/>
+            <w:tcBorders>
+              <w:top w:val="dotted" w:sz="4" w:space="0" w:color="auto"/>
+              <w:left w:val="nil"/>
+              <w:bottom w:val="dotted" w:sz="4" w:space="0" w:color="auto"/>
+              <w:right w:val="single" w:sz="4" w:space="0" w:color="auto"/>
+            </w:tcBorders>
+          </w:tcPr>
+          <w:p>
+            <w:pPr>
+              <w:pStyle w:val="Chutrongbang"/>
+            </w:pPr>
+            <w:r>
+              <w:t>{{ tdd2min }}</w:t>
+            </w:r>
+          </w:p>
+        </w:tc>
+        <w:tc>
+          <w:tcPr>
+            <w:tcW w:w="1057" w:type="dxa"/>
+            <w:tcBorders>
+              <w:top w:val="dotted" w:sz="4" w:space="0" w:color="auto"/>
+              <w:left w:val="nil"/>
+              <w:bottom w:val="dotted" w:sz="4" w:space="0" w:color="auto"/>
+              <w:right w:val="single" w:sz="4" w:space="0" w:color="auto"/>
+            </w:tcBorders>
+          </w:tcPr>
+          <w:p>
+            <w:pPr>
+              <w:pStyle w:val="Chutrongbang"/>
+            </w:pPr>
+            <w:r>
+              <w:t>{{ tdd2avg }}</w:t>
+            </w:r>
+          </w:p>
+        </w:tc>
+        <w:tc>
+          <w:tcPr>
+            <w:tcW w:w="2145" w:type="dxa"/>
+            <w:vMerge/>
+            <w:vAlign w:val="center"/>
+          </w:tcPr>
+          <w:p>
+            <w:pPr>
+              <w:pStyle w:val="Chutrongbang"/>
+            </w:pPr>
+          </w:p>
+        </w:tc>
+        <w:tc>
+          <w:tcPr>
+            <w:tcW w:w="1123" w:type="dxa"/>
+            <w:vMerge/>
+            <w:tcBorders>
+              <w:right w:val="double" w:sz="4" w:space="0" w:color="auto"/>
+            </w:tcBorders>
+            <w:vAlign w:val="center"/>
+          </w:tcPr>
+          <w:p>
+            <w:pPr>
+              <w:pStyle w:val="Chutrongbang"/>
+            </w:pPr>
+          </w:p>
+        </w:tc>
+      </w:tr>
+      <w:tr>
+        <w:trPr>
+          <w:trHeight w:val="340"/>
+          <w:jc w:val="center"/>
+        </w:trPr>
+        <w:tc>
+          <w:tcPr>
+            <w:tcW w:w="538" w:type="dxa"/>
+            <w:vMerge/>
+            <w:tcBorders>
+              <w:left w:val="double" w:sz="4" w:space="0" w:color="auto"/>
+              <w:bottom w:val="double" w:sz="4" w:space="0" w:color="auto"/>
+            </w:tcBorders>
+            <w:vAlign w:val="center"/>
+          </w:tcPr>
+          <w:p>
+            <w:pPr>
+              <w:pStyle w:val="Chutrongbang"/>
+            </w:pPr>
+          </w:p>
+        </w:tc>
+        <w:tc>
+          <w:tcPr>
+            <w:tcW w:w="1574" w:type="dxa"/>
+            <w:vMerge/>
+            <w:tcBorders>
+              <w:bottom w:val="double" w:sz="4" w:space="0" w:color="auto"/>
+            </w:tcBorders>
+            <w:vAlign w:val="center"/>
+          </w:tcPr>
+          <w:p>
+            <w:pPr>
+              <w:pStyle w:val="Chutrongbang"/>
+            </w:pPr>
+          </w:p>
+        </w:tc>
+        <w:tc>
+          <w:tcPr>
+            <w:tcW w:w="1279" w:type="dxa"/>
+            <w:tcBorders>
+              <w:top w:val="dotted" w:sz="4" w:space="0" w:color="auto"/>
+              <w:bottom w:val="double" w:sz="4" w:space="0" w:color="auto"/>
+            </w:tcBorders>
+            <w:vAlign w:val="center"/>
+          </w:tcPr>
+          <w:p>
+            <w:pPr>
+              <w:pStyle w:val="Chutrongbang"/>
+            </w:pPr>
+            <w:r>
+              <w:t>TDD</w:t>
+            </w:r>
+            <w:r>
+              <w:rPr>
+                <w:vertAlign w:val="subscript"/>
+              </w:rPr>
+              <w:t>3</w:t>
+            </w:r>
+            <w:r>
+              <w:t xml:space="preserve"> (%)</w:t>
+            </w:r>
+          </w:p>
+        </w:tc>
+        <w:tc>
+          <w:tcPr>
+            <w:tcW w:w="941" w:type="dxa"/>
+            <w:tcBorders>
+              <w:top w:val="dotted" w:sz="4" w:space="0" w:color="auto"/>
+              <w:left w:val="single" w:sz="4" w:space="0" w:color="auto"/>
+              <w:bottom w:val="double" w:sz="4" w:space="0" w:color="auto"/>
+              <w:right w:val="single" w:sz="4" w:space="0" w:color="auto"/>
+            </w:tcBorders>
+          </w:tcPr>
+          <w:p>
+            <w:pPr>
+              <w:pStyle w:val="Chutrongbang"/>
+            </w:pPr>
+            <w:r>
+              <w:t>{{ tdd3max }}</w:t>
+            </w:r>
+          </w:p>
+        </w:tc>
+        <w:tc>
+          <w:tcPr>
+            <w:tcW w:w="988" w:type="dxa"/>
+            <w:tcBorders>
+              <w:top w:val="dotted" w:sz="4" w:space="0" w:color="auto"/>
+              <w:left w:val="nil"/>
+              <w:bottom w:val="double" w:sz="4" w:space="0" w:color="auto"/>
+              <w:right w:val="single" w:sz="4" w:space="0" w:color="auto"/>
+            </w:tcBorders>
+          </w:tcPr>
+          <w:p>
+            <w:pPr>
+              <w:pStyle w:val="Chutrongbang"/>
+            </w:pPr>
+            <w:r>
+              <w:t>{{ tdd3min }}</w:t>
+            </w:r>
+          </w:p>
+        </w:tc>
+        <w:tc>
+          <w:tcPr>
+            <w:tcW w:w="1057" w:type="dxa"/>
+            <w:tcBorders>
+              <w:top w:val="dotted" w:sz="4" w:space="0" w:color="auto"/>
+              <w:left w:val="nil"/>
+              <w:bottom w:val="double" w:sz="4" w:space="0" w:color="auto"/>
+              <w:right w:val="single" w:sz="4" w:space="0" w:color="auto"/>
+            </w:tcBorders>
+          </w:tcPr>
+          <w:p>
+            <w:pPr>
+              <w:pStyle w:val="Chutrongbang"/>
+            </w:pPr>
+            <w:r>
+              <w:t>{{ tdd3avg }}</w:t>
+            </w:r>
+          </w:p>
+        </w:tc>
+        <w:tc>
+          <w:tcPr>
+            <w:tcW w:w="2145" w:type="dxa"/>
+            <w:vMerge/>
+            <w:tcBorders>
+              <w:bottom w:val="double" w:sz="4" w:space="0" w:color="auto"/>
+            </w:tcBorders>
+            <w:vAlign w:val="center"/>
+          </w:tcPr>
+          <w:p>
+            <w:pPr>
+              <w:pStyle w:val="Chutrongbang"/>
+            </w:pPr>
+          </w:p>
+        </w:tc>
+        <w:tc>
+          <w:tcPr>
+            <w:tcW w:w="1123" w:type="dxa"/>
+            <w:vMerge/>
+            <w:tcBorders>
+              <w:bottom w:val="double" w:sz="4" w:space="0" w:color="auto"/>
+              <w:right w:val="double" w:sz="4" w:space="0" w:color="auto"/>
+            </w:tcBorders>
+            <w:vAlign w:val="center"/>
+          </w:tcPr>
+          <w:p>
+            <w:pPr>
+              <w:pStyle w:val="Chutrongbang"/>
+            </w:pPr>
+          </w:p>
+        </w:tc>
+      </w:tr>
+    </w:tbl>
+    <w:p>
+      <w:pPr>
+        <w:spacing w:after="160" w:line="259" w:lineRule="auto"/>
+      </w:pPr>
+    </w:p>
+    <w:p>
+      <w:pPr>
+        <w:spacing w:after="160" w:line="259" w:lineRule="auto"/>
+        <w:rPr>
+          <w:lang w:val="en-US"/>
+        </w:rPr>
+      </w:pPr>
     </w:p>
     <w:sectPr>
       <w:pgSz w:w="11906" w:h="16838" w:code="9"/>

</xml_diff>